<commit_message>
feat: actualizar y baja por llaves sin ID, y politica de contrasena
</commit_message>
<xml_diff>
--- a/docs/Documento_Tecnico_Onboarding.docx
+++ b/docs/Documento_Tecnico_Onboarding.docx
@@ -183,7 +183,7 @@
     <w:sdt>
       <w:sdtPr>
         <w:alias w:val="Contenido"/>
-        <w:id w:val="1024827018"/>
+        <w:id w:val="921066900"/>
       </w:sdtPr>
       <w:sdtEndPr/>
       <w:sdtContent>
@@ -211,7 +211,7 @@
           <w:r>
             <w:fldChar w:fldCharType="separate"/>
           </w:r>
-          <w:hyperlink w:anchor="_Toc242464664" w:history="1">
+          <w:hyperlink w:anchor="_Toc242466528" w:history="1">
             <w:r>
               <w:rPr>
                 <w:rStyle w:val="Hyperlink"/>
@@ -235,7 +235,7 @@
               <w:rPr>
                 <w:noProof/>
               </w:rPr>
-              <w:instrText xml:space="preserve"> PAGEREF _Toc242464664 \h </w:instrText>
+              <w:instrText xml:space="preserve"> PAGEREF _Toc242466528 \h </w:instrText>
             </w:r>
             <w:r>
               <w:rPr>
@@ -277,7 +277,7 @@
               <w14:ligatures w14:val="standardContextual"/>
             </w:rPr>
           </w:pPr>
-          <w:hyperlink w:anchor="_Toc242464665" w:history="1">
+          <w:hyperlink w:anchor="_Toc242466529" w:history="1">
             <w:r>
               <w:rPr>
                 <w:rStyle w:val="Hyperlink"/>
@@ -301,7 +301,7 @@
               <w:rPr>
                 <w:noProof/>
               </w:rPr>
-              <w:instrText xml:space="preserve"> PAGEREF _Toc242464665 \h </w:instrText>
+              <w:instrText xml:space="preserve"> PAGEREF _Toc242466529 \h </w:instrText>
             </w:r>
             <w:r>
               <w:rPr>
@@ -343,7 +343,7 @@
               <w14:ligatures w14:val="standardContextual"/>
             </w:rPr>
           </w:pPr>
-          <w:hyperlink w:anchor="_Toc242464666" w:history="1">
+          <w:hyperlink w:anchor="_Toc242466530" w:history="1">
             <w:r>
               <w:rPr>
                 <w:rStyle w:val="Hyperlink"/>
@@ -367,7 +367,7 @@
               <w:rPr>
                 <w:noProof/>
               </w:rPr>
-              <w:instrText xml:space="preserve"> PAGEREF _Toc242464666 \h </w:instrText>
+              <w:instrText xml:space="preserve"> PAGEREF _Toc242466530 \h </w:instrText>
             </w:r>
             <w:r>
               <w:rPr>
@@ -409,7 +409,7 @@
               <w14:ligatures w14:val="standardContextual"/>
             </w:rPr>
           </w:pPr>
-          <w:hyperlink w:anchor="_Toc242464667" w:history="1">
+          <w:hyperlink w:anchor="_Toc242466531" w:history="1">
             <w:r>
               <w:rPr>
                 <w:rStyle w:val="Hyperlink"/>
@@ -433,7 +433,7 @@
               <w:rPr>
                 <w:noProof/>
               </w:rPr>
-              <w:instrText xml:space="preserve"> PAGEREF _Toc242464667 \h </w:instrText>
+              <w:instrText xml:space="preserve"> PAGEREF _Toc242466531 \h </w:instrText>
             </w:r>
             <w:r>
               <w:rPr>
@@ -475,7 +475,7 @@
               <w14:ligatures w14:val="standardContextual"/>
             </w:rPr>
           </w:pPr>
-          <w:hyperlink w:anchor="_Toc242464668" w:history="1">
+          <w:hyperlink w:anchor="_Toc242466532" w:history="1">
             <w:r>
               <w:rPr>
                 <w:rStyle w:val="Hyperlink"/>
@@ -499,7 +499,7 @@
               <w:rPr>
                 <w:noProof/>
               </w:rPr>
-              <w:instrText xml:space="preserve"> PAGEREF _Toc242464668 \h </w:instrText>
+              <w:instrText xml:space="preserve"> PAGEREF _Toc242466532 \h </w:instrText>
             </w:r>
             <w:r>
               <w:rPr>
@@ -541,7 +541,7 @@
               <w14:ligatures w14:val="standardContextual"/>
             </w:rPr>
           </w:pPr>
-          <w:hyperlink w:anchor="_Toc242464669" w:history="1">
+          <w:hyperlink w:anchor="_Toc242466533" w:history="1">
             <w:r>
               <w:rPr>
                 <w:rStyle w:val="Hyperlink"/>
@@ -565,7 +565,7 @@
               <w:rPr>
                 <w:noProof/>
               </w:rPr>
-              <w:instrText xml:space="preserve"> PAGEREF _Toc242464669 \h </w:instrText>
+              <w:instrText xml:space="preserve"> PAGEREF _Toc242466533 \h </w:instrText>
             </w:r>
             <w:r>
               <w:rPr>
@@ -607,7 +607,7 @@
               <w14:ligatures w14:val="standardContextual"/>
             </w:rPr>
           </w:pPr>
-          <w:hyperlink w:anchor="_Toc242464670" w:history="1">
+          <w:hyperlink w:anchor="_Toc242466534" w:history="1">
             <w:r>
               <w:rPr>
                 <w:rStyle w:val="Hyperlink"/>
@@ -631,7 +631,7 @@
               <w:rPr>
                 <w:noProof/>
               </w:rPr>
-              <w:instrText xml:space="preserve"> PAGEREF _Toc242464670 \h </w:instrText>
+              <w:instrText xml:space="preserve"> PAGEREF _Toc242466534 \h </w:instrText>
             </w:r>
             <w:r>
               <w:rPr>
@@ -673,7 +673,7 @@
               <w14:ligatures w14:val="standardContextual"/>
             </w:rPr>
           </w:pPr>
-          <w:hyperlink w:anchor="_Toc242464671" w:history="1">
+          <w:hyperlink w:anchor="_Toc242466535" w:history="1">
             <w:r>
               <w:rPr>
                 <w:rStyle w:val="Hyperlink"/>
@@ -697,7 +697,7 @@
               <w:rPr>
                 <w:noProof/>
               </w:rPr>
-              <w:instrText xml:space="preserve"> PAGEREF _Toc242464671 \h </w:instrText>
+              <w:instrText xml:space="preserve"> PAGEREF _Toc242466535 \h </w:instrText>
             </w:r>
             <w:r>
               <w:rPr>
@@ -739,7 +739,7 @@
               <w14:ligatures w14:val="standardContextual"/>
             </w:rPr>
           </w:pPr>
-          <w:hyperlink w:anchor="_Toc242464672" w:history="1">
+          <w:hyperlink w:anchor="_Toc242466536" w:history="1">
             <w:r>
               <w:rPr>
                 <w:rStyle w:val="Hyperlink"/>
@@ -763,7 +763,7 @@
               <w:rPr>
                 <w:noProof/>
               </w:rPr>
-              <w:instrText xml:space="preserve"> PAGEREF _Toc242464672 \h </w:instrText>
+              <w:instrText xml:space="preserve"> PAGEREF _Toc242466536 \h </w:instrText>
             </w:r>
             <w:r>
               <w:rPr>
@@ -805,7 +805,7 @@
               <w14:ligatures w14:val="standardContextual"/>
             </w:rPr>
           </w:pPr>
-          <w:hyperlink w:anchor="_Toc242464673" w:history="1">
+          <w:hyperlink w:anchor="_Toc242466537" w:history="1">
             <w:r>
               <w:rPr>
                 <w:rStyle w:val="Hyperlink"/>
@@ -829,7 +829,7 @@
               <w:rPr>
                 <w:noProof/>
               </w:rPr>
-              <w:instrText xml:space="preserve"> PAGEREF _Toc242464673 \h </w:instrText>
+              <w:instrText xml:space="preserve"> PAGEREF _Toc242466537 \h </w:instrText>
             </w:r>
             <w:r>
               <w:rPr>
@@ -871,7 +871,7 @@
               <w14:ligatures w14:val="standardContextual"/>
             </w:rPr>
           </w:pPr>
-          <w:hyperlink w:anchor="_Toc242464674" w:history="1">
+          <w:hyperlink w:anchor="_Toc242466538" w:history="1">
             <w:r>
               <w:rPr>
                 <w:rStyle w:val="Hyperlink"/>
@@ -895,7 +895,7 @@
               <w:rPr>
                 <w:noProof/>
               </w:rPr>
-              <w:instrText xml:space="preserve"> PAGEREF _Toc242464674 \h </w:instrText>
+              <w:instrText xml:space="preserve"> PAGEREF _Toc242466538 \h </w:instrText>
             </w:r>
             <w:r>
               <w:rPr>
@@ -937,7 +937,7 @@
               <w14:ligatures w14:val="standardContextual"/>
             </w:rPr>
           </w:pPr>
-          <w:hyperlink w:anchor="_Toc242464675" w:history="1">
+          <w:hyperlink w:anchor="_Toc242466539" w:history="1">
             <w:r>
               <w:rPr>
                 <w:rStyle w:val="Hyperlink"/>
@@ -961,7 +961,7 @@
               <w:rPr>
                 <w:noProof/>
               </w:rPr>
-              <w:instrText xml:space="preserve"> PAGEREF _Toc242464675 \h </w:instrText>
+              <w:instrText xml:space="preserve"> PAGEREF _Toc242466539 \h </w:instrText>
             </w:r>
             <w:r>
               <w:rPr>
@@ -1003,7 +1003,7 @@
               <w14:ligatures w14:val="standardContextual"/>
             </w:rPr>
           </w:pPr>
-          <w:hyperlink w:anchor="_Toc242464676" w:history="1">
+          <w:hyperlink w:anchor="_Toc242466540" w:history="1">
             <w:r>
               <w:rPr>
                 <w:rStyle w:val="Hyperlink"/>
@@ -1027,7 +1027,7 @@
               <w:rPr>
                 <w:noProof/>
               </w:rPr>
-              <w:instrText xml:space="preserve"> PAGEREF _Toc242464676 \h </w:instrText>
+              <w:instrText xml:space="preserve"> PAGEREF _Toc242466540 \h </w:instrText>
             </w:r>
             <w:r>
               <w:rPr>
@@ -1069,7 +1069,7 @@
               <w14:ligatures w14:val="standardContextual"/>
             </w:rPr>
           </w:pPr>
-          <w:hyperlink w:anchor="_Toc242464677" w:history="1">
+          <w:hyperlink w:anchor="_Toc242466541" w:history="1">
             <w:r>
               <w:rPr>
                 <w:rStyle w:val="Hyperlink"/>
@@ -1093,7 +1093,7 @@
               <w:rPr>
                 <w:noProof/>
               </w:rPr>
-              <w:instrText xml:space="preserve"> PAGEREF _Toc242464677 \h </w:instrText>
+              <w:instrText xml:space="preserve"> PAGEREF _Toc242466541 \h </w:instrText>
             </w:r>
             <w:r>
               <w:rPr>
@@ -1135,7 +1135,7 @@
               <w14:ligatures w14:val="standardContextual"/>
             </w:rPr>
           </w:pPr>
-          <w:hyperlink w:anchor="_Toc242464678" w:history="1">
+          <w:hyperlink w:anchor="_Toc242466542" w:history="1">
             <w:r>
               <w:rPr>
                 <w:rStyle w:val="Hyperlink"/>
@@ -1159,7 +1159,7 @@
               <w:rPr>
                 <w:noProof/>
               </w:rPr>
-              <w:instrText xml:space="preserve"> PAGEREF _Toc242464678 \h </w:instrText>
+              <w:instrText xml:space="preserve"> PAGEREF _Toc242466542 \h </w:instrText>
             </w:r>
             <w:r>
               <w:rPr>
@@ -1201,7 +1201,7 @@
               <w14:ligatures w14:val="standardContextual"/>
             </w:rPr>
           </w:pPr>
-          <w:hyperlink w:anchor="_Toc242464679" w:history="1">
+          <w:hyperlink w:anchor="_Toc242466543" w:history="1">
             <w:r>
               <w:rPr>
                 <w:rStyle w:val="Hyperlink"/>
@@ -1225,7 +1225,7 @@
               <w:rPr>
                 <w:noProof/>
               </w:rPr>
-              <w:instrText xml:space="preserve"> PAGEREF _Toc242464679 \h </w:instrText>
+              <w:instrText xml:space="preserve"> PAGEREF _Toc242466543 \h </w:instrText>
             </w:r>
             <w:r>
               <w:rPr>
@@ -1267,7 +1267,7 @@
               <w14:ligatures w14:val="standardContextual"/>
             </w:rPr>
           </w:pPr>
-          <w:hyperlink w:anchor="_Toc242464680" w:history="1">
+          <w:hyperlink w:anchor="_Toc242466544" w:history="1">
             <w:r>
               <w:rPr>
                 <w:rStyle w:val="Hyperlink"/>
@@ -1291,7 +1291,7 @@
               <w:rPr>
                 <w:noProof/>
               </w:rPr>
-              <w:instrText xml:space="preserve"> PAGEREF _Toc242464680 \h </w:instrText>
+              <w:instrText xml:space="preserve"> PAGEREF _Toc242466544 \h </w:instrText>
             </w:r>
             <w:r>
               <w:rPr>
@@ -1333,7 +1333,7 @@
               <w14:ligatures w14:val="standardContextual"/>
             </w:rPr>
           </w:pPr>
-          <w:hyperlink w:anchor="_Toc242464681" w:history="1">
+          <w:hyperlink w:anchor="_Toc242466545" w:history="1">
             <w:r>
               <w:rPr>
                 <w:rStyle w:val="Hyperlink"/>
@@ -1357,7 +1357,7 @@
               <w:rPr>
                 <w:noProof/>
               </w:rPr>
-              <w:instrText xml:space="preserve"> PAGEREF _Toc242464681 \h </w:instrText>
+              <w:instrText xml:space="preserve"> PAGEREF _Toc242466545 \h </w:instrText>
             </w:r>
             <w:r>
               <w:rPr>
@@ -1399,7 +1399,7 @@
               <w14:ligatures w14:val="standardContextual"/>
             </w:rPr>
           </w:pPr>
-          <w:hyperlink w:anchor="_Toc242464682" w:history="1">
+          <w:hyperlink w:anchor="_Toc242466546" w:history="1">
             <w:r>
               <w:rPr>
                 <w:rStyle w:val="Hyperlink"/>
@@ -1423,7 +1423,7 @@
               <w:rPr>
                 <w:noProof/>
               </w:rPr>
-              <w:instrText xml:space="preserve"> PAGEREF _Toc242464682 \h </w:instrText>
+              <w:instrText xml:space="preserve"> PAGEREF _Toc242466546 \h </w:instrText>
             </w:r>
             <w:r>
               <w:rPr>
@@ -1465,7 +1465,7 @@
               <w14:ligatures w14:val="standardContextual"/>
             </w:rPr>
           </w:pPr>
-          <w:hyperlink w:anchor="_Toc242464683" w:history="1">
+          <w:hyperlink w:anchor="_Toc242466547" w:history="1">
             <w:r>
               <w:rPr>
                 <w:rStyle w:val="Hyperlink"/>
@@ -1489,7 +1489,7 @@
               <w:rPr>
                 <w:noProof/>
               </w:rPr>
-              <w:instrText xml:space="preserve"> PAGEREF _Toc242464683 \h </w:instrText>
+              <w:instrText xml:space="preserve"> PAGEREF _Toc242466547 \h </w:instrText>
             </w:r>
             <w:r>
               <w:rPr>
@@ -1531,7 +1531,7 @@
               <w14:ligatures w14:val="standardContextual"/>
             </w:rPr>
           </w:pPr>
-          <w:hyperlink w:anchor="_Toc242464684" w:history="1">
+          <w:hyperlink w:anchor="_Toc242466548" w:history="1">
             <w:r>
               <w:rPr>
                 <w:rStyle w:val="Hyperlink"/>
@@ -1555,7 +1555,7 @@
               <w:rPr>
                 <w:noProof/>
               </w:rPr>
-              <w:instrText xml:space="preserve"> PAGEREF _Toc242464684 \h </w:instrText>
+              <w:instrText xml:space="preserve"> PAGEREF _Toc242466548 \h </w:instrText>
             </w:r>
             <w:r>
               <w:rPr>
@@ -1597,7 +1597,7 @@
               <w14:ligatures w14:val="standardContextual"/>
             </w:rPr>
           </w:pPr>
-          <w:hyperlink w:anchor="_Toc242464685" w:history="1">
+          <w:hyperlink w:anchor="_Toc242466549" w:history="1">
             <w:r>
               <w:rPr>
                 <w:rStyle w:val="Hyperlink"/>
@@ -1621,7 +1621,7 @@
               <w:rPr>
                 <w:noProof/>
               </w:rPr>
-              <w:instrText xml:space="preserve"> PAGEREF _Toc242464685 \h </w:instrText>
+              <w:instrText xml:space="preserve"> PAGEREF _Toc242466549 \h </w:instrText>
             </w:r>
             <w:r>
               <w:rPr>
@@ -1663,7 +1663,7 @@
               <w14:ligatures w14:val="standardContextual"/>
             </w:rPr>
           </w:pPr>
-          <w:hyperlink w:anchor="_Toc242464686" w:history="1">
+          <w:hyperlink w:anchor="_Toc242466550" w:history="1">
             <w:r>
               <w:rPr>
                 <w:rStyle w:val="Hyperlink"/>
@@ -1687,7 +1687,7 @@
               <w:rPr>
                 <w:noProof/>
               </w:rPr>
-              <w:instrText xml:space="preserve"> PAGEREF _Toc242464686 \h </w:instrText>
+              <w:instrText xml:space="preserve"> PAGEREF _Toc242466550 \h </w:instrText>
             </w:r>
             <w:r>
               <w:rPr>
@@ -1729,7 +1729,7 @@
               <w14:ligatures w14:val="standardContextual"/>
             </w:rPr>
           </w:pPr>
-          <w:hyperlink w:anchor="_Toc242464687" w:history="1">
+          <w:hyperlink w:anchor="_Toc242466551" w:history="1">
             <w:r>
               <w:rPr>
                 <w:rStyle w:val="Hyperlink"/>
@@ -1753,7 +1753,7 @@
               <w:rPr>
                 <w:noProof/>
               </w:rPr>
-              <w:instrText xml:space="preserve"> PAGEREF _Toc242464687 \h </w:instrText>
+              <w:instrText xml:space="preserve"> PAGEREF _Toc242466551 \h </w:instrText>
             </w:r>
             <w:r>
               <w:rPr>
@@ -1770,7 +1770,7 @@
               <w:rPr>
                 <w:noProof/>
               </w:rPr>
-              <w:t>15</w:t>
+              <w:t>16</w:t>
             </w:r>
             <w:r>
               <w:rPr>
@@ -1795,7 +1795,7 @@
               <w14:ligatures w14:val="standardContextual"/>
             </w:rPr>
           </w:pPr>
-          <w:hyperlink w:anchor="_Toc242464688" w:history="1">
+          <w:hyperlink w:anchor="_Toc242466552" w:history="1">
             <w:r>
               <w:rPr>
                 <w:rStyle w:val="Hyperlink"/>
@@ -1819,7 +1819,7 @@
               <w:rPr>
                 <w:noProof/>
               </w:rPr>
-              <w:instrText xml:space="preserve"> PAGEREF _Toc242464688 \h </w:instrText>
+              <w:instrText xml:space="preserve"> PAGEREF _Toc242466552 \h </w:instrText>
             </w:r>
             <w:r>
               <w:rPr>
@@ -1836,7 +1836,7 @@
               <w:rPr>
                 <w:noProof/>
               </w:rPr>
-              <w:t>17</w:t>
+              <w:t>18</w:t>
             </w:r>
             <w:r>
               <w:rPr>
@@ -1861,7 +1861,7 @@
               <w14:ligatures w14:val="standardContextual"/>
             </w:rPr>
           </w:pPr>
-          <w:hyperlink w:anchor="_Toc242464689" w:history="1">
+          <w:hyperlink w:anchor="_Toc242466553" w:history="1">
             <w:r>
               <w:rPr>
                 <w:rStyle w:val="Hyperlink"/>
@@ -1885,7 +1885,7 @@
               <w:rPr>
                 <w:noProof/>
               </w:rPr>
-              <w:instrText xml:space="preserve"> PAGEREF _Toc242464689 \h </w:instrText>
+              <w:instrText xml:space="preserve"> PAGEREF _Toc242466553 \h </w:instrText>
             </w:r>
             <w:r>
               <w:rPr>
@@ -1902,7 +1902,7 @@
               <w:rPr>
                 <w:noProof/>
               </w:rPr>
-              <w:t>18</w:t>
+              <w:t>19</w:t>
             </w:r>
             <w:r>
               <w:rPr>
@@ -1927,7 +1927,7 @@
               <w14:ligatures w14:val="standardContextual"/>
             </w:rPr>
           </w:pPr>
-          <w:hyperlink w:anchor="_Toc242464690" w:history="1">
+          <w:hyperlink w:anchor="_Toc242466554" w:history="1">
             <w:r>
               <w:rPr>
                 <w:rStyle w:val="Hyperlink"/>
@@ -1951,7 +1951,7 @@
               <w:rPr>
                 <w:noProof/>
               </w:rPr>
-              <w:instrText xml:space="preserve"> PAGEREF _Toc242464690 \h </w:instrText>
+              <w:instrText xml:space="preserve"> PAGEREF _Toc242466554 \h </w:instrText>
             </w:r>
             <w:r>
               <w:rPr>
@@ -1968,7 +1968,7 @@
               <w:rPr>
                 <w:noProof/>
               </w:rPr>
-              <w:t>19</w:t>
+              <w:t>20</w:t>
             </w:r>
             <w:r>
               <w:rPr>
@@ -1993,7 +1993,7 @@
               <w14:ligatures w14:val="standardContextual"/>
             </w:rPr>
           </w:pPr>
-          <w:hyperlink w:anchor="_Toc242464691" w:history="1">
+          <w:hyperlink w:anchor="_Toc242466555" w:history="1">
             <w:r>
               <w:rPr>
                 <w:rStyle w:val="Hyperlink"/>
@@ -2017,7 +2017,7 @@
               <w:rPr>
                 <w:noProof/>
               </w:rPr>
-              <w:instrText xml:space="preserve"> PAGEREF _Toc242464691 \h </w:instrText>
+              <w:instrText xml:space="preserve"> PAGEREF _Toc242466555 \h </w:instrText>
             </w:r>
             <w:r>
               <w:rPr>
@@ -2034,7 +2034,7 @@
               <w:rPr>
                 <w:noProof/>
               </w:rPr>
-              <w:t>19</w:t>
+              <w:t>20</w:t>
             </w:r>
             <w:r>
               <w:rPr>
@@ -2059,7 +2059,7 @@
               <w14:ligatures w14:val="standardContextual"/>
             </w:rPr>
           </w:pPr>
-          <w:hyperlink w:anchor="_Toc242464692" w:history="1">
+          <w:hyperlink w:anchor="_Toc242466556" w:history="1">
             <w:r>
               <w:rPr>
                 <w:rStyle w:val="Hyperlink"/>
@@ -2083,7 +2083,7 @@
               <w:rPr>
                 <w:noProof/>
               </w:rPr>
-              <w:instrText xml:space="preserve"> PAGEREF _Toc242464692 \h </w:instrText>
+              <w:instrText xml:space="preserve"> PAGEREF _Toc242466556 \h </w:instrText>
             </w:r>
             <w:r>
               <w:rPr>
@@ -2100,7 +2100,7 @@
               <w:rPr>
                 <w:noProof/>
               </w:rPr>
-              <w:t>29</w:t>
+              <w:t>30</w:t>
             </w:r>
             <w:r>
               <w:rPr>
@@ -2125,7 +2125,7 @@
               <w14:ligatures w14:val="standardContextual"/>
             </w:rPr>
           </w:pPr>
-          <w:hyperlink w:anchor="_Toc242464693" w:history="1">
+          <w:hyperlink w:anchor="_Toc242466557" w:history="1">
             <w:r>
               <w:rPr>
                 <w:rStyle w:val="Hyperlink"/>
@@ -2149,7 +2149,7 @@
               <w:rPr>
                 <w:noProof/>
               </w:rPr>
-              <w:instrText xml:space="preserve"> PAGEREF _Toc242464693 \h </w:instrText>
+              <w:instrText xml:space="preserve"> PAGEREF _Toc242466557 \h </w:instrText>
             </w:r>
             <w:r>
               <w:rPr>
@@ -2166,7 +2166,7 @@
               <w:rPr>
                 <w:noProof/>
               </w:rPr>
-              <w:t>29</w:t>
+              <w:t>30</w:t>
             </w:r>
             <w:r>
               <w:rPr>
@@ -2191,7 +2191,7 @@
               <w14:ligatures w14:val="standardContextual"/>
             </w:rPr>
           </w:pPr>
-          <w:hyperlink w:anchor="_Toc242464694" w:history="1">
+          <w:hyperlink w:anchor="_Toc242466558" w:history="1">
             <w:r>
               <w:rPr>
                 <w:rStyle w:val="Hyperlink"/>
@@ -2215,7 +2215,7 @@
               <w:rPr>
                 <w:noProof/>
               </w:rPr>
-              <w:instrText xml:space="preserve"> PAGEREF _Toc242464694 \h </w:instrText>
+              <w:instrText xml:space="preserve"> PAGEREF _Toc242466558 \h </w:instrText>
             </w:r>
             <w:r>
               <w:rPr>
@@ -2232,7 +2232,7 @@
               <w:rPr>
                 <w:noProof/>
               </w:rPr>
-              <w:t>29</w:t>
+              <w:t>31</w:t>
             </w:r>
             <w:r>
               <w:rPr>
@@ -2257,7 +2257,7 @@
               <w14:ligatures w14:val="standardContextual"/>
             </w:rPr>
           </w:pPr>
-          <w:hyperlink w:anchor="_Toc242464695" w:history="1">
+          <w:hyperlink w:anchor="_Toc242466559" w:history="1">
             <w:r>
               <w:rPr>
                 <w:rStyle w:val="Hyperlink"/>
@@ -2281,7 +2281,7 @@
               <w:rPr>
                 <w:noProof/>
               </w:rPr>
-              <w:instrText xml:space="preserve"> PAGEREF _Toc242464695 \h </w:instrText>
+              <w:instrText xml:space="preserve"> PAGEREF _Toc242466559 \h </w:instrText>
             </w:r>
             <w:r>
               <w:rPr>
@@ -2298,7 +2298,7 @@
               <w:rPr>
                 <w:noProof/>
               </w:rPr>
-              <w:t>30</w:t>
+              <w:t>31</w:t>
             </w:r>
             <w:r>
               <w:rPr>
@@ -2323,7 +2323,7 @@
               <w14:ligatures w14:val="standardContextual"/>
             </w:rPr>
           </w:pPr>
-          <w:hyperlink w:anchor="_Toc242464696" w:history="1">
+          <w:hyperlink w:anchor="_Toc242466560" w:history="1">
             <w:r>
               <w:rPr>
                 <w:rStyle w:val="Hyperlink"/>
@@ -2347,7 +2347,7 @@
               <w:rPr>
                 <w:noProof/>
               </w:rPr>
-              <w:instrText xml:space="preserve"> PAGEREF _Toc242464696 \h </w:instrText>
+              <w:instrText xml:space="preserve"> PAGEREF _Toc242466560 \h </w:instrText>
             </w:r>
             <w:r>
               <w:rPr>
@@ -2364,7 +2364,7 @@
               <w:rPr>
                 <w:noProof/>
               </w:rPr>
-              <w:t>31</w:t>
+              <w:t>32</w:t>
             </w:r>
             <w:r>
               <w:rPr>
@@ -2389,7 +2389,7 @@
               <w14:ligatures w14:val="standardContextual"/>
             </w:rPr>
           </w:pPr>
-          <w:hyperlink w:anchor="_Toc242464697" w:history="1">
+          <w:hyperlink w:anchor="_Toc242466561" w:history="1">
             <w:r>
               <w:rPr>
                 <w:rStyle w:val="Hyperlink"/>
@@ -2413,7 +2413,7 @@
               <w:rPr>
                 <w:noProof/>
               </w:rPr>
-              <w:instrText xml:space="preserve"> PAGEREF _Toc242464697 \h </w:instrText>
+              <w:instrText xml:space="preserve"> PAGEREF _Toc242466561 \h </w:instrText>
             </w:r>
             <w:r>
               <w:rPr>
@@ -2430,7 +2430,7 @@
               <w:rPr>
                 <w:noProof/>
               </w:rPr>
-              <w:t>31</w:t>
+              <w:t>32</w:t>
             </w:r>
             <w:r>
               <w:rPr>
@@ -2455,7 +2455,7 @@
               <w14:ligatures w14:val="standardContextual"/>
             </w:rPr>
           </w:pPr>
-          <w:hyperlink w:anchor="_Toc242464698" w:history="1">
+          <w:hyperlink w:anchor="_Toc242466562" w:history="1">
             <w:r>
               <w:rPr>
                 <w:rStyle w:val="Hyperlink"/>
@@ -2479,7 +2479,7 @@
               <w:rPr>
                 <w:noProof/>
               </w:rPr>
-              <w:instrText xml:space="preserve"> PAGEREF _Toc242464698 \h </w:instrText>
+              <w:instrText xml:space="preserve"> PAGEREF _Toc242466562 \h </w:instrText>
             </w:r>
             <w:r>
               <w:rPr>
@@ -2496,7 +2496,7 @@
               <w:rPr>
                 <w:noProof/>
               </w:rPr>
-              <w:t>31</w:t>
+              <w:t>32</w:t>
             </w:r>
             <w:r>
               <w:rPr>
@@ -2517,7 +2517,7 @@
       <w:pPr>
         <w:pStyle w:val="Heading1"/>
       </w:pPr>
-      <w:bookmarkStart w:id="0" w:name="_Toc242464664"/>
+      <w:bookmarkStart w:id="0" w:name="_Toc242466528"/>
       <w:r>
         <w:t>1. Introducción</w:t>
       </w:r>
@@ -2527,7 +2527,7 @@
       <w:pPr>
         <w:pStyle w:val="Heading2"/>
       </w:pPr>
-      <w:bookmarkStart w:id="1" w:name="_Toc242464665"/>
+      <w:bookmarkStart w:id="1" w:name="_Toc242466529"/>
       <w:r>
         <w:t>1.1 Objetivo</w:t>
       </w:r>
@@ -2545,7 +2545,7 @@
       <w:pPr>
         <w:pStyle w:val="Heading2"/>
       </w:pPr>
-      <w:bookmarkStart w:id="2" w:name="_Toc242464666"/>
+      <w:bookmarkStart w:id="2" w:name="_Toc242466530"/>
       <w:r>
         <w:t>1.2 Historia de usuario</w:t>
       </w:r>
@@ -2588,7 +2588,7 @@
       <w:pPr>
         <w:pStyle w:val="Heading2"/>
       </w:pPr>
-      <w:bookmarkStart w:id="3" w:name="_Toc242464667"/>
+      <w:bookmarkStart w:id="3" w:name="_Toc242466531"/>
       <w:r>
         <w:t>1.3 Resumen de la solución</w:t>
       </w:r>
@@ -2732,7 +2732,7 @@
       <w:pPr>
         <w:pStyle w:val="Heading2"/>
       </w:pPr>
-      <w:bookmarkStart w:id="4" w:name="_Toc242464668"/>
+      <w:bookmarkStart w:id="4" w:name="_Toc242466532"/>
       <w:r>
         <w:t>1.4 Entregables</w:t>
       </w:r>
@@ -3248,7 +3248,7 @@
         <w:pStyle w:val="Heading1"/>
         <w:pageBreakBefore/>
       </w:pPr>
-      <w:bookmarkStart w:id="5" w:name="_Toc242464669"/>
+      <w:bookmarkStart w:id="5" w:name="_Toc242466533"/>
       <w:r>
         <w:lastRenderedPageBreak/>
         <w:t>2. Requerimientos y cobertura</w:t>
@@ -3611,7 +3611,7 @@
                 <w:sz w:val="19"/>
                 <w:szCs w:val="19"/>
               </w:rPr>
-              <w:t>Consultas: todos los clientes, por ID, por CURP, por RFC, por número de cuenta</w:t>
+              <w:t>Consultas: todos los clientes, por CURP, por RFC, por número de cuenta</w:t>
             </w:r>
           </w:p>
         </w:tc>
@@ -3679,22 +3679,6 @@
                 <w:szCs w:val="19"/>
               </w:rPr>
               <w:t xml:space="preserve"> (</w:t>
-            </w:r>
-            <w:r>
-              <w:rPr>
-                <w:rFonts w:ascii="Consolas" w:eastAsia="Consolas" w:hAnsi="Consolas" w:cs="Consolas"/>
-                <w:color w:val="7C2D12"/>
-                <w:sz w:val="19"/>
-                <w:szCs w:val="19"/>
-              </w:rPr>
-              <w:t>clienteId</w:t>
-            </w:r>
-            <w:r>
-              <w:rPr>
-                <w:sz w:val="19"/>
-                <w:szCs w:val="19"/>
-              </w:rPr>
-              <w:t xml:space="preserve">, </w:t>
             </w:r>
             <w:r>
               <w:rPr>
@@ -4226,7 +4210,7 @@
         <w:pStyle w:val="Heading1"/>
         <w:pageBreakBefore/>
       </w:pPr>
-      <w:bookmarkStart w:id="6" w:name="_Toc242464670"/>
+      <w:bookmarkStart w:id="6" w:name="_Toc242466534"/>
       <w:r>
         <w:lastRenderedPageBreak/>
         <w:t>3. Arquitectura de la solución</w:t>
@@ -4237,7 +4221,7 @@
       <w:pPr>
         <w:pStyle w:val="Heading2"/>
       </w:pPr>
-      <w:bookmarkStart w:id="7" w:name="_Toc242464671"/>
+      <w:bookmarkStart w:id="7" w:name="_Toc242466535"/>
       <w:r>
         <w:t>3.1 Capas</w:t>
       </w:r>
@@ -5240,7 +5224,7 @@
       <w:pPr>
         <w:pStyle w:val="Heading2"/>
       </w:pPr>
-      <w:bookmarkStart w:id="8" w:name="_Toc242464672"/>
+      <w:bookmarkStart w:id="8" w:name="_Toc242466536"/>
       <w:r>
         <w:t>3.2 Estructura del código fuente</w:t>
       </w:r>
@@ -5434,7 +5418,7 @@
       <w:pPr>
         <w:pStyle w:val="Heading2"/>
       </w:pPr>
-      <w:bookmarkStart w:id="9" w:name="_Toc242464673"/>
+      <w:bookmarkStart w:id="9" w:name="_Toc242466537"/>
       <w:r>
         <w:t>3.3 Flujo del registro de un cliente (bandera 1)</w:t>
       </w:r>
@@ -5600,7 +5584,7 @@
       <w:pPr>
         <w:pStyle w:val="Heading1"/>
       </w:pPr>
-      <w:bookmarkStart w:id="10" w:name="_Toc242464674"/>
+      <w:bookmarkStart w:id="10" w:name="_Toc242466538"/>
       <w:r>
         <w:lastRenderedPageBreak/>
         <w:t>4. Diseño de la base de datos</w:t>
@@ -5611,7 +5595,7 @@
       <w:pPr>
         <w:pStyle w:val="Heading2"/>
       </w:pPr>
-      <w:bookmarkStart w:id="11" w:name="_Toc242464675"/>
+      <w:bookmarkStart w:id="11" w:name="_Toc242466539"/>
       <w:r>
         <w:t>4.1 Diagrama entidad-relación</w:t>
       </w:r>
@@ -5626,7 +5610,7 @@
           <w:noProof/>
         </w:rPr>
         <w:drawing>
-          <wp:inline distT="0" distB="0" distL="0" distR="0" wp14:anchorId="7A2C714F" wp14:editId="1603D1D9">
+          <wp:inline distT="0" distB="0" distL="0" distR="0" wp14:anchorId="412D8FCA" wp14:editId="0BF21DC4">
             <wp:extent cx="6191250" cy="4495800"/>
             <wp:effectExtent l="0" t="0" r="0" b="0"/>
             <wp:docPr id="1" name="diagrama_er" descr="Diagrama entidad-relación del onboarding de clientes" title="Diagrama ER"/>
@@ -5709,7 +5693,7 @@
       <w:pPr>
         <w:pStyle w:val="Heading2"/>
       </w:pPr>
-      <w:bookmarkStart w:id="12" w:name="_Toc242464676"/>
+      <w:bookmarkStart w:id="12" w:name="_Toc242466540"/>
       <w:r>
         <w:t>4.2 Diccionario de datos</w:t>
       </w:r>
@@ -11369,7 +11353,7 @@
       <w:pPr>
         <w:pStyle w:val="Heading2"/>
       </w:pPr>
-      <w:bookmarkStart w:id="13" w:name="_Toc242464677"/>
+      <w:bookmarkStart w:id="13" w:name="_Toc242466541"/>
       <w:r>
         <w:t>4.3 Tipos de datos y uso de memoria</w:t>
       </w:r>
@@ -12243,7 +12227,7 @@
       <w:pPr>
         <w:pStyle w:val="Heading2"/>
       </w:pPr>
-      <w:bookmarkStart w:id="14" w:name="_Toc242464678"/>
+      <w:bookmarkStart w:id="14" w:name="_Toc242466542"/>
       <w:r>
         <w:t>4.4 Reglas implementadas con triggers</w:t>
       </w:r>
@@ -12673,7 +12657,7 @@
       <w:pPr>
         <w:pStyle w:val="Heading2"/>
       </w:pPr>
-      <w:bookmarkStart w:id="15" w:name="_Toc242464679"/>
+      <w:bookmarkStart w:id="15" w:name="_Toc242466543"/>
       <w:r>
         <w:t>4.5 Migraciones</w:t>
       </w:r>
@@ -12819,7 +12803,7 @@
         <w:pStyle w:val="Heading1"/>
         <w:pageBreakBefore/>
       </w:pPr>
-      <w:bookmarkStart w:id="16" w:name="_Toc242464680"/>
+      <w:bookmarkStart w:id="16" w:name="_Toc242466544"/>
       <w:r>
         <w:lastRenderedPageBreak/>
         <w:t>5. Validaciones</w:t>
@@ -14491,7 +14475,7 @@
                 <w:sz w:val="19"/>
                 <w:szCs w:val="19"/>
               </w:rPr>
-              <w:t>Usuario de 3 a 50 caracteres seguros; contraseña de 8 a 72 con letra y número</w:t>
+              <w:t>Usuario de 3 a 50 caracteres seguros; contraseña (al registrar y al editar) de 8 a 72 caracteres, sin espacios, con al menos 1 mayúscula, 1 minúscula, 1 número y 1 carácter especial</w:t>
             </w:r>
           </w:p>
         </w:tc>
@@ -14520,22 +14504,6 @@
                 <w:szCs w:val="19"/>
               </w:rPr>
               <w:t>@Pattern</w:t>
-            </w:r>
-            <w:r>
-              <w:rPr>
-                <w:sz w:val="19"/>
-                <w:szCs w:val="19"/>
-              </w:rPr>
-              <w:t xml:space="preserve">, </w:t>
-            </w:r>
-            <w:r>
-              <w:rPr>
-                <w:rFonts w:ascii="Consolas" w:eastAsia="Consolas" w:hAnsi="Consolas" w:cs="Consolas"/>
-                <w:color w:val="7C2D12"/>
-                <w:sz w:val="19"/>
-                <w:szCs w:val="19"/>
-              </w:rPr>
-              <w:t>@Size</w:t>
             </w:r>
           </w:p>
         </w:tc>
@@ -14595,7 +14563,7 @@
         <w:pStyle w:val="Heading1"/>
         <w:pageBreakBefore/>
       </w:pPr>
-      <w:bookmarkStart w:id="17" w:name="_Toc242464681"/>
+      <w:bookmarkStart w:id="17" w:name="_Toc242466545"/>
       <w:r>
         <w:lastRenderedPageBreak/>
         <w:t>6. Reglas de negocio</w:t>
@@ -15780,7 +15748,7 @@
         <w:pStyle w:val="Heading1"/>
         <w:pageBreakBefore/>
       </w:pPr>
-      <w:bookmarkStart w:id="18" w:name="_Toc242464682"/>
+      <w:bookmarkStart w:id="18" w:name="_Toc242466546"/>
       <w:r>
         <w:lastRenderedPageBreak/>
         <w:t>7. API REST</w:t>
@@ -15791,7 +15759,7 @@
       <w:pPr>
         <w:pStyle w:val="Heading2"/>
       </w:pPr>
-      <w:bookmarkStart w:id="19" w:name="_Toc242464683"/>
+      <w:bookmarkStart w:id="19" w:name="_Toc242466547"/>
       <w:r>
         <w:t>7.1 Endpoints</w:t>
       </w:r>
@@ -16221,7 +16189,7 @@
       <w:pPr>
         <w:pStyle w:val="Heading2"/>
       </w:pPr>
-      <w:bookmarkStart w:id="20" w:name="_Toc242464684"/>
+      <w:bookmarkStart w:id="20" w:name="_Toc242466548"/>
       <w:r>
         <w:t>7.2 Códigos de respuesta</w:t>
       </w:r>
@@ -16924,7 +16892,7 @@
       <w:pPr>
         <w:pStyle w:val="Heading2"/>
       </w:pPr>
-      <w:bookmarkStart w:id="21" w:name="_Toc242464685"/>
+      <w:bookmarkStart w:id="21" w:name="_Toc242466549"/>
       <w:r>
         <w:lastRenderedPageBreak/>
         <w:t>7.3 Ejemplo: registro de un cliente</w:t>
@@ -17349,7 +17317,7 @@
           <w:sz w:val="17"/>
           <w:szCs w:val="17"/>
         </w:rPr>
-        <w:t xml:space="preserve">    "clienteId": 620, "nombreCompleto": "Laura Elena Torres Vargas",</w:t>
+        <w:t xml:space="preserve">    "nombreCompleto": "Laura Elena Torres Vargas",</w:t>
       </w:r>
     </w:p>
     <w:p>
@@ -17465,11 +17433,84 @@
       <w:pPr>
         <w:pStyle w:val="Heading2"/>
       </w:pPr>
-      <w:bookmarkStart w:id="22" w:name="_Toc242464686"/>
+      <w:bookmarkStart w:id="22" w:name="_Toc242466550"/>
       <w:r>
         <w:t>7.4 Actualización y baja lógica</w:t>
       </w:r>
       <w:bookmarkEnd w:id="22"/>
+    </w:p>
+    <w:p>
+      <w:pPr>
+        <w:spacing w:after="120" w:line="276" w:lineRule="auto"/>
+      </w:pPr>
+      <w:r>
+        <w:rPr>
+          <w:b/>
+          <w:bCs/>
+        </w:rPr>
+        <w:t>El ID interno del cliente no se pide ni se devuelve en ninguna operación.</w:t>
+      </w:r>
+      <w:r>
+        <w:t xml:space="preserve"> Para actualizar o dar de baja se identifica al cliente con llaves que no cambian, dentro del objeto </w:t>
+      </w:r>
+      <w:r>
+        <w:rPr>
+          <w:rFonts w:ascii="Consolas" w:eastAsia="Consolas" w:hAnsi="Consolas" w:cs="Consolas"/>
+          <w:color w:val="7C2D12"/>
+          <w:sz w:val="19"/>
+          <w:szCs w:val="19"/>
+        </w:rPr>
+        <w:t>filtros</w:t>
+      </w:r>
+      <w:r>
+        <w:t xml:space="preserve"> y con el valor </w:t>
+      </w:r>
+      <w:r>
+        <w:rPr>
+          <w:b/>
+          <w:bCs/>
+        </w:rPr>
+        <w:t>completo</w:t>
+      </w:r>
+      <w:r>
+        <w:t xml:space="preserve">: </w:t>
+      </w:r>
+      <w:r>
+        <w:rPr>
+          <w:rFonts w:ascii="Consolas" w:eastAsia="Consolas" w:hAnsi="Consolas" w:cs="Consolas"/>
+          <w:color w:val="7C2D12"/>
+          <w:sz w:val="19"/>
+          <w:szCs w:val="19"/>
+        </w:rPr>
+        <w:t>curp</w:t>
+      </w:r>
+      <w:r>
+        <w:t xml:space="preserve"> (18 caracteres), </w:t>
+      </w:r>
+      <w:r>
+        <w:rPr>
+          <w:rFonts w:ascii="Consolas" w:eastAsia="Consolas" w:hAnsi="Consolas" w:cs="Consolas"/>
+          <w:color w:val="7C2D12"/>
+          <w:sz w:val="19"/>
+          <w:szCs w:val="19"/>
+        </w:rPr>
+        <w:t>rfc</w:t>
+      </w:r>
+      <w:r>
+        <w:t xml:space="preserve"> (12 o 13) o </w:t>
+      </w:r>
+      <w:r>
+        <w:rPr>
+          <w:rFonts w:ascii="Consolas" w:eastAsia="Consolas" w:hAnsi="Consolas" w:cs="Consolas"/>
+          <w:color w:val="7C2D12"/>
+          <w:sz w:val="19"/>
+          <w:szCs w:val="19"/>
+        </w:rPr>
+        <w:t>numeroCuenta</w:t>
+      </w:r>
+      <w:r>
+        <w:t xml:space="preserve"> (12 dígitos). Con varias llaves, todas deben corresponder al mismo cliente.</w:t>
+      </w:r>
     </w:p>
     <w:p>
       <w:pPr>
@@ -17488,7 +17529,7 @@
         <w:t>Actualizar (bandera 2):</w:t>
       </w:r>
       <w:r>
-        <w:t xml:space="preserve"> se envían </w:t>
+        <w:t xml:space="preserve"> </w:t>
       </w:r>
       <w:r>
         <w:rPr>
@@ -17497,10 +17538,22 @@
           <w:sz w:val="19"/>
           <w:szCs w:val="19"/>
         </w:rPr>
-        <w:t>clienteId</w:t>
-      </w:r>
-      <w:r>
-        <w:t xml:space="preserve"> y las secciones a modificar. Si la CURP o el RFC no coinciden con los registrados, la respuesta es </w:t>
+        <w:t>{"bandera": 2, "filtros": {"curp": "TOVL920821MGTRRR04"}, ...secciones a modificar...}</w:t>
+      </w:r>
+      <w:r>
+        <w:t xml:space="preserve">. Si la CURP o el RFC de </w:t>
+      </w:r>
+      <w:r>
+        <w:rPr>
+          <w:rFonts w:ascii="Consolas" w:eastAsia="Consolas" w:hAnsi="Consolas" w:cs="Consolas"/>
+          <w:color w:val="7C2D12"/>
+          <w:sz w:val="19"/>
+          <w:szCs w:val="19"/>
+        </w:rPr>
+        <w:t>datosPersonales</w:t>
+      </w:r>
+      <w:r>
+        <w:t xml:space="preserve"> no coinciden con los registrados, la respuesta es </w:t>
       </w:r>
       <w:r>
         <w:rPr>
@@ -17510,7 +17563,19 @@
         <w:t>400</w:t>
       </w:r>
       <w:r>
-        <w:t xml:space="preserve"> «La CURP no puede modificarse».</w:t>
+        <w:t xml:space="preserve"> «La CURP no puede modificarse». También se puede cambiar la contraseña con </w:t>
+      </w:r>
+      <w:r>
+        <w:rPr>
+          <w:rFonts w:ascii="Consolas" w:eastAsia="Consolas" w:hAnsi="Consolas" w:cs="Consolas"/>
+          <w:color w:val="7C2D12"/>
+          <w:sz w:val="19"/>
+          <w:szCs w:val="19"/>
+        </w:rPr>
+        <w:t>loginCredenciales</w:t>
+      </w:r>
+      <w:r>
+        <w:t xml:space="preserve"> (el usuario debe coincidir con el registrado); la nueva contraseña cumple la misma política que al registrar y cierra la sesión activa.</w:t>
       </w:r>
     </w:p>
     <w:p>
@@ -17539,7 +17604,7 @@
           <w:sz w:val="19"/>
           <w:szCs w:val="19"/>
         </w:rPr>
-        <w:t>{"bandera": 3, "clienteId": 620}</w:t>
+        <w:t>{"bandera": 3, "filtros": {"curp": "TOVL920821MGTRRR04"}}</w:t>
       </w:r>
       <w:r>
         <w:t xml:space="preserve"> → </w:t>
@@ -17591,9 +17656,110 @@
     </w:p>
     <w:p>
       <w:pPr>
+        <w:pStyle w:val="ListParagraph"/>
+        <w:numPr>
+          <w:ilvl w:val="0"/>
+          <w:numId w:val="3"/>
+        </w:numPr>
+        <w:spacing w:after="60"/>
+      </w:pPr>
+      <w:r>
+        <w:rPr>
+          <w:b/>
+          <w:bCs/>
+        </w:rPr>
+        <w:lastRenderedPageBreak/>
+        <w:t>Errores:</w:t>
+      </w:r>
+      <w:r>
+        <w:t xml:space="preserve"> llave inexistente → </w:t>
+      </w:r>
+      <w:r>
+        <w:rPr>
+          <w:b/>
+          <w:bCs/>
+        </w:rPr>
+        <w:t>404</w:t>
+      </w:r>
+      <w:r>
+        <w:t xml:space="preserve">; sin llaves, llave incompleta, filtro que no es llave o </w:t>
+      </w:r>
+      <w:r>
+        <w:rPr>
+          <w:rFonts w:ascii="Consolas" w:eastAsia="Consolas" w:hAnsi="Consolas" w:cs="Consolas"/>
+          <w:color w:val="7C2D12"/>
+          <w:sz w:val="19"/>
+          <w:szCs w:val="19"/>
+        </w:rPr>
+        <w:t>clienteId</w:t>
+      </w:r>
+      <w:r>
+        <w:t xml:space="preserve"> → </w:t>
+      </w:r>
+      <w:r>
+        <w:rPr>
+          <w:b/>
+          <w:bCs/>
+        </w:rPr>
+        <w:t>400</w:t>
+      </w:r>
+      <w:r>
+        <w:t>.</w:t>
+      </w:r>
+    </w:p>
+    <w:p>
+      <w:pPr>
+        <w:pStyle w:val="Heading3"/>
+      </w:pPr>
+      <w:r>
+        <w:t>Política de contraseña</w:t>
+      </w:r>
+    </w:p>
+    <w:p>
+      <w:pPr>
+        <w:spacing w:after="120" w:line="276" w:lineRule="auto"/>
+      </w:pPr>
+      <w:r>
+        <w:t xml:space="preserve">Aplica al registrar y al editar: de 8 a 72 caracteres, sin espacios, con al menos </w:t>
+      </w:r>
+      <w:r>
+        <w:rPr>
+          <w:b/>
+          <w:bCs/>
+        </w:rPr>
+        <w:t>1 mayúscula, 1 minúscula, 1 número y 1 carácter especial</w:t>
+      </w:r>
+      <w:r>
+        <w:t xml:space="preserve"> (signo de puntuación como </w:t>
+      </w:r>
+      <w:r>
+        <w:rPr>
+          <w:rFonts w:ascii="Consolas" w:eastAsia="Consolas" w:hAnsi="Consolas" w:cs="Consolas"/>
+          <w:color w:val="7C2D12"/>
+          <w:sz w:val="19"/>
+          <w:szCs w:val="19"/>
+        </w:rPr>
+        <w:t>! @ # $ % &amp; * _ - + = ? .</w:t>
+      </w:r>
+      <w:r>
+        <w:t xml:space="preserve">). Si no la cumple, la respuesta es </w:t>
+      </w:r>
+      <w:r>
+        <w:rPr>
+          <w:b/>
+          <w:bCs/>
+        </w:rPr>
+        <w:t>400</w:t>
+      </w:r>
+      <w:r>
+        <w:t xml:space="preserve"> «La contraseña debe tener de 8 a 72 caracteres, sin espacios, con al menos 1 mayúscula, 1 minúscula, 1 número y 1 carácter especial».</w:t>
+      </w:r>
+    </w:p>
+    <w:p>
+      <w:pPr>
         <w:pStyle w:val="Heading2"/>
       </w:pPr>
-      <w:bookmarkStart w:id="23" w:name="_Toc242464687"/>
+      <w:bookmarkStart w:id="23" w:name="_Toc242466551"/>
       <w:r>
         <w:t>7.5 Consulta de clientes (bandera 4)</w:t>
       </w:r>
@@ -17783,95 +17949,6 @@
                 <w:sz w:val="19"/>
                 <w:szCs w:val="19"/>
               </w:rPr>
-              <w:t>clienteId</w:t>
-            </w:r>
-          </w:p>
-        </w:tc>
-        <w:tc>
-          <w:tcPr>
-            <w:tcW w:w="4560" w:type="dxa"/>
-            <w:tcBorders>
-              <w:top w:val="single" w:sz="4" w:space="0" w:color="BFC7D5"/>
-              <w:left w:val="single" w:sz="4" w:space="0" w:color="BFC7D5"/>
-              <w:bottom w:val="single" w:sz="4" w:space="0" w:color="BFC7D5"/>
-              <w:right w:val="single" w:sz="4" w:space="0" w:color="BFC7D5"/>
-            </w:tcBorders>
-            <w:tcMar>
-              <w:top w:w="60" w:type="dxa"/>
-              <w:left w:w="100" w:type="dxa"/>
-              <w:bottom w:w="60" w:type="dxa"/>
-              <w:right w:w="100" w:type="dxa"/>
-            </w:tcMar>
-          </w:tcPr>
-          <w:p>
-            <w:r>
-              <w:rPr>
-                <w:sz w:val="19"/>
-                <w:szCs w:val="19"/>
-              </w:rPr>
-              <w:t>Número entero mayor a 0</w:t>
-            </w:r>
-          </w:p>
-        </w:tc>
-        <w:tc>
-          <w:tcPr>
-            <w:tcW w:w="2600" w:type="dxa"/>
-            <w:tcBorders>
-              <w:top w:val="single" w:sz="4" w:space="0" w:color="BFC7D5"/>
-              <w:left w:val="single" w:sz="4" w:space="0" w:color="BFC7D5"/>
-              <w:bottom w:val="single" w:sz="4" w:space="0" w:color="BFC7D5"/>
-              <w:right w:val="single" w:sz="4" w:space="0" w:color="BFC7D5"/>
-            </w:tcBorders>
-            <w:tcMar>
-              <w:top w:w="60" w:type="dxa"/>
-              <w:left w:w="100" w:type="dxa"/>
-              <w:bottom w:w="60" w:type="dxa"/>
-              <w:right w:w="100" w:type="dxa"/>
-            </w:tcMar>
-          </w:tcPr>
-          <w:p>
-            <w:r>
-              <w:rPr>
-                <w:sz w:val="19"/>
-                <w:szCs w:val="19"/>
-              </w:rPr>
-              <w:t>Exacta</w:t>
-            </w:r>
-          </w:p>
-        </w:tc>
-      </w:tr>
-      <w:tr>
-        <w:tblPrEx>
-          <w:tblCellMar>
-            <w:top w:w="0" w:type="dxa"/>
-            <w:bottom w:w="0" w:type="dxa"/>
-          </w:tblCellMar>
-        </w:tblPrEx>
-        <w:tc>
-          <w:tcPr>
-            <w:tcW w:w="2200" w:type="dxa"/>
-            <w:tcBorders>
-              <w:top w:val="single" w:sz="4" w:space="0" w:color="BFC7D5"/>
-              <w:left w:val="single" w:sz="4" w:space="0" w:color="BFC7D5"/>
-              <w:bottom w:val="single" w:sz="4" w:space="0" w:color="BFC7D5"/>
-              <w:right w:val="single" w:sz="4" w:space="0" w:color="BFC7D5"/>
-            </w:tcBorders>
-            <w:tcMar>
-              <w:top w:w="60" w:type="dxa"/>
-              <w:left w:w="100" w:type="dxa"/>
-              <w:bottom w:w="60" w:type="dxa"/>
-              <w:right w:w="100" w:type="dxa"/>
-            </w:tcMar>
-          </w:tcPr>
-          <w:p>
-            <w:r>
-              <w:rPr>
-                <w:rFonts w:ascii="Consolas" w:eastAsia="Consolas" w:hAnsi="Consolas" w:cs="Consolas"/>
-                <w:color w:val="7C2D12"/>
-                <w:sz w:val="19"/>
-                <w:szCs w:val="19"/>
-              </w:rPr>
-              <w:lastRenderedPageBreak/>
               <w:t>curp</w:t>
             </w:r>
           </w:p>
@@ -18414,6 +18491,7 @@
         <w:spacing w:after="120" w:line="276" w:lineRule="auto"/>
       </w:pPr>
       <w:r>
+        <w:lastRenderedPageBreak/>
         <w:t>Petición y respuesta reales:</w:t>
       </w:r>
     </w:p>
@@ -18549,7 +18627,7 @@
           <w:sz w:val="17"/>
           <w:szCs w:val="17"/>
         </w:rPr>
-        <w:t xml:space="preserve">      "clienteId": 67, "nombreCompleto": "Fernando Perez Lopez",</w:t>
+        <w:t xml:space="preserve">      "nombreCompleto": "Fernando Perez Lopez",</w:t>
       </w:r>
     </w:p>
     <w:p>
@@ -18711,7 +18789,7 @@
         <w:pStyle w:val="Heading1"/>
         <w:pageBreakBefore/>
       </w:pPr>
-      <w:bookmarkStart w:id="24" w:name="_Toc242464688"/>
+      <w:bookmarkStart w:id="24" w:name="_Toc242466552"/>
       <w:r>
         <w:lastRenderedPageBreak/>
         <w:t>8. Manejo de excepciones</w:t>
@@ -19841,7 +19919,7 @@
         <w:pStyle w:val="Heading1"/>
         <w:pageBreakBefore/>
       </w:pPr>
-      <w:bookmarkStart w:id="25" w:name="_Toc242464689"/>
+      <w:bookmarkStart w:id="25" w:name="_Toc242466553"/>
       <w:r>
         <w:lastRenderedPageBreak/>
         <w:t>9. Seguridad y rendimiento</w:t>
@@ -20732,7 +20810,7 @@
         <w:pStyle w:val="Heading1"/>
         <w:pageBreakBefore/>
       </w:pPr>
-      <w:bookmarkStart w:id="26" w:name="_Toc242464690"/>
+      <w:bookmarkStart w:id="26" w:name="_Toc242466554"/>
       <w:r>
         <w:lastRenderedPageBreak/>
         <w:t>10. Pruebas y evidencias</w:t>
@@ -20743,7 +20821,7 @@
       <w:pPr>
         <w:pStyle w:val="Heading2"/>
       </w:pPr>
-      <w:bookmarkStart w:id="27" w:name="_Toc242464691"/>
+      <w:bookmarkStart w:id="27" w:name="_Toc242466555"/>
       <w:r>
         <w:t>10.1 Evidencias en Swagger UI</w:t>
       </w:r>
@@ -21666,10 +21744,10 @@
           <w:noProof/>
         </w:rPr>
         <w:drawing>
-          <wp:inline distT="0" distB="0" distL="0" distR="0" wp14:anchorId="2B9625E9" wp14:editId="3A391856">
-            <wp:extent cx="5886450" cy="7334250"/>
+          <wp:inline distT="0" distB="0" distL="0" distR="0" wp14:anchorId="626C9276" wp14:editId="7A3BA3C9">
+            <wp:extent cx="5715000" cy="7334250"/>
             <wp:effectExtent l="0" t="0" r="0" b="0"/>
-            <wp:docPr id="167706407" name="01_1.png" descr="Registro exitoso de un cliente" title="Swagger · POST /api/v1/layaway/cliente · ÉXITO (201 Created)"/>
+            <wp:docPr id="1558174793" name="01_1.png" descr="Registro exitoso de un cliente" title="Swagger · POST /api/v1/layaway/cliente · ÉXITO (201 Created)"/>
             <wp:cNvGraphicFramePr>
               <a:graphicFrameLocks xmlns:a="http://schemas.openxmlformats.org/drawingml/2006/main" noChangeAspect="1"/>
             </wp:cNvGraphicFramePr>
@@ -21692,7 +21770,7 @@
                   <pic:spPr bwMode="auto">
                     <a:xfrm>
                       <a:off x="0" y="0"/>
-                      <a:ext cx="5886450" cy="7334250"/>
+                      <a:ext cx="5715000" cy="7334250"/>
                     </a:xfrm>
                     <a:prstGeom prst="rect">
                       <a:avLst/>
@@ -21730,10 +21808,10 @@
           <w:noProof/>
         </w:rPr>
         <w:drawing>
-          <wp:inline distT="0" distB="0" distL="0" distR="0" wp14:anchorId="3B677A07" wp14:editId="0BC12FC5">
-            <wp:extent cx="4914900" cy="7334250"/>
+          <wp:inline distT="0" distB="0" distL="0" distR="0" wp14:anchorId="5D075DF0" wp14:editId="7EABAD34">
+            <wp:extent cx="4972050" cy="7334250"/>
             <wp:effectExtent l="0" t="0" r="0" b="0"/>
-            <wp:docPr id="1776323891" name="01_2.png" descr="Registro exitoso de un cliente" title="Swagger · POST /api/v1/layaway/cliente · ÉXITO (201 Created)"/>
+            <wp:docPr id="717310362" name="01_2.png" descr="Registro exitoso de un cliente" title="Swagger · POST /api/v1/layaway/cliente · ÉXITO (201 Created)"/>
             <wp:cNvGraphicFramePr>
               <a:graphicFrameLocks xmlns:a="http://schemas.openxmlformats.org/drawingml/2006/main" noChangeAspect="1"/>
             </wp:cNvGraphicFramePr>
@@ -21756,7 +21834,7 @@
                   <pic:spPr bwMode="auto">
                     <a:xfrm>
                       <a:off x="0" y="0"/>
-                      <a:ext cx="4914900" cy="7334250"/>
+                      <a:ext cx="4972050" cy="7334250"/>
                     </a:xfrm>
                     <a:prstGeom prst="rect">
                       <a:avLst/>
@@ -21794,10 +21872,10 @@
           <w:noProof/>
         </w:rPr>
         <w:drawing>
-          <wp:inline distT="0" distB="0" distL="0" distR="0" wp14:anchorId="0D524826" wp14:editId="28A69A65">
-            <wp:extent cx="5886450" cy="7334250"/>
+          <wp:inline distT="0" distB="0" distL="0" distR="0" wp14:anchorId="1B20AF1C" wp14:editId="4FEA8B87">
+            <wp:extent cx="5715000" cy="7334250"/>
             <wp:effectExtent l="0" t="0" r="0" b="0"/>
-            <wp:docPr id="985931403" name="02_1.png" descr="Registro con datos inválidos" title="Swagger · POST /api/v1/layaway/cliente · ERROR (400 Bad Request)"/>
+            <wp:docPr id="1784335003" name="02_1.png" descr="Registro con datos inválidos" title="Swagger · POST /api/v1/layaway/cliente · ERROR (400 Bad Request)"/>
             <wp:cNvGraphicFramePr>
               <a:graphicFrameLocks xmlns:a="http://schemas.openxmlformats.org/drawingml/2006/main" noChangeAspect="1"/>
             </wp:cNvGraphicFramePr>
@@ -21820,7 +21898,7 @@
                   <pic:spPr bwMode="auto">
                     <a:xfrm>
                       <a:off x="0" y="0"/>
-                      <a:ext cx="5886450" cy="7334250"/>
+                      <a:ext cx="5715000" cy="7334250"/>
                     </a:xfrm>
                     <a:prstGeom prst="rect">
                       <a:avLst/>
@@ -21858,10 +21936,10 @@
           <w:noProof/>
         </w:rPr>
         <w:drawing>
-          <wp:inline distT="0" distB="0" distL="0" distR="0" wp14:anchorId="1A7DDE33" wp14:editId="69C20545">
+          <wp:inline distT="0" distB="0" distL="0" distR="0" wp14:anchorId="73F7A962" wp14:editId="7F2A11A7">
             <wp:extent cx="5400675" cy="7334250"/>
             <wp:effectExtent l="0" t="0" r="0" b="0"/>
-            <wp:docPr id="1458322149" name="02_2.png" descr="Registro con datos inválidos" title="Swagger · POST /api/v1/layaway/cliente · ERROR (400 Bad Request)"/>
+            <wp:docPr id="1722697837" name="02_2.png" descr="Registro con datos inválidos" title="Swagger · POST /api/v1/layaway/cliente · ERROR (400 Bad Request)"/>
             <wp:cNvGraphicFramePr>
               <a:graphicFrameLocks xmlns:a="http://schemas.openxmlformats.org/drawingml/2006/main" noChangeAspect="1"/>
             </wp:cNvGraphicFramePr>
@@ -21922,10 +22000,10 @@
           <w:noProof/>
         </w:rPr>
         <w:drawing>
-          <wp:inline distT="0" distB="0" distL="0" distR="0" wp14:anchorId="5351117D" wp14:editId="6818D80D">
+          <wp:inline distT="0" distB="0" distL="0" distR="0" wp14:anchorId="0BF43A05" wp14:editId="33627928">
             <wp:extent cx="5943600" cy="5295900"/>
             <wp:effectExtent l="0" t="0" r="0" b="0"/>
-            <wp:docPr id="2105941375" name="03_1.png" descr="Inicio de sesión exitoso" title="Swagger · POST /api/v1/auth/login · ÉXITO (200 OK)"/>
+            <wp:docPr id="1832072425" name="03_1.png" descr="Inicio de sesión exitoso" title="Swagger · POST /api/v1/auth/login · ÉXITO (200 OK)"/>
             <wp:cNvGraphicFramePr>
               <a:graphicFrameLocks xmlns:a="http://schemas.openxmlformats.org/drawingml/2006/main" noChangeAspect="1"/>
             </wp:cNvGraphicFramePr>
@@ -21986,10 +22064,10 @@
           <w:noProof/>
         </w:rPr>
         <w:drawing>
-          <wp:inline distT="0" distB="0" distL="0" distR="0" wp14:anchorId="1C255D4A" wp14:editId="6078AF4E">
-            <wp:extent cx="5943600" cy="4810125"/>
+          <wp:inline distT="0" distB="0" distL="0" distR="0" wp14:anchorId="63CEB4DE" wp14:editId="0BFD917A">
+            <wp:extent cx="5943600" cy="4714875"/>
             <wp:effectExtent l="0" t="0" r="0" b="0"/>
-            <wp:docPr id="1713392539" name="03_2.png" descr="Inicio de sesión exitoso" title="Swagger · POST /api/v1/auth/login · ÉXITO (200 OK)"/>
+            <wp:docPr id="1995731010" name="03_2.png" descr="Inicio de sesión exitoso" title="Swagger · POST /api/v1/auth/login · ÉXITO (200 OK)"/>
             <wp:cNvGraphicFramePr>
               <a:graphicFrameLocks xmlns:a="http://schemas.openxmlformats.org/drawingml/2006/main" noChangeAspect="1"/>
             </wp:cNvGraphicFramePr>
@@ -22012,7 +22090,7 @@
                   <pic:spPr bwMode="auto">
                     <a:xfrm>
                       <a:off x="0" y="0"/>
-                      <a:ext cx="5943600" cy="4810125"/>
+                      <a:ext cx="5943600" cy="4714875"/>
                     </a:xfrm>
                     <a:prstGeom prst="rect">
                       <a:avLst/>
@@ -22050,10 +22128,10 @@
           <w:noProof/>
         </w:rPr>
         <w:drawing>
-          <wp:inline distT="0" distB="0" distL="0" distR="0" wp14:anchorId="10EA31DC" wp14:editId="03877554">
+          <wp:inline distT="0" distB="0" distL="0" distR="0" wp14:anchorId="19C2AD38" wp14:editId="5C7C0426">
             <wp:extent cx="5943600" cy="5295900"/>
             <wp:effectExtent l="0" t="0" r="0" b="0"/>
-            <wp:docPr id="1356790417" name="04_1.png" descr="Inicio de sesión con contraseña incorrecta" title="Swagger · POST /api/v1/auth/login · ERROR (401 Unauthorized)"/>
+            <wp:docPr id="1990270051" name="04_1.png" descr="Inicio de sesión con contraseña incorrecta" title="Swagger · POST /api/v1/auth/login · ERROR (401 Unauthorized)"/>
             <wp:cNvGraphicFramePr>
               <a:graphicFrameLocks xmlns:a="http://schemas.openxmlformats.org/drawingml/2006/main" noChangeAspect="1"/>
             </wp:cNvGraphicFramePr>
@@ -22114,10 +22192,10 @@
           <w:noProof/>
         </w:rPr>
         <w:drawing>
-          <wp:inline distT="0" distB="0" distL="0" distR="0" wp14:anchorId="7EACD806" wp14:editId="47E86D71">
+          <wp:inline distT="0" distB="0" distL="0" distR="0" wp14:anchorId="1CB81899" wp14:editId="5D94638C">
             <wp:extent cx="5943600" cy="4400550"/>
             <wp:effectExtent l="0" t="0" r="0" b="0"/>
-            <wp:docPr id="1189166947" name="04_2.png" descr="Inicio de sesión con contraseña incorrecta" title="Swagger · POST /api/v1/auth/login · ERROR (401 Unauthorized)"/>
+            <wp:docPr id="513533585" name="04_2.png" descr="Inicio de sesión con contraseña incorrecta" title="Swagger · POST /api/v1/auth/login · ERROR (401 Unauthorized)"/>
             <wp:cNvGraphicFramePr>
               <a:graphicFrameLocks xmlns:a="http://schemas.openxmlformats.org/drawingml/2006/main" noChangeAspect="1"/>
             </wp:cNvGraphicFramePr>
@@ -22178,10 +22256,10 @@
           <w:noProof/>
         </w:rPr>
         <w:drawing>
-          <wp:inline distT="0" distB="0" distL="0" distR="0" wp14:anchorId="3ABB6D48" wp14:editId="435C25D8">
+          <wp:inline distT="0" distB="0" distL="0" distR="0" wp14:anchorId="20BBD405" wp14:editId="60C17558">
             <wp:extent cx="5286375" cy="7334250"/>
             <wp:effectExtent l="0" t="0" r="0" b="0"/>
-            <wp:docPr id="654078171" name="05_1.png" descr="Consulta del catálogo de nacionalidades" title="Swagger · GET /api/v1/cat/nacionalidades · ÉXITO (200 OK)"/>
+            <wp:docPr id="1599094926" name="05_1.png" descr="Consulta del catálogo de nacionalidades" title="Swagger · GET /api/v1/cat/nacionalidades · ÉXITO (200 OK)"/>
             <wp:cNvGraphicFramePr>
               <a:graphicFrameLocks xmlns:a="http://schemas.openxmlformats.org/drawingml/2006/main" noChangeAspect="1"/>
             </wp:cNvGraphicFramePr>
@@ -22222,7 +22300,7 @@
         <w:pStyle w:val="Heading2"/>
         <w:pageBreakBefore/>
       </w:pPr>
-      <w:bookmarkStart w:id="28" w:name="_Toc242464692"/>
+      <w:bookmarkStart w:id="28" w:name="_Toc242466556"/>
       <w:r>
         <w:lastRenderedPageBreak/>
         <w:t>10.2 Pruebas unitarias</w:t>
@@ -22253,7 +22331,7 @@
           <w:b/>
           <w:bCs/>
         </w:rPr>
-        <w:t>124 de 124 pruebas exitosas</w:t>
+        <w:t>180 de 180 pruebas exitosas</w:t>
       </w:r>
       <w:r>
         <w:t>.</w:t>
@@ -22527,7 +22605,7 @@
                 <w:sz w:val="19"/>
                 <w:szCs w:val="19"/>
               </w:rPr>
-              <w:t>38</w:t>
+              <w:t>37</w:t>
             </w:r>
           </w:p>
         </w:tc>
@@ -22553,7 +22631,23 @@
                 <w:sz w:val="19"/>
                 <w:szCs w:val="19"/>
               </w:rPr>
-              <w:t>Filtros de la consulta (bandera 4): comillas, valores en blanco, comodines, longitud y campos no permitidos</w:t>
+              <w:t xml:space="preserve">Llaves de la consulta (bandera 4): comillas, valores en blanco, comodines, longitud y campos no permitidos (incluido </w:t>
+            </w:r>
+            <w:r>
+              <w:rPr>
+                <w:rFonts w:ascii="Consolas" w:eastAsia="Consolas" w:hAnsi="Consolas" w:cs="Consolas"/>
+                <w:color w:val="7C2D12"/>
+                <w:sz w:val="19"/>
+                <w:szCs w:val="19"/>
+              </w:rPr>
+              <w:t>clienteId</w:t>
+            </w:r>
+            <w:r>
+              <w:rPr>
+                <w:sz w:val="19"/>
+                <w:szCs w:val="19"/>
+              </w:rPr>
+              <w:t>)</w:t>
             </w:r>
           </w:p>
         </w:tc>
@@ -22589,7 +22683,7 @@
                 <w:sz w:val="19"/>
                 <w:szCs w:val="19"/>
               </w:rPr>
-              <w:t>ClienteLayawayServiceTest</w:t>
+              <w:t>LoginCredencialesDtoPasswordTest</w:t>
             </w:r>
           </w:p>
         </w:tc>
@@ -22615,7 +22709,7 @@
                 <w:sz w:val="19"/>
                 <w:szCs w:val="19"/>
               </w:rPr>
-              <w:t>15</w:t>
+              <w:t>52</w:t>
             </w:r>
           </w:p>
         </w:tc>
@@ -22641,7 +22735,7 @@
                 <w:sz w:val="19"/>
                 <w:szCs w:val="19"/>
               </w:rPr>
-              <w:t>Alta, baja lógica, consulta (todos los clientes, filtros, tope, secciones no permitidas), IDs inválidos, sin contraseña por defecto, nacionalidad fuera de catálogo, CURP inmutable, número de cuenta de 12 dígitos</w:t>
+              <w:t>Política de contraseña: 8 a 72 caracteres, 1 mayúscula, 1 minúscula, 1 número, 1 carácter especial, sin espacios</w:t>
             </w:r>
           </w:p>
         </w:tc>
@@ -22677,7 +22771,7 @@
                 <w:sz w:val="19"/>
                 <w:szCs w:val="19"/>
               </w:rPr>
-              <w:t>AuthServiceTest</w:t>
+              <w:t>ClienteLayawayServiceTest</w:t>
             </w:r>
           </w:p>
         </w:tc>
@@ -22703,7 +22797,7 @@
                 <w:sz w:val="19"/>
                 <w:szCs w:val="19"/>
               </w:rPr>
-              <w:t>6</w:t>
+              <w:t>20</w:t>
             </w:r>
           </w:p>
         </w:tc>
@@ -22729,7 +22823,7 @@
                 <w:sz w:val="19"/>
                 <w:szCs w:val="19"/>
               </w:rPr>
-              <w:t>Login por contraseña y Face ID, 401 uniforme, intentos fallidos, bloqueo, cliente inactivo</w:t>
+              <w:t>Alta, baja lógica y actualización por llaves (sin ID, llave incompleta, inexistente), cambio de contraseña, consulta (todos los clientes, filtros, tope, secciones no permitidas), CURP inmutable, sin contraseña por defecto, nacionalidad fuera de catálogo, número de cuenta de 12 dígitos</w:t>
             </w:r>
           </w:p>
         </w:tc>
@@ -22765,7 +22859,7 @@
                 <w:sz w:val="19"/>
                 <w:szCs w:val="19"/>
               </w:rPr>
-              <w:t>PasswordEncoderUtilTest</w:t>
+              <w:t>AuthServiceTest</w:t>
             </w:r>
           </w:p>
         </w:tc>
@@ -22791,7 +22885,7 @@
                 <w:sz w:val="19"/>
                 <w:szCs w:val="19"/>
               </w:rPr>
-              <w:t>3</w:t>
+              <w:t>6</w:t>
             </w:r>
           </w:p>
         </w:tc>
@@ -22817,7 +22911,7 @@
                 <w:sz w:val="19"/>
                 <w:szCs w:val="19"/>
               </w:rPr>
-              <w:t>Sal aleatoria, compatibilidad con hashes antiguos, hashes malformados</w:t>
+              <w:t>Login por contraseña y Face ID, 401 uniforme, intentos fallidos, bloqueo, cliente inactivo</w:t>
             </w:r>
           </w:p>
         </w:tc>
@@ -22853,6 +22947,94 @@
                 <w:sz w:val="19"/>
                 <w:szCs w:val="19"/>
               </w:rPr>
+              <w:t>PasswordEncoderUtilTest</w:t>
+            </w:r>
+          </w:p>
+        </w:tc>
+        <w:tc>
+          <w:tcPr>
+            <w:tcW w:w="1000" w:type="dxa"/>
+            <w:tcBorders>
+              <w:top w:val="single" w:sz="4" w:space="0" w:color="BFC7D5"/>
+              <w:left w:val="single" w:sz="4" w:space="0" w:color="BFC7D5"/>
+              <w:bottom w:val="single" w:sz="4" w:space="0" w:color="BFC7D5"/>
+              <w:right w:val="single" w:sz="4" w:space="0" w:color="BFC7D5"/>
+            </w:tcBorders>
+            <w:tcMar>
+              <w:top w:w="60" w:type="dxa"/>
+              <w:left w:w="100" w:type="dxa"/>
+              <w:bottom w:w="60" w:type="dxa"/>
+              <w:right w:w="100" w:type="dxa"/>
+            </w:tcMar>
+          </w:tcPr>
+          <w:p>
+            <w:r>
+              <w:rPr>
+                <w:sz w:val="19"/>
+                <w:szCs w:val="19"/>
+              </w:rPr>
+              <w:t>3</w:t>
+            </w:r>
+          </w:p>
+        </w:tc>
+        <w:tc>
+          <w:tcPr>
+            <w:tcW w:w="5160" w:type="dxa"/>
+            <w:tcBorders>
+              <w:top w:val="single" w:sz="4" w:space="0" w:color="BFC7D5"/>
+              <w:left w:val="single" w:sz="4" w:space="0" w:color="BFC7D5"/>
+              <w:bottom w:val="single" w:sz="4" w:space="0" w:color="BFC7D5"/>
+              <w:right w:val="single" w:sz="4" w:space="0" w:color="BFC7D5"/>
+            </w:tcBorders>
+            <w:tcMar>
+              <w:top w:w="60" w:type="dxa"/>
+              <w:left w:w="100" w:type="dxa"/>
+              <w:bottom w:w="60" w:type="dxa"/>
+              <w:right w:w="100" w:type="dxa"/>
+            </w:tcMar>
+          </w:tcPr>
+          <w:p>
+            <w:r>
+              <w:rPr>
+                <w:sz w:val="19"/>
+                <w:szCs w:val="19"/>
+              </w:rPr>
+              <w:t>Sal aleatoria, compatibilidad con hashes antiguos, hashes malformados</w:t>
+            </w:r>
+          </w:p>
+        </w:tc>
+      </w:tr>
+      <w:tr>
+        <w:tblPrEx>
+          <w:tblCellMar>
+            <w:top w:w="0" w:type="dxa"/>
+            <w:bottom w:w="0" w:type="dxa"/>
+          </w:tblCellMar>
+        </w:tblPrEx>
+        <w:tc>
+          <w:tcPr>
+            <w:tcW w:w="3200" w:type="dxa"/>
+            <w:tcBorders>
+              <w:top w:val="single" w:sz="4" w:space="0" w:color="BFC7D5"/>
+              <w:left w:val="single" w:sz="4" w:space="0" w:color="BFC7D5"/>
+              <w:bottom w:val="single" w:sz="4" w:space="0" w:color="BFC7D5"/>
+              <w:right w:val="single" w:sz="4" w:space="0" w:color="BFC7D5"/>
+            </w:tcBorders>
+            <w:tcMar>
+              <w:top w:w="60" w:type="dxa"/>
+              <w:left w:w="100" w:type="dxa"/>
+              <w:bottom w:w="60" w:type="dxa"/>
+              <w:right w:w="100" w:type="dxa"/>
+            </w:tcMar>
+          </w:tcPr>
+          <w:p>
+            <w:r>
+              <w:rPr>
+                <w:rFonts w:ascii="Consolas" w:eastAsia="Consolas" w:hAnsi="Consolas" w:cs="Consolas"/>
+                <w:color w:val="7C2D12"/>
+                <w:sz w:val="19"/>
+                <w:szCs w:val="19"/>
+              </w:rPr>
               <w:t>ProductosServiceImplTest</w:t>
             </w:r>
           </w:p>
@@ -22915,7 +23097,7 @@
       <w:pPr>
         <w:pStyle w:val="Heading2"/>
       </w:pPr>
-      <w:bookmarkStart w:id="29" w:name="_Toc242464693"/>
+      <w:bookmarkStart w:id="29" w:name="_Toc242466557"/>
       <w:r>
         <w:t>10.3 Pruebas de seguridad, validación, concurrencia y carga</w:t>
       </w:r>
@@ -22945,7 +23127,7 @@
           <w:b/>
           <w:bCs/>
         </w:rPr>
-        <w:t>139 casos</w:t>
+        <w:t>177 casos</w:t>
       </w:r>
       <w:r>
         <w:t xml:space="preserve"> contra la API en ejecución, con una base de datos de pruebas. Resultado: </w:t>
@@ -22955,7 +23137,7 @@
           <w:b/>
           <w:bCs/>
         </w:rPr>
-        <w:t>139 de 139 exitosos</w:t>
+        <w:t>177 de 177 exitosos</w:t>
       </w:r>
       <w:r>
         <w:t xml:space="preserve">. La salida completa está en </w:t>
@@ -23151,7 +23333,7 @@
                 <w:sz w:val="19"/>
                 <w:szCs w:val="19"/>
               </w:rPr>
-              <w:t>84</w:t>
+              <w:t>85</w:t>
             </w:r>
           </w:p>
         </w:tc>
@@ -23220,7 +23402,7 @@
                 <w:sz w:val="19"/>
                 <w:szCs w:val="19"/>
               </w:rPr>
-              <w:t>Unicidad</w:t>
+              <w:t>Unicidad y contraseñas</w:t>
             </w:r>
           </w:p>
         </w:tc>
@@ -23246,7 +23428,7 @@
                 <w:sz w:val="19"/>
                 <w:szCs w:val="19"/>
               </w:rPr>
-              <w:t>10</w:t>
+              <w:t>21</w:t>
             </w:r>
           </w:p>
         </w:tc>
@@ -23272,7 +23454,7 @@
                 <w:sz w:val="19"/>
                 <w:szCs w:val="19"/>
               </w:rPr>
-              <w:t>CURP, RFC, correo (también en mayúsculas) y usuario duplicados</w:t>
+              <w:t>CURP, RFC, correo y usuario duplicados; contraseñas que incumplen la política y válidas en el límite (8 y 72 caracteres)</w:t>
             </w:r>
           </w:p>
         </w:tc>
@@ -23392,7 +23574,7 @@
                 <w:sz w:val="19"/>
                 <w:szCs w:val="19"/>
               </w:rPr>
-              <w:t>Actualización y baja</w:t>
+              <w:t>Actualizar por llaves</w:t>
             </w:r>
           </w:p>
         </w:tc>
@@ -23418,7 +23600,7 @@
                 <w:sz w:val="19"/>
                 <w:szCs w:val="19"/>
               </w:rPr>
-              <w:t>12</w:t>
+              <w:t>20</w:t>
             </w:r>
           </w:p>
         </w:tc>
@@ -23444,7 +23626,23 @@
                 <w:sz w:val="19"/>
                 <w:szCs w:val="19"/>
               </w:rPr>
-              <w:t>Cambiar CURP/RFC, robar el correo de otro cliente, actualizar un cliente dado de baja</w:t>
+              <w:t xml:space="preserve">Por CURP, RFC y número de cuenta; cambiar CURP/RFC; sin llaves, llave incompleta o inexistente, </w:t>
+            </w:r>
+            <w:r>
+              <w:rPr>
+                <w:rFonts w:ascii="Consolas" w:eastAsia="Consolas" w:hAnsi="Consolas" w:cs="Consolas"/>
+                <w:color w:val="7C2D12"/>
+                <w:sz w:val="19"/>
+                <w:szCs w:val="19"/>
+              </w:rPr>
+              <w:t>clienteId</w:t>
+            </w:r>
+            <w:r>
+              <w:rPr>
+                <w:sz w:val="19"/>
+                <w:szCs w:val="19"/>
+              </w:rPr>
+              <w:t xml:space="preserve"> rechazado; robar el correo de otro cliente</w:t>
             </w:r>
           </w:p>
         </w:tc>
@@ -23478,7 +23676,7 @@
                 <w:sz w:val="19"/>
                 <w:szCs w:val="19"/>
               </w:rPr>
-              <w:t>Login</w:t>
+              <w:t>Editar contraseña</w:t>
             </w:r>
           </w:p>
         </w:tc>
@@ -23504,7 +23702,7 @@
                 <w:sz w:val="19"/>
                 <w:szCs w:val="19"/>
               </w:rPr>
-              <w:t>15</w:t>
+              <w:t>10</w:t>
             </w:r>
           </w:p>
         </w:tc>
@@ -23530,7 +23728,7 @@
                 <w:sz w:val="19"/>
                 <w:szCs w:val="19"/>
               </w:rPr>
-              <w:t>Contraseña por defecto, fuerza bruta, enumeración por código y por tiempo de respuesta</w:t>
+              <w:t>Política al editar, usuario distinto rechazado, la contraseña nueva funciona y la vieja no</w:t>
             </w:r>
           </w:p>
         </w:tc>
@@ -23564,6 +23762,179 @@
                 <w:sz w:val="19"/>
                 <w:szCs w:val="19"/>
               </w:rPr>
+              <w:t>Baja lógica por llaves</w:t>
+            </w:r>
+          </w:p>
+        </w:tc>
+        <w:tc>
+          <w:tcPr>
+            <w:tcW w:w="900" w:type="dxa"/>
+            <w:tcBorders>
+              <w:top w:val="single" w:sz="4" w:space="0" w:color="BFC7D5"/>
+              <w:left w:val="single" w:sz="4" w:space="0" w:color="BFC7D5"/>
+              <w:bottom w:val="single" w:sz="4" w:space="0" w:color="BFC7D5"/>
+              <w:right w:val="single" w:sz="4" w:space="0" w:color="BFC7D5"/>
+            </w:tcBorders>
+            <w:tcMar>
+              <w:top w:w="60" w:type="dxa"/>
+              <w:left w:w="100" w:type="dxa"/>
+              <w:bottom w:w="60" w:type="dxa"/>
+              <w:right w:w="100" w:type="dxa"/>
+            </w:tcMar>
+          </w:tcPr>
+          <w:p>
+            <w:r>
+              <w:rPr>
+                <w:sz w:val="19"/>
+                <w:szCs w:val="19"/>
+              </w:rPr>
+              <w:t>8</w:t>
+            </w:r>
+          </w:p>
+        </w:tc>
+        <w:tc>
+          <w:tcPr>
+            <w:tcW w:w="6160" w:type="dxa"/>
+            <w:tcBorders>
+              <w:top w:val="single" w:sz="4" w:space="0" w:color="BFC7D5"/>
+              <w:left w:val="single" w:sz="4" w:space="0" w:color="BFC7D5"/>
+              <w:bottom w:val="single" w:sz="4" w:space="0" w:color="BFC7D5"/>
+              <w:right w:val="single" w:sz="4" w:space="0" w:color="BFC7D5"/>
+            </w:tcBorders>
+            <w:tcMar>
+              <w:top w:w="60" w:type="dxa"/>
+              <w:left w:w="100" w:type="dxa"/>
+              <w:bottom w:w="60" w:type="dxa"/>
+              <w:right w:w="100" w:type="dxa"/>
+            </w:tcMar>
+          </w:tcPr>
+          <w:p>
+            <w:r>
+              <w:rPr>
+                <w:sz w:val="19"/>
+                <w:szCs w:val="19"/>
+              </w:rPr>
+              <w:t>Sin llaves, llave incompleta o inexistente, baja por CURP, baja repetida, actualizar un cliente dado de baja; la respuesta no trae el ID</w:t>
+            </w:r>
+          </w:p>
+        </w:tc>
+      </w:tr>
+      <w:tr>
+        <w:tblPrEx>
+          <w:tblCellMar>
+            <w:top w:w="0" w:type="dxa"/>
+            <w:bottom w:w="0" w:type="dxa"/>
+          </w:tblCellMar>
+        </w:tblPrEx>
+        <w:tc>
+          <w:tcPr>
+            <w:tcW w:w="2300" w:type="dxa"/>
+            <w:tcBorders>
+              <w:top w:val="single" w:sz="4" w:space="0" w:color="BFC7D5"/>
+              <w:left w:val="single" w:sz="4" w:space="0" w:color="BFC7D5"/>
+              <w:bottom w:val="single" w:sz="4" w:space="0" w:color="BFC7D5"/>
+              <w:right w:val="single" w:sz="4" w:space="0" w:color="BFC7D5"/>
+            </w:tcBorders>
+            <w:tcMar>
+              <w:top w:w="60" w:type="dxa"/>
+              <w:left w:w="100" w:type="dxa"/>
+              <w:bottom w:w="60" w:type="dxa"/>
+              <w:right w:w="100" w:type="dxa"/>
+            </w:tcMar>
+          </w:tcPr>
+          <w:p>
+            <w:r>
+              <w:rPr>
+                <w:sz w:val="19"/>
+                <w:szCs w:val="19"/>
+              </w:rPr>
+              <w:t>Login</w:t>
+            </w:r>
+          </w:p>
+        </w:tc>
+        <w:tc>
+          <w:tcPr>
+            <w:tcW w:w="900" w:type="dxa"/>
+            <w:tcBorders>
+              <w:top w:val="single" w:sz="4" w:space="0" w:color="BFC7D5"/>
+              <w:left w:val="single" w:sz="4" w:space="0" w:color="BFC7D5"/>
+              <w:bottom w:val="single" w:sz="4" w:space="0" w:color="BFC7D5"/>
+              <w:right w:val="single" w:sz="4" w:space="0" w:color="BFC7D5"/>
+            </w:tcBorders>
+            <w:tcMar>
+              <w:top w:w="60" w:type="dxa"/>
+              <w:left w:w="100" w:type="dxa"/>
+              <w:bottom w:w="60" w:type="dxa"/>
+              <w:right w:w="100" w:type="dxa"/>
+            </w:tcMar>
+          </w:tcPr>
+          <w:p>
+            <w:r>
+              <w:rPr>
+                <w:sz w:val="19"/>
+                <w:szCs w:val="19"/>
+              </w:rPr>
+              <w:t>15</w:t>
+            </w:r>
+          </w:p>
+        </w:tc>
+        <w:tc>
+          <w:tcPr>
+            <w:tcW w:w="6160" w:type="dxa"/>
+            <w:tcBorders>
+              <w:top w:val="single" w:sz="4" w:space="0" w:color="BFC7D5"/>
+              <w:left w:val="single" w:sz="4" w:space="0" w:color="BFC7D5"/>
+              <w:bottom w:val="single" w:sz="4" w:space="0" w:color="BFC7D5"/>
+              <w:right w:val="single" w:sz="4" w:space="0" w:color="BFC7D5"/>
+            </w:tcBorders>
+            <w:tcMar>
+              <w:top w:w="60" w:type="dxa"/>
+              <w:left w:w="100" w:type="dxa"/>
+              <w:bottom w:w="60" w:type="dxa"/>
+              <w:right w:w="100" w:type="dxa"/>
+            </w:tcMar>
+          </w:tcPr>
+          <w:p>
+            <w:r>
+              <w:rPr>
+                <w:sz w:val="19"/>
+                <w:szCs w:val="19"/>
+              </w:rPr>
+              <w:t>Contraseña por defecto, fuerza bruta, enumeración por código y por tiempo de respuesta</w:t>
+            </w:r>
+          </w:p>
+        </w:tc>
+      </w:tr>
+      <w:tr>
+        <w:tblPrEx>
+          <w:tblCellMar>
+            <w:top w:w="0" w:type="dxa"/>
+            <w:bottom w:w="0" w:type="dxa"/>
+          </w:tblCellMar>
+        </w:tblPrEx>
+        <w:tc>
+          <w:tcPr>
+            <w:tcW w:w="2300" w:type="dxa"/>
+            <w:tcBorders>
+              <w:top w:val="single" w:sz="4" w:space="0" w:color="BFC7D5"/>
+              <w:left w:val="single" w:sz="4" w:space="0" w:color="BFC7D5"/>
+              <w:bottom w:val="single" w:sz="4" w:space="0" w:color="BFC7D5"/>
+              <w:right w:val="single" w:sz="4" w:space="0" w:color="BFC7D5"/>
+            </w:tcBorders>
+            <w:tcMar>
+              <w:top w:w="60" w:type="dxa"/>
+              <w:left w:w="100" w:type="dxa"/>
+              <w:bottom w:w="60" w:type="dxa"/>
+              <w:right w:w="100" w:type="dxa"/>
+            </w:tcMar>
+          </w:tcPr>
+          <w:p>
+            <w:r>
+              <w:rPr>
+                <w:sz w:val="19"/>
+                <w:szCs w:val="19"/>
+              </w:rPr>
+              <w:lastRenderedPageBreak/>
               <w:t>Concurrencia y carga</w:t>
             </w:r>
           </w:p>
@@ -23626,7 +23997,7 @@
       <w:pPr>
         <w:pStyle w:val="Heading2"/>
       </w:pPr>
-      <w:bookmarkStart w:id="30" w:name="_Toc242464694"/>
+      <w:bookmarkStart w:id="30" w:name="_Toc242466558"/>
       <w:r>
         <w:t>10.4 Resultados de carga</w:t>
       </w:r>
@@ -23839,7 +24210,7 @@
                 <w:sz w:val="19"/>
                 <w:szCs w:val="19"/>
               </w:rPr>
-              <w:t>600 de 600 exitosas (201) en 3.5 s · 170 altas por segundo · 0 errores</w:t>
+              <w:t>600 de 600 exitosas (201) en 4.5 s · 134 altas por segundo · 0 errores</w:t>
             </w:r>
           </w:p>
         </w:tc>
@@ -23933,7 +24304,6 @@
                 <w:sz w:val="19"/>
                 <w:szCs w:val="19"/>
               </w:rPr>
-              <w:lastRenderedPageBreak/>
               <w:t>Tiempo de respuesta: usuario inexistente vs. contraseña incorrecta</w:t>
             </w:r>
           </w:p>
@@ -23960,7 +24330,7 @@
                 <w:sz w:val="19"/>
                 <w:szCs w:val="19"/>
               </w:rPr>
-              <w:t>67 ms vs. 68 ms (no permite deducir qué usuarios existen)</w:t>
+              <w:t>51 ms vs. 51 ms (no permite deducir qué usuarios existen)</w:t>
             </w:r>
           </w:p>
         </w:tc>
@@ -23970,7 +24340,7 @@
       <w:pPr>
         <w:pStyle w:val="Heading2"/>
       </w:pPr>
-      <w:bookmarkStart w:id="31" w:name="_Toc242464695"/>
+      <w:bookmarkStart w:id="31" w:name="_Toc242466559"/>
       <w:r>
         <w:t>10.5 Reglas en la base de datos</w:t>
       </w:r>
@@ -24677,7 +25047,7 @@
         <w:pStyle w:val="Heading1"/>
         <w:pageBreakBefore/>
       </w:pPr>
-      <w:bookmarkStart w:id="32" w:name="_Toc242464696"/>
+      <w:bookmarkStart w:id="32" w:name="_Toc242466560"/>
       <w:r>
         <w:lastRenderedPageBreak/>
         <w:t>11. Instalación y ejecución</w:t>
@@ -24877,7 +25247,7 @@
       <w:pPr>
         <w:pStyle w:val="Heading1"/>
       </w:pPr>
-      <w:bookmarkStart w:id="33" w:name="_Toc242464697"/>
+      <w:bookmarkStart w:id="33" w:name="_Toc242466561"/>
       <w:r>
         <w:t>12. Conclusiones</w:t>
       </w:r>
@@ -24903,7 +25273,7 @@
       <w:pPr>
         <w:pStyle w:val="Heading2"/>
       </w:pPr>
-      <w:bookmarkStart w:id="34" w:name="_Toc242464698"/>
+      <w:bookmarkStart w:id="34" w:name="_Toc242466562"/>
       <w:r>
         <w:t>Mejoras futuras</w:t>
       </w:r>
@@ -25415,68 +25785,10 @@
 <file path=word/numbering.xml><?xml version="1.0" encoding="utf-8"?>
 <w:numbering xmlns:wpc="http://schemas.microsoft.com/office/word/2010/wordprocessingCanvas" xmlns:cx="http://schemas.microsoft.com/office/drawing/2014/chartex" xmlns:cx1="http://schemas.microsoft.com/office/drawing/2015/9/8/chartex" xmlns:cx2="http://schemas.microsoft.com/office/drawing/2015/10/21/chartex" xmlns:cx3="http://schemas.microsoft.com/office/drawing/2016/5/9/chartex" xmlns:cx4="http://schemas.microsoft.com/office/drawing/2016/5/10/chartex" xmlns:cx5="http://schemas.microsoft.com/office/drawing/2016/5/11/chartex" xmlns:cx6="http://schemas.microsoft.com/office/drawing/2016/5/12/chartex" xmlns:cx7="http://schemas.microsoft.com/office/drawing/2016/5/13/chartex" xmlns:cx8="http://schemas.microsoft.com/office/drawing/2016/5/14/chartex" xmlns:mc="http://schemas.openxmlformats.org/markup-compatibility/2006" xmlns:aink="http://schemas.microsoft.com/office/drawing/2016/ink" xmlns:am3d="http://schemas.microsoft.com/office/drawing/2017/model3d" xmlns:o="urn:schemas-microsoft-com:office:office" xmlns:oel="http://schemas.microsoft.com/office/2019/extlst" xmlns:r="http://schemas.openxmlformats.org/officeDocument/2006/relationships" xmlns:m="http://schemas.openxmlformats.org/officeDocument/2006/math" xmlns:v="urn:schemas-microsoft-com:vml" xmlns:wp14="http://schemas.microsoft.com/office/word/2010/wordprocessingDrawing" xmlns:wp="http://schemas.openxmlformats.org/drawingml/2006/wordprocessingDrawing" xmlns:w10="urn:schemas-microsoft-com:office:word" xmlns:w="http://schemas.openxmlformats.org/wordprocessingml/2006/main" xmlns:w14="http://schemas.microsoft.com/office/word/2010/wordml" xmlns:w15="http://schemas.microsoft.com/office/word/2012/wordml" xmlns:w16cex="http://schemas.microsoft.com/office/word/2018/wordml/cex" xmlns:w16cid="http://schemas.microsoft.com/office/word/2016/wordml/cid" xmlns:w16="http://schemas.microsoft.com/office/word/2018/wordml" xmlns:w16du="http://schemas.microsoft.com/office/word/2023/wordml/word16du" xmlns:w16sdtdh="http://schemas.microsoft.com/office/word/2020/wordml/sdtdatahash" xmlns:w16sdtfl="http://schemas.microsoft.com/office/word/2024/wordml/sdtformatlock" xmlns:w16se="http://schemas.microsoft.com/office/word/2015/wordml/symex" xmlns:wpg="http://schemas.microsoft.com/office/word/2010/wordprocessingGroup" xmlns:wpi="http://schemas.microsoft.com/office/word/2010/wordprocessingInk" xmlns:wne="http://schemas.microsoft.com/office/word/2006/wordml" xmlns:wps="http://schemas.microsoft.com/office/word/2010/wordprocessingShape" mc:Ignorable="w14 w15 w16se w16cid w16 w16cex w16sdtdh w16sdtfl w16du wp14">
   <w:abstractNum w:abstractNumId="0" w15:restartNumberingAfterBreak="0">
-    <w:nsid w:val="0BEC181E"/>
+    <w:nsid w:val="03575D4B"/>
     <w:multiLevelType w:val="hybridMultilevel"/>
-    <w:tmpl w:val="BD5E5CF0"/>
-    <w:lvl w:ilvl="0" w:tplc="E8BAD3E2">
-      <w:start w:val="1"/>
-      <w:numFmt w:val="bullet"/>
-      <w:lvlText w:val="•"/>
-      <w:lvlJc w:val="left"/>
-      <w:pPr>
-        <w:ind w:left="720" w:hanging="360"/>
-      </w:pPr>
-    </w:lvl>
-    <w:lvl w:ilvl="1" w:tplc="1DA6B1AC">
-      <w:start w:val="1"/>
-      <w:numFmt w:val="bullet"/>
-      <w:lvlText w:val="◦"/>
-      <w:lvlJc w:val="left"/>
-      <w:pPr>
-        <w:ind w:left="1440" w:hanging="360"/>
-      </w:pPr>
-    </w:lvl>
-    <w:lvl w:ilvl="2" w:tplc="914EF320">
-      <w:numFmt w:val="decimal"/>
-      <w:lvlText w:val=""/>
-      <w:lvlJc w:val="left"/>
-    </w:lvl>
-    <w:lvl w:ilvl="3" w:tplc="C16A97FA">
-      <w:numFmt w:val="decimal"/>
-      <w:lvlText w:val=""/>
-      <w:lvlJc w:val="left"/>
-    </w:lvl>
-    <w:lvl w:ilvl="4" w:tplc="BF827C4C">
-      <w:numFmt w:val="decimal"/>
-      <w:lvlText w:val=""/>
-      <w:lvlJc w:val="left"/>
-    </w:lvl>
-    <w:lvl w:ilvl="5" w:tplc="145C5CB0">
-      <w:numFmt w:val="decimal"/>
-      <w:lvlText w:val=""/>
-      <w:lvlJc w:val="left"/>
-    </w:lvl>
-    <w:lvl w:ilvl="6" w:tplc="5A444E4A">
-      <w:numFmt w:val="decimal"/>
-      <w:lvlText w:val=""/>
-      <w:lvlJc w:val="left"/>
-    </w:lvl>
-    <w:lvl w:ilvl="7" w:tplc="E5B022F8">
-      <w:numFmt w:val="decimal"/>
-      <w:lvlText w:val=""/>
-      <w:lvlJc w:val="left"/>
-    </w:lvl>
-    <w:lvl w:ilvl="8" w:tplc="FD12370C">
-      <w:numFmt w:val="decimal"/>
-      <w:lvlText w:val=""/>
-      <w:lvlJc w:val="left"/>
-    </w:lvl>
-  </w:abstractNum>
-  <w:abstractNum w:abstractNumId="1" w15:restartNumberingAfterBreak="0">
-    <w:nsid w:val="1F291484"/>
-    <w:multiLevelType w:val="hybridMultilevel"/>
-    <w:tmpl w:val="7BC6E210"/>
-    <w:lvl w:ilvl="0" w:tplc="2BA00446">
+    <w:tmpl w:val="BE86C618"/>
+    <w:lvl w:ilvl="0" w:tplc="2714944A">
       <w:start w:val="1"/>
       <w:numFmt w:val="decimal"/>
       <w:lvlText w:val="%1."/>
@@ -25485,52 +25797,52 @@
         <w:ind w:left="720" w:hanging="360"/>
       </w:pPr>
     </w:lvl>
-    <w:lvl w:ilvl="1" w:tplc="38A47F40">
+    <w:lvl w:ilvl="1" w:tplc="4EEE839E">
       <w:numFmt w:val="decimal"/>
       <w:lvlText w:val=""/>
       <w:lvlJc w:val="left"/>
     </w:lvl>
-    <w:lvl w:ilvl="2" w:tplc="264C8D8C">
+    <w:lvl w:ilvl="2" w:tplc="BAC0E80A">
       <w:numFmt w:val="decimal"/>
       <w:lvlText w:val=""/>
       <w:lvlJc w:val="left"/>
     </w:lvl>
-    <w:lvl w:ilvl="3" w:tplc="CAEC6D9C">
+    <w:lvl w:ilvl="3" w:tplc="53EC0A2A">
       <w:numFmt w:val="decimal"/>
       <w:lvlText w:val=""/>
       <w:lvlJc w:val="left"/>
     </w:lvl>
-    <w:lvl w:ilvl="4" w:tplc="704207AE">
+    <w:lvl w:ilvl="4" w:tplc="4B7A069A">
       <w:numFmt w:val="decimal"/>
       <w:lvlText w:val=""/>
       <w:lvlJc w:val="left"/>
     </w:lvl>
-    <w:lvl w:ilvl="5" w:tplc="166C78A2">
+    <w:lvl w:ilvl="5" w:tplc="A68245DE">
       <w:numFmt w:val="decimal"/>
       <w:lvlText w:val=""/>
       <w:lvlJc w:val="left"/>
     </w:lvl>
-    <w:lvl w:ilvl="6" w:tplc="3C2E36C2">
+    <w:lvl w:ilvl="6" w:tplc="D1509CE8">
       <w:numFmt w:val="decimal"/>
       <w:lvlText w:val=""/>
       <w:lvlJc w:val="left"/>
     </w:lvl>
-    <w:lvl w:ilvl="7" w:tplc="3A58B118">
+    <w:lvl w:ilvl="7" w:tplc="09AECAAC">
       <w:numFmt w:val="decimal"/>
       <w:lvlText w:val=""/>
       <w:lvlJc w:val="left"/>
     </w:lvl>
-    <w:lvl w:ilvl="8" w:tplc="8BB05C80">
+    <w:lvl w:ilvl="8" w:tplc="C67E6E40">
       <w:numFmt w:val="decimal"/>
       <w:lvlText w:val=""/>
       <w:lvlJc w:val="left"/>
     </w:lvl>
   </w:abstractNum>
-  <w:abstractNum w:abstractNumId="2" w15:restartNumberingAfterBreak="0">
-    <w:nsid w:val="4007089E"/>
+  <w:abstractNum w:abstractNumId="1" w15:restartNumberingAfterBreak="0">
+    <w:nsid w:val="18536226"/>
     <w:multiLevelType w:val="hybridMultilevel"/>
-    <w:tmpl w:val="BBBA4D8C"/>
-    <w:lvl w:ilvl="0" w:tplc="5EF8B326">
+    <w:tmpl w:val="D736E2BE"/>
+    <w:lvl w:ilvl="0" w:tplc="271A5DD4">
       <w:start w:val="1"/>
       <w:numFmt w:val="bullet"/>
       <w:lvlText w:val="●"/>
@@ -25539,7 +25851,7 @@
         <w:ind w:left="720" w:hanging="360"/>
       </w:pPr>
     </w:lvl>
-    <w:lvl w:ilvl="1" w:tplc="69869468">
+    <w:lvl w:ilvl="1" w:tplc="17DE1044">
       <w:start w:val="1"/>
       <w:numFmt w:val="bullet"/>
       <w:lvlText w:val="○"/>
@@ -25548,7 +25860,7 @@
         <w:ind w:left="1440" w:hanging="360"/>
       </w:pPr>
     </w:lvl>
-    <w:lvl w:ilvl="2" w:tplc="D6423CDA">
+    <w:lvl w:ilvl="2" w:tplc="707823BA">
       <w:start w:val="1"/>
       <w:numFmt w:val="bullet"/>
       <w:lvlText w:val="■"/>
@@ -25557,7 +25869,7 @@
         <w:ind w:left="2160" w:hanging="360"/>
       </w:pPr>
     </w:lvl>
-    <w:lvl w:ilvl="3" w:tplc="F68E69BA">
+    <w:lvl w:ilvl="3" w:tplc="EDBAB570">
       <w:start w:val="1"/>
       <w:numFmt w:val="bullet"/>
       <w:lvlText w:val="●"/>
@@ -25566,7 +25878,7 @@
         <w:ind w:left="2880" w:hanging="360"/>
       </w:pPr>
     </w:lvl>
-    <w:lvl w:ilvl="4" w:tplc="74F07FD8">
+    <w:lvl w:ilvl="4" w:tplc="34667BC2">
       <w:start w:val="1"/>
       <w:numFmt w:val="bullet"/>
       <w:lvlText w:val="○"/>
@@ -25575,7 +25887,7 @@
         <w:ind w:left="3600" w:hanging="360"/>
       </w:pPr>
     </w:lvl>
-    <w:lvl w:ilvl="5" w:tplc="E5047458">
+    <w:lvl w:ilvl="5" w:tplc="4C385704">
       <w:start w:val="1"/>
       <w:numFmt w:val="bullet"/>
       <w:lvlText w:val="■"/>
@@ -25584,7 +25896,7 @@
         <w:ind w:left="4320" w:hanging="360"/>
       </w:pPr>
     </w:lvl>
-    <w:lvl w:ilvl="6" w:tplc="E1C6150A">
+    <w:lvl w:ilvl="6" w:tplc="8CD6609C">
       <w:start w:val="1"/>
       <w:numFmt w:val="bullet"/>
       <w:lvlText w:val="●"/>
@@ -25593,7 +25905,7 @@
         <w:ind w:left="5040" w:hanging="360"/>
       </w:pPr>
     </w:lvl>
-    <w:lvl w:ilvl="7" w:tplc="9E70D542">
+    <w:lvl w:ilvl="7" w:tplc="DCAE7AA6">
       <w:start w:val="1"/>
       <w:numFmt w:val="bullet"/>
       <w:lvlText w:val="●"/>
@@ -25602,7 +25914,7 @@
         <w:ind w:left="5760" w:hanging="360"/>
       </w:pPr>
     </w:lvl>
-    <w:lvl w:ilvl="8" w:tplc="E64CB942">
+    <w:lvl w:ilvl="8" w:tplc="9BD01A0A">
       <w:start w:val="1"/>
       <w:numFmt w:val="bullet"/>
       <w:lvlText w:val="●"/>
@@ -25612,11 +25924,69 @@
       </w:pPr>
     </w:lvl>
   </w:abstractNum>
+  <w:abstractNum w:abstractNumId="2" w15:restartNumberingAfterBreak="0">
+    <w:nsid w:val="562B66DE"/>
+    <w:multiLevelType w:val="hybridMultilevel"/>
+    <w:tmpl w:val="4496BBD8"/>
+    <w:lvl w:ilvl="0" w:tplc="D7E2AFBC">
+      <w:start w:val="1"/>
+      <w:numFmt w:val="bullet"/>
+      <w:lvlText w:val="•"/>
+      <w:lvlJc w:val="left"/>
+      <w:pPr>
+        <w:ind w:left="720" w:hanging="360"/>
+      </w:pPr>
+    </w:lvl>
+    <w:lvl w:ilvl="1" w:tplc="313C3F9C">
+      <w:start w:val="1"/>
+      <w:numFmt w:val="bullet"/>
+      <w:lvlText w:val="◦"/>
+      <w:lvlJc w:val="left"/>
+      <w:pPr>
+        <w:ind w:left="1440" w:hanging="360"/>
+      </w:pPr>
+    </w:lvl>
+    <w:lvl w:ilvl="2" w:tplc="9118AD96">
+      <w:numFmt w:val="decimal"/>
+      <w:lvlText w:val=""/>
+      <w:lvlJc w:val="left"/>
+    </w:lvl>
+    <w:lvl w:ilvl="3" w:tplc="07F8EF64">
+      <w:numFmt w:val="decimal"/>
+      <w:lvlText w:val=""/>
+      <w:lvlJc w:val="left"/>
+    </w:lvl>
+    <w:lvl w:ilvl="4" w:tplc="90E8A990">
+      <w:numFmt w:val="decimal"/>
+      <w:lvlText w:val=""/>
+      <w:lvlJc w:val="left"/>
+    </w:lvl>
+    <w:lvl w:ilvl="5" w:tplc="7E3EA97A">
+      <w:numFmt w:val="decimal"/>
+      <w:lvlText w:val=""/>
+      <w:lvlJc w:val="left"/>
+    </w:lvl>
+    <w:lvl w:ilvl="6" w:tplc="2DF0CCB2">
+      <w:numFmt w:val="decimal"/>
+      <w:lvlText w:val=""/>
+      <w:lvlJc w:val="left"/>
+    </w:lvl>
+    <w:lvl w:ilvl="7" w:tplc="53F8C2C0">
+      <w:numFmt w:val="decimal"/>
+      <w:lvlText w:val=""/>
+      <w:lvlJc w:val="left"/>
+    </w:lvl>
+    <w:lvl w:ilvl="8" w:tplc="BE3464CE">
+      <w:numFmt w:val="decimal"/>
+      <w:lvlText w:val=""/>
+      <w:lvlJc w:val="left"/>
+    </w:lvl>
+  </w:abstractNum>
   <w:abstractNum w:abstractNumId="3" w15:restartNumberingAfterBreak="0">
-    <w:nsid w:val="63C71A97"/>
+    <w:nsid w:val="5BCF5FEA"/>
     <w:multiLevelType w:val="hybridMultilevel"/>
-    <w:tmpl w:val="7FB4B4F2"/>
-    <w:lvl w:ilvl="0" w:tplc="5E8EE524">
+    <w:tmpl w:val="C10A5438"/>
+    <w:lvl w:ilvl="0" w:tplc="46849766">
       <w:start w:val="1"/>
       <w:numFmt w:val="decimal"/>
       <w:lvlText w:val="%1."/>
@@ -25625,67 +25995,67 @@
         <w:ind w:left="720" w:hanging="360"/>
       </w:pPr>
     </w:lvl>
-    <w:lvl w:ilvl="1" w:tplc="461E3E50">
+    <w:lvl w:ilvl="1" w:tplc="B10EEF7E">
       <w:numFmt w:val="decimal"/>
       <w:lvlText w:val=""/>
       <w:lvlJc w:val="left"/>
     </w:lvl>
-    <w:lvl w:ilvl="2" w:tplc="EC148230">
+    <w:lvl w:ilvl="2" w:tplc="53D0D2A0">
       <w:numFmt w:val="decimal"/>
       <w:lvlText w:val=""/>
       <w:lvlJc w:val="left"/>
     </w:lvl>
-    <w:lvl w:ilvl="3" w:tplc="FB2E9C00">
+    <w:lvl w:ilvl="3" w:tplc="C75CB462">
       <w:numFmt w:val="decimal"/>
       <w:lvlText w:val=""/>
       <w:lvlJc w:val="left"/>
     </w:lvl>
-    <w:lvl w:ilvl="4" w:tplc="50DA3FFC">
+    <w:lvl w:ilvl="4" w:tplc="C4CE8AAE">
       <w:numFmt w:val="decimal"/>
       <w:lvlText w:val=""/>
       <w:lvlJc w:val="left"/>
     </w:lvl>
-    <w:lvl w:ilvl="5" w:tplc="0D3873B2">
+    <w:lvl w:ilvl="5" w:tplc="DE6EE00A">
       <w:numFmt w:val="decimal"/>
       <w:lvlText w:val=""/>
       <w:lvlJc w:val="left"/>
     </w:lvl>
-    <w:lvl w:ilvl="6" w:tplc="D9AAF80C">
+    <w:lvl w:ilvl="6" w:tplc="9364C688">
       <w:numFmt w:val="decimal"/>
       <w:lvlText w:val=""/>
       <w:lvlJc w:val="left"/>
     </w:lvl>
-    <w:lvl w:ilvl="7" w:tplc="AF9EB47E">
+    <w:lvl w:ilvl="7" w:tplc="CD9A3B7E">
       <w:numFmt w:val="decimal"/>
       <w:lvlText w:val=""/>
       <w:lvlJc w:val="left"/>
     </w:lvl>
-    <w:lvl w:ilvl="8" w:tplc="C9D0BA08">
+    <w:lvl w:ilvl="8" w:tplc="C3C02536">
       <w:numFmt w:val="decimal"/>
       <w:lvlText w:val=""/>
       <w:lvlJc w:val="left"/>
     </w:lvl>
   </w:abstractNum>
-  <w:num w:numId="1" w16cid:durableId="846790674">
+  <w:num w:numId="1" w16cid:durableId="1373116563">
+    <w:abstractNumId w:val="1"/>
+    <w:lvlOverride w:ilvl="0">
+      <w:startOverride w:val="1"/>
+    </w:lvlOverride>
+  </w:num>
+  <w:num w:numId="2" w16cid:durableId="435174812">
+    <w:abstractNumId w:val="3"/>
+    <w:lvlOverride w:ilvl="0">
+      <w:startOverride w:val="1"/>
+    </w:lvlOverride>
+  </w:num>
+  <w:num w:numId="3" w16cid:durableId="1716345023">
     <w:abstractNumId w:val="2"/>
     <w:lvlOverride w:ilvl="0">
       <w:startOverride w:val="1"/>
     </w:lvlOverride>
   </w:num>
-  <w:num w:numId="2" w16cid:durableId="139156814">
-    <w:abstractNumId w:val="3"/>
-    <w:lvlOverride w:ilvl="0">
-      <w:startOverride w:val="1"/>
-    </w:lvlOverride>
-  </w:num>
-  <w:num w:numId="3" w16cid:durableId="532688645">
+  <w:num w:numId="4" w16cid:durableId="49815625">
     <w:abstractNumId w:val="0"/>
-    <w:lvlOverride w:ilvl="0">
-      <w:startOverride w:val="1"/>
-    </w:lvlOverride>
-  </w:num>
-  <w:num w:numId="4" w16cid:durableId="225916730">
-    <w:abstractNumId w:val="1"/>
     <w:lvlOverride w:ilvl="0">
       <w:startOverride w:val="1"/>
     </w:lvlOverride>
@@ -26280,7 +26650,7 @@
     <w:autoRedefine/>
     <w:uiPriority w:val="39"/>
     <w:unhideWhenUsed/>
-    <w:rsid w:val="003864B4"/>
+    <w:rsid w:val="00FD3621"/>
     <w:pPr>
       <w:spacing w:after="100"/>
     </w:pPr>
@@ -26292,7 +26662,7 @@
     <w:autoRedefine/>
     <w:uiPriority w:val="39"/>
     <w:unhideWhenUsed/>
-    <w:rsid w:val="003864B4"/>
+    <w:rsid w:val="00FD3621"/>
     <w:pPr>
       <w:spacing w:after="100"/>
       <w:ind w:left="220"/>

</xml_diff>

<commit_message>
fix: texto estricto en DTO de onboarding y solo JSON en los endpoints
</commit_message>
<xml_diff>
--- a/docs/Documento_Tecnico_Onboarding.docx
+++ b/docs/Documento_Tecnico_Onboarding.docx
@@ -183,7 +183,7 @@
     <w:sdt>
       <w:sdtPr>
         <w:alias w:val="Contenido"/>
-        <w:id w:val="1139620702"/>
+        <w:id w:val="-1694379067"/>
       </w:sdtPr>
       <w:sdtEndPr/>
       <w:sdtContent>
@@ -211,7 +211,7 @@
           <w:r>
             <w:fldChar w:fldCharType="separate"/>
           </w:r>
-          <w:hyperlink w:anchor="_Toc243143828" w:history="1">
+          <w:hyperlink w:anchor="_Toc243149867" w:history="1">
             <w:r>
               <w:rPr>
                 <w:rStyle w:val="Hyperlink"/>
@@ -235,7 +235,7 @@
               <w:rPr>
                 <w:noProof/>
               </w:rPr>
-              <w:instrText xml:space="preserve"> PAGEREF _Toc243143828 \h </w:instrText>
+              <w:instrText xml:space="preserve"> PAGEREF _Toc243149867 \h </w:instrText>
             </w:r>
             <w:r>
               <w:rPr>
@@ -277,7 +277,7 @@
               <w14:ligatures w14:val="standardContextual"/>
             </w:rPr>
           </w:pPr>
-          <w:hyperlink w:anchor="_Toc243143829" w:history="1">
+          <w:hyperlink w:anchor="_Toc243149868" w:history="1">
             <w:r>
               <w:rPr>
                 <w:rStyle w:val="Hyperlink"/>
@@ -301,7 +301,7 @@
               <w:rPr>
                 <w:noProof/>
               </w:rPr>
-              <w:instrText xml:space="preserve"> PAGEREF _Toc243143829 \h </w:instrText>
+              <w:instrText xml:space="preserve"> PAGEREF _Toc243149868 \h </w:instrText>
             </w:r>
             <w:r>
               <w:rPr>
@@ -343,7 +343,7 @@
               <w14:ligatures w14:val="standardContextual"/>
             </w:rPr>
           </w:pPr>
-          <w:hyperlink w:anchor="_Toc243143830" w:history="1">
+          <w:hyperlink w:anchor="_Toc243149869" w:history="1">
             <w:r>
               <w:rPr>
                 <w:rStyle w:val="Hyperlink"/>
@@ -367,7 +367,7 @@
               <w:rPr>
                 <w:noProof/>
               </w:rPr>
-              <w:instrText xml:space="preserve"> PAGEREF _Toc243143830 \h </w:instrText>
+              <w:instrText xml:space="preserve"> PAGEREF _Toc243149869 \h </w:instrText>
             </w:r>
             <w:r>
               <w:rPr>
@@ -409,7 +409,7 @@
               <w14:ligatures w14:val="standardContextual"/>
             </w:rPr>
           </w:pPr>
-          <w:hyperlink w:anchor="_Toc243143831" w:history="1">
+          <w:hyperlink w:anchor="_Toc243149870" w:history="1">
             <w:r>
               <w:rPr>
                 <w:rStyle w:val="Hyperlink"/>
@@ -433,7 +433,7 @@
               <w:rPr>
                 <w:noProof/>
               </w:rPr>
-              <w:instrText xml:space="preserve"> PAGEREF _Toc243143831 \h </w:instrText>
+              <w:instrText xml:space="preserve"> PAGEREF _Toc243149870 \h </w:instrText>
             </w:r>
             <w:r>
               <w:rPr>
@@ -475,7 +475,7 @@
               <w14:ligatures w14:val="standardContextual"/>
             </w:rPr>
           </w:pPr>
-          <w:hyperlink w:anchor="_Toc243143832" w:history="1">
+          <w:hyperlink w:anchor="_Toc243149871" w:history="1">
             <w:r>
               <w:rPr>
                 <w:rStyle w:val="Hyperlink"/>
@@ -499,7 +499,7 @@
               <w:rPr>
                 <w:noProof/>
               </w:rPr>
-              <w:instrText xml:space="preserve"> PAGEREF _Toc243143832 \h </w:instrText>
+              <w:instrText xml:space="preserve"> PAGEREF _Toc243149871 \h </w:instrText>
             </w:r>
             <w:r>
               <w:rPr>
@@ -541,7 +541,7 @@
               <w14:ligatures w14:val="standardContextual"/>
             </w:rPr>
           </w:pPr>
-          <w:hyperlink w:anchor="_Toc243143833" w:history="1">
+          <w:hyperlink w:anchor="_Toc243149872" w:history="1">
             <w:r>
               <w:rPr>
                 <w:rStyle w:val="Hyperlink"/>
@@ -565,7 +565,7 @@
               <w:rPr>
                 <w:noProof/>
               </w:rPr>
-              <w:instrText xml:space="preserve"> PAGEREF _Toc243143833 \h </w:instrText>
+              <w:instrText xml:space="preserve"> PAGEREF _Toc243149872 \h </w:instrText>
             </w:r>
             <w:r>
               <w:rPr>
@@ -607,7 +607,7 @@
               <w14:ligatures w14:val="standardContextual"/>
             </w:rPr>
           </w:pPr>
-          <w:hyperlink w:anchor="_Toc243143834" w:history="1">
+          <w:hyperlink w:anchor="_Toc243149873" w:history="1">
             <w:r>
               <w:rPr>
                 <w:rStyle w:val="Hyperlink"/>
@@ -631,7 +631,7 @@
               <w:rPr>
                 <w:noProof/>
               </w:rPr>
-              <w:instrText xml:space="preserve"> PAGEREF _Toc243143834 \h </w:instrText>
+              <w:instrText xml:space="preserve"> PAGEREF _Toc243149873 \h </w:instrText>
             </w:r>
             <w:r>
               <w:rPr>
@@ -673,7 +673,7 @@
               <w14:ligatures w14:val="standardContextual"/>
             </w:rPr>
           </w:pPr>
-          <w:hyperlink w:anchor="_Toc243143835" w:history="1">
+          <w:hyperlink w:anchor="_Toc243149874" w:history="1">
             <w:r>
               <w:rPr>
                 <w:rStyle w:val="Hyperlink"/>
@@ -697,7 +697,7 @@
               <w:rPr>
                 <w:noProof/>
               </w:rPr>
-              <w:instrText xml:space="preserve"> PAGEREF _Toc243143835 \h </w:instrText>
+              <w:instrText xml:space="preserve"> PAGEREF _Toc243149874 \h </w:instrText>
             </w:r>
             <w:r>
               <w:rPr>
@@ -739,7 +739,7 @@
               <w14:ligatures w14:val="standardContextual"/>
             </w:rPr>
           </w:pPr>
-          <w:hyperlink w:anchor="_Toc243143836" w:history="1">
+          <w:hyperlink w:anchor="_Toc243149875" w:history="1">
             <w:r>
               <w:rPr>
                 <w:rStyle w:val="Hyperlink"/>
@@ -763,7 +763,7 @@
               <w:rPr>
                 <w:noProof/>
               </w:rPr>
-              <w:instrText xml:space="preserve"> PAGEREF _Toc243143836 \h </w:instrText>
+              <w:instrText xml:space="preserve"> PAGEREF _Toc243149875 \h </w:instrText>
             </w:r>
             <w:r>
               <w:rPr>
@@ -805,7 +805,7 @@
               <w14:ligatures w14:val="standardContextual"/>
             </w:rPr>
           </w:pPr>
-          <w:hyperlink w:anchor="_Toc243143837" w:history="1">
+          <w:hyperlink w:anchor="_Toc243149876" w:history="1">
             <w:r>
               <w:rPr>
                 <w:rStyle w:val="Hyperlink"/>
@@ -829,7 +829,7 @@
               <w:rPr>
                 <w:noProof/>
               </w:rPr>
-              <w:instrText xml:space="preserve"> PAGEREF _Toc243143837 \h </w:instrText>
+              <w:instrText xml:space="preserve"> PAGEREF _Toc243149876 \h </w:instrText>
             </w:r>
             <w:r>
               <w:rPr>
@@ -871,7 +871,7 @@
               <w14:ligatures w14:val="standardContextual"/>
             </w:rPr>
           </w:pPr>
-          <w:hyperlink w:anchor="_Toc243143838" w:history="1">
+          <w:hyperlink w:anchor="_Toc243149877" w:history="1">
             <w:r>
               <w:rPr>
                 <w:rStyle w:val="Hyperlink"/>
@@ -895,7 +895,7 @@
               <w:rPr>
                 <w:noProof/>
               </w:rPr>
-              <w:instrText xml:space="preserve"> PAGEREF _Toc243143838 \h </w:instrText>
+              <w:instrText xml:space="preserve"> PAGEREF _Toc243149877 \h </w:instrText>
             </w:r>
             <w:r>
               <w:rPr>
@@ -937,7 +937,7 @@
               <w14:ligatures w14:val="standardContextual"/>
             </w:rPr>
           </w:pPr>
-          <w:hyperlink w:anchor="_Toc243143839" w:history="1">
+          <w:hyperlink w:anchor="_Toc243149878" w:history="1">
             <w:r>
               <w:rPr>
                 <w:rStyle w:val="Hyperlink"/>
@@ -961,7 +961,7 @@
               <w:rPr>
                 <w:noProof/>
               </w:rPr>
-              <w:instrText xml:space="preserve"> PAGEREF _Toc243143839 \h </w:instrText>
+              <w:instrText xml:space="preserve"> PAGEREF _Toc243149878 \h </w:instrText>
             </w:r>
             <w:r>
               <w:rPr>
@@ -1003,7 +1003,7 @@
               <w14:ligatures w14:val="standardContextual"/>
             </w:rPr>
           </w:pPr>
-          <w:hyperlink w:anchor="_Toc243143840" w:history="1">
+          <w:hyperlink w:anchor="_Toc243149879" w:history="1">
             <w:r>
               <w:rPr>
                 <w:rStyle w:val="Hyperlink"/>
@@ -1027,7 +1027,7 @@
               <w:rPr>
                 <w:noProof/>
               </w:rPr>
-              <w:instrText xml:space="preserve"> PAGEREF _Toc243143840 \h </w:instrText>
+              <w:instrText xml:space="preserve"> PAGEREF _Toc243149879 \h </w:instrText>
             </w:r>
             <w:r>
               <w:rPr>
@@ -1069,7 +1069,7 @@
               <w14:ligatures w14:val="standardContextual"/>
             </w:rPr>
           </w:pPr>
-          <w:hyperlink w:anchor="_Toc243143841" w:history="1">
+          <w:hyperlink w:anchor="_Toc243149880" w:history="1">
             <w:r>
               <w:rPr>
                 <w:rStyle w:val="Hyperlink"/>
@@ -1093,7 +1093,7 @@
               <w:rPr>
                 <w:noProof/>
               </w:rPr>
-              <w:instrText xml:space="preserve"> PAGEREF _Toc243143841 \h </w:instrText>
+              <w:instrText xml:space="preserve"> PAGEREF _Toc243149880 \h </w:instrText>
             </w:r>
             <w:r>
               <w:rPr>
@@ -1135,7 +1135,7 @@
               <w14:ligatures w14:val="standardContextual"/>
             </w:rPr>
           </w:pPr>
-          <w:hyperlink w:anchor="_Toc243143842" w:history="1">
+          <w:hyperlink w:anchor="_Toc243149881" w:history="1">
             <w:r>
               <w:rPr>
                 <w:rStyle w:val="Hyperlink"/>
@@ -1159,7 +1159,7 @@
               <w:rPr>
                 <w:noProof/>
               </w:rPr>
-              <w:instrText xml:space="preserve"> PAGEREF _Toc243143842 \h </w:instrText>
+              <w:instrText xml:space="preserve"> PAGEREF _Toc243149881 \h </w:instrText>
             </w:r>
             <w:r>
               <w:rPr>
@@ -1201,7 +1201,7 @@
               <w14:ligatures w14:val="standardContextual"/>
             </w:rPr>
           </w:pPr>
-          <w:hyperlink w:anchor="_Toc243143843" w:history="1">
+          <w:hyperlink w:anchor="_Toc243149882" w:history="1">
             <w:r>
               <w:rPr>
                 <w:rStyle w:val="Hyperlink"/>
@@ -1225,7 +1225,7 @@
               <w:rPr>
                 <w:noProof/>
               </w:rPr>
-              <w:instrText xml:space="preserve"> PAGEREF _Toc243143843 \h </w:instrText>
+              <w:instrText xml:space="preserve"> PAGEREF _Toc243149882 \h </w:instrText>
             </w:r>
             <w:r>
               <w:rPr>
@@ -1267,7 +1267,7 @@
               <w14:ligatures w14:val="standardContextual"/>
             </w:rPr>
           </w:pPr>
-          <w:hyperlink w:anchor="_Toc243143844" w:history="1">
+          <w:hyperlink w:anchor="_Toc243149883" w:history="1">
             <w:r>
               <w:rPr>
                 <w:rStyle w:val="Hyperlink"/>
@@ -1291,7 +1291,7 @@
               <w:rPr>
                 <w:noProof/>
               </w:rPr>
-              <w:instrText xml:space="preserve"> PAGEREF _Toc243143844 \h </w:instrText>
+              <w:instrText xml:space="preserve"> PAGEREF _Toc243149883 \h </w:instrText>
             </w:r>
             <w:r>
               <w:rPr>
@@ -1333,7 +1333,7 @@
               <w14:ligatures w14:val="standardContextual"/>
             </w:rPr>
           </w:pPr>
-          <w:hyperlink w:anchor="_Toc243143845" w:history="1">
+          <w:hyperlink w:anchor="_Toc243149884" w:history="1">
             <w:r>
               <w:rPr>
                 <w:rStyle w:val="Hyperlink"/>
@@ -1357,7 +1357,7 @@
               <w:rPr>
                 <w:noProof/>
               </w:rPr>
-              <w:instrText xml:space="preserve"> PAGEREF _Toc243143845 \h </w:instrText>
+              <w:instrText xml:space="preserve"> PAGEREF _Toc243149884 \h </w:instrText>
             </w:r>
             <w:r>
               <w:rPr>
@@ -1399,7 +1399,7 @@
               <w14:ligatures w14:val="standardContextual"/>
             </w:rPr>
           </w:pPr>
-          <w:hyperlink w:anchor="_Toc243143846" w:history="1">
+          <w:hyperlink w:anchor="_Toc243149885" w:history="1">
             <w:r>
               <w:rPr>
                 <w:rStyle w:val="Hyperlink"/>
@@ -1423,7 +1423,7 @@
               <w:rPr>
                 <w:noProof/>
               </w:rPr>
-              <w:instrText xml:space="preserve"> PAGEREF _Toc243143846 \h </w:instrText>
+              <w:instrText xml:space="preserve"> PAGEREF _Toc243149885 \h </w:instrText>
             </w:r>
             <w:r>
               <w:rPr>
@@ -1465,7 +1465,7 @@
               <w14:ligatures w14:val="standardContextual"/>
             </w:rPr>
           </w:pPr>
-          <w:hyperlink w:anchor="_Toc243143847" w:history="1">
+          <w:hyperlink w:anchor="_Toc243149886" w:history="1">
             <w:r>
               <w:rPr>
                 <w:rStyle w:val="Hyperlink"/>
@@ -1489,7 +1489,7 @@
               <w:rPr>
                 <w:noProof/>
               </w:rPr>
-              <w:instrText xml:space="preserve"> PAGEREF _Toc243143847 \h </w:instrText>
+              <w:instrText xml:space="preserve"> PAGEREF _Toc243149886 \h </w:instrText>
             </w:r>
             <w:r>
               <w:rPr>
@@ -1531,7 +1531,7 @@
               <w14:ligatures w14:val="standardContextual"/>
             </w:rPr>
           </w:pPr>
-          <w:hyperlink w:anchor="_Toc243143848" w:history="1">
+          <w:hyperlink w:anchor="_Toc243149887" w:history="1">
             <w:r>
               <w:rPr>
                 <w:rStyle w:val="Hyperlink"/>
@@ -1555,7 +1555,7 @@
               <w:rPr>
                 <w:noProof/>
               </w:rPr>
-              <w:instrText xml:space="preserve"> PAGEREF _Toc243143848 \h </w:instrText>
+              <w:instrText xml:space="preserve"> PAGEREF _Toc243149887 \h </w:instrText>
             </w:r>
             <w:r>
               <w:rPr>
@@ -1597,7 +1597,7 @@
               <w14:ligatures w14:val="standardContextual"/>
             </w:rPr>
           </w:pPr>
-          <w:hyperlink w:anchor="_Toc243143849" w:history="1">
+          <w:hyperlink w:anchor="_Toc243149888" w:history="1">
             <w:r>
               <w:rPr>
                 <w:rStyle w:val="Hyperlink"/>
@@ -1621,7 +1621,7 @@
               <w:rPr>
                 <w:noProof/>
               </w:rPr>
-              <w:instrText xml:space="preserve"> PAGEREF _Toc243143849 \h </w:instrText>
+              <w:instrText xml:space="preserve"> PAGEREF _Toc243149888 \h </w:instrText>
             </w:r>
             <w:r>
               <w:rPr>
@@ -1663,7 +1663,7 @@
               <w14:ligatures w14:val="standardContextual"/>
             </w:rPr>
           </w:pPr>
-          <w:hyperlink w:anchor="_Toc243143850" w:history="1">
+          <w:hyperlink w:anchor="_Toc243149889" w:history="1">
             <w:r>
               <w:rPr>
                 <w:rStyle w:val="Hyperlink"/>
@@ -1687,7 +1687,7 @@
               <w:rPr>
                 <w:noProof/>
               </w:rPr>
-              <w:instrText xml:space="preserve"> PAGEREF _Toc243143850 \h </w:instrText>
+              <w:instrText xml:space="preserve"> PAGEREF _Toc243149889 \h </w:instrText>
             </w:r>
             <w:r>
               <w:rPr>
@@ -1729,7 +1729,7 @@
               <w14:ligatures w14:val="standardContextual"/>
             </w:rPr>
           </w:pPr>
-          <w:hyperlink w:anchor="_Toc243143851" w:history="1">
+          <w:hyperlink w:anchor="_Toc243149890" w:history="1">
             <w:r>
               <w:rPr>
                 <w:rStyle w:val="Hyperlink"/>
@@ -1753,7 +1753,7 @@
               <w:rPr>
                 <w:noProof/>
               </w:rPr>
-              <w:instrText xml:space="preserve"> PAGEREF _Toc243143851 \h </w:instrText>
+              <w:instrText xml:space="preserve"> PAGEREF _Toc243149890 \h </w:instrText>
             </w:r>
             <w:r>
               <w:rPr>
@@ -1795,7 +1795,7 @@
               <w14:ligatures w14:val="standardContextual"/>
             </w:rPr>
           </w:pPr>
-          <w:hyperlink w:anchor="_Toc243143852" w:history="1">
+          <w:hyperlink w:anchor="_Toc243149891" w:history="1">
             <w:r>
               <w:rPr>
                 <w:rStyle w:val="Hyperlink"/>
@@ -1819,7 +1819,7 @@
               <w:rPr>
                 <w:noProof/>
               </w:rPr>
-              <w:instrText xml:space="preserve"> PAGEREF _Toc243143852 \h </w:instrText>
+              <w:instrText xml:space="preserve"> PAGEREF _Toc243149891 \h </w:instrText>
             </w:r>
             <w:r>
               <w:rPr>
@@ -1861,7 +1861,7 @@
               <w14:ligatures w14:val="standardContextual"/>
             </w:rPr>
           </w:pPr>
-          <w:hyperlink w:anchor="_Toc243143853" w:history="1">
+          <w:hyperlink w:anchor="_Toc243149892" w:history="1">
             <w:r>
               <w:rPr>
                 <w:rStyle w:val="Hyperlink"/>
@@ -1885,7 +1885,7 @@
               <w:rPr>
                 <w:noProof/>
               </w:rPr>
-              <w:instrText xml:space="preserve"> PAGEREF _Toc243143853 \h </w:instrText>
+              <w:instrText xml:space="preserve"> PAGEREF _Toc243149892 \h </w:instrText>
             </w:r>
             <w:r>
               <w:rPr>
@@ -1927,7 +1927,7 @@
               <w14:ligatures w14:val="standardContextual"/>
             </w:rPr>
           </w:pPr>
-          <w:hyperlink w:anchor="_Toc243143854" w:history="1">
+          <w:hyperlink w:anchor="_Toc243149893" w:history="1">
             <w:r>
               <w:rPr>
                 <w:rStyle w:val="Hyperlink"/>
@@ -1951,7 +1951,7 @@
               <w:rPr>
                 <w:noProof/>
               </w:rPr>
-              <w:instrText xml:space="preserve"> PAGEREF _Toc243143854 \h </w:instrText>
+              <w:instrText xml:space="preserve"> PAGEREF _Toc243149893 \h </w:instrText>
             </w:r>
             <w:r>
               <w:rPr>
@@ -1993,7 +1993,7 @@
               <w14:ligatures w14:val="standardContextual"/>
             </w:rPr>
           </w:pPr>
-          <w:hyperlink w:anchor="_Toc243143855" w:history="1">
+          <w:hyperlink w:anchor="_Toc243149894" w:history="1">
             <w:r>
               <w:rPr>
                 <w:rStyle w:val="Hyperlink"/>
@@ -2017,7 +2017,7 @@
               <w:rPr>
                 <w:noProof/>
               </w:rPr>
-              <w:instrText xml:space="preserve"> PAGEREF _Toc243143855 \h </w:instrText>
+              <w:instrText xml:space="preserve"> PAGEREF _Toc243149894 \h </w:instrText>
             </w:r>
             <w:r>
               <w:rPr>
@@ -2059,7 +2059,7 @@
               <w14:ligatures w14:val="standardContextual"/>
             </w:rPr>
           </w:pPr>
-          <w:hyperlink w:anchor="_Toc243143856" w:history="1">
+          <w:hyperlink w:anchor="_Toc243149895" w:history="1">
             <w:r>
               <w:rPr>
                 <w:rStyle w:val="Hyperlink"/>
@@ -2083,7 +2083,7 @@
               <w:rPr>
                 <w:noProof/>
               </w:rPr>
-              <w:instrText xml:space="preserve"> PAGEREF _Toc243143856 \h </w:instrText>
+              <w:instrText xml:space="preserve"> PAGEREF _Toc243149895 \h </w:instrText>
             </w:r>
             <w:r>
               <w:rPr>
@@ -2125,7 +2125,7 @@
               <w14:ligatures w14:val="standardContextual"/>
             </w:rPr>
           </w:pPr>
-          <w:hyperlink w:anchor="_Toc243143857" w:history="1">
+          <w:hyperlink w:anchor="_Toc243149896" w:history="1">
             <w:r>
               <w:rPr>
                 <w:rStyle w:val="Hyperlink"/>
@@ -2149,7 +2149,7 @@
               <w:rPr>
                 <w:noProof/>
               </w:rPr>
-              <w:instrText xml:space="preserve"> PAGEREF _Toc243143857 \h </w:instrText>
+              <w:instrText xml:space="preserve"> PAGEREF _Toc243149896 \h </w:instrText>
             </w:r>
             <w:r>
               <w:rPr>
@@ -2191,7 +2191,7 @@
               <w14:ligatures w14:val="standardContextual"/>
             </w:rPr>
           </w:pPr>
-          <w:hyperlink w:anchor="_Toc243143858" w:history="1">
+          <w:hyperlink w:anchor="_Toc243149897" w:history="1">
             <w:r>
               <w:rPr>
                 <w:rStyle w:val="Hyperlink"/>
@@ -2215,7 +2215,7 @@
               <w:rPr>
                 <w:noProof/>
               </w:rPr>
-              <w:instrText xml:space="preserve"> PAGEREF _Toc243143858 \h </w:instrText>
+              <w:instrText xml:space="preserve"> PAGEREF _Toc243149897 \h </w:instrText>
             </w:r>
             <w:r>
               <w:rPr>
@@ -2257,7 +2257,7 @@
               <w14:ligatures w14:val="standardContextual"/>
             </w:rPr>
           </w:pPr>
-          <w:hyperlink w:anchor="_Toc243143859" w:history="1">
+          <w:hyperlink w:anchor="_Toc243149898" w:history="1">
             <w:r>
               <w:rPr>
                 <w:rStyle w:val="Hyperlink"/>
@@ -2281,7 +2281,7 @@
               <w:rPr>
                 <w:noProof/>
               </w:rPr>
-              <w:instrText xml:space="preserve"> PAGEREF _Toc243143859 \h </w:instrText>
+              <w:instrText xml:space="preserve"> PAGEREF _Toc243149898 \h </w:instrText>
             </w:r>
             <w:r>
               <w:rPr>
@@ -2323,7 +2323,7 @@
               <w14:ligatures w14:val="standardContextual"/>
             </w:rPr>
           </w:pPr>
-          <w:hyperlink w:anchor="_Toc243143860" w:history="1">
+          <w:hyperlink w:anchor="_Toc243149899" w:history="1">
             <w:r>
               <w:rPr>
                 <w:rStyle w:val="Hyperlink"/>
@@ -2347,7 +2347,7 @@
               <w:rPr>
                 <w:noProof/>
               </w:rPr>
-              <w:instrText xml:space="preserve"> PAGEREF _Toc243143860 \h </w:instrText>
+              <w:instrText xml:space="preserve"> PAGEREF _Toc243149899 \h </w:instrText>
             </w:r>
             <w:r>
               <w:rPr>
@@ -2389,7 +2389,7 @@
               <w14:ligatures w14:val="standardContextual"/>
             </w:rPr>
           </w:pPr>
-          <w:hyperlink w:anchor="_Toc243143861" w:history="1">
+          <w:hyperlink w:anchor="_Toc243149900" w:history="1">
             <w:r>
               <w:rPr>
                 <w:rStyle w:val="Hyperlink"/>
@@ -2413,7 +2413,7 @@
               <w:rPr>
                 <w:noProof/>
               </w:rPr>
-              <w:instrText xml:space="preserve"> PAGEREF _Toc243143861 \h </w:instrText>
+              <w:instrText xml:space="preserve"> PAGEREF _Toc243149900 \h </w:instrText>
             </w:r>
             <w:r>
               <w:rPr>
@@ -2455,7 +2455,7 @@
               <w14:ligatures w14:val="standardContextual"/>
             </w:rPr>
           </w:pPr>
-          <w:hyperlink w:anchor="_Toc243143862" w:history="1">
+          <w:hyperlink w:anchor="_Toc243149901" w:history="1">
             <w:r>
               <w:rPr>
                 <w:rStyle w:val="Hyperlink"/>
@@ -2479,7 +2479,7 @@
               <w:rPr>
                 <w:noProof/>
               </w:rPr>
-              <w:instrText xml:space="preserve"> PAGEREF _Toc243143862 \h </w:instrText>
+              <w:instrText xml:space="preserve"> PAGEREF _Toc243149901 \h </w:instrText>
             </w:r>
             <w:r>
               <w:rPr>
@@ -2521,7 +2521,7 @@
               <w14:ligatures w14:val="standardContextual"/>
             </w:rPr>
           </w:pPr>
-          <w:hyperlink w:anchor="_Toc243143863" w:history="1">
+          <w:hyperlink w:anchor="_Toc243149902" w:history="1">
             <w:r>
               <w:rPr>
                 <w:rStyle w:val="Hyperlink"/>
@@ -2545,7 +2545,7 @@
               <w:rPr>
                 <w:noProof/>
               </w:rPr>
-              <w:instrText xml:space="preserve"> PAGEREF _Toc243143863 \h </w:instrText>
+              <w:instrText xml:space="preserve"> PAGEREF _Toc243149902 \h </w:instrText>
             </w:r>
             <w:r>
               <w:rPr>
@@ -2587,7 +2587,7 @@
               <w14:ligatures w14:val="standardContextual"/>
             </w:rPr>
           </w:pPr>
-          <w:hyperlink w:anchor="_Toc243143864" w:history="1">
+          <w:hyperlink w:anchor="_Toc243149903" w:history="1">
             <w:r>
               <w:rPr>
                 <w:rStyle w:val="Hyperlink"/>
@@ -2611,7 +2611,7 @@
               <w:rPr>
                 <w:noProof/>
               </w:rPr>
-              <w:instrText xml:space="preserve"> PAGEREF _Toc243143864 \h </w:instrText>
+              <w:instrText xml:space="preserve"> PAGEREF _Toc243149903 \h </w:instrText>
             </w:r>
             <w:r>
               <w:rPr>
@@ -2653,7 +2653,7 @@
               <w14:ligatures w14:val="standardContextual"/>
             </w:rPr>
           </w:pPr>
-          <w:hyperlink w:anchor="_Toc243143865" w:history="1">
+          <w:hyperlink w:anchor="_Toc243149904" w:history="1">
             <w:r>
               <w:rPr>
                 <w:rStyle w:val="Hyperlink"/>
@@ -2677,7 +2677,7 @@
               <w:rPr>
                 <w:noProof/>
               </w:rPr>
-              <w:instrText xml:space="preserve"> PAGEREF _Toc243143865 \h </w:instrText>
+              <w:instrText xml:space="preserve"> PAGEREF _Toc243149904 \h </w:instrText>
             </w:r>
             <w:r>
               <w:rPr>
@@ -2719,13 +2719,13 @@
               <w14:ligatures w14:val="standardContextual"/>
             </w:rPr>
           </w:pPr>
-          <w:hyperlink w:anchor="_Toc243143866" w:history="1">
+          <w:hyperlink w:anchor="_Toc243149905" w:history="1">
             <w:r>
               <w:rPr>
                 <w:rStyle w:val="Hyperlink"/>
                 <w:noProof/>
               </w:rPr>
-              <w:t>10.6 Reglas en la base de datos</w:t>
+              <w:t>10.6 Validación extrema contra la API publicada</w:t>
             </w:r>
             <w:r>
               <w:rPr>
@@ -2743,7 +2743,73 @@
               <w:rPr>
                 <w:noProof/>
               </w:rPr>
-              <w:instrText xml:space="preserve"> PAGEREF _Toc243143866 \h </w:instrText>
+              <w:instrText xml:space="preserve"> PAGEREF _Toc243149905 \h </w:instrText>
+            </w:r>
+            <w:r>
+              <w:rPr>
+                <w:noProof/>
+              </w:rPr>
+            </w:r>
+            <w:r>
+              <w:rPr>
+                <w:noProof/>
+              </w:rPr>
+              <w:fldChar w:fldCharType="separate"/>
+            </w:r>
+            <w:r>
+              <w:rPr>
+                <w:noProof/>
+              </w:rPr>
+              <w:t>43</w:t>
+            </w:r>
+            <w:r>
+              <w:rPr>
+                <w:noProof/>
+              </w:rPr>
+              <w:fldChar w:fldCharType="end"/>
+            </w:r>
+          </w:hyperlink>
+        </w:p>
+        <w:p>
+          <w:pPr>
+            <w:pStyle w:val="TOC2"/>
+            <w:tabs>
+              <w:tab w:val="right" w:leader="dot" w:pos="9350"/>
+            </w:tabs>
+            <w:rPr>
+              <w:rFonts w:asciiTheme="minorHAnsi" w:eastAsiaTheme="minorEastAsia" w:hAnsiTheme="minorHAnsi" w:cstheme="minorBidi"/>
+              <w:noProof/>
+              <w:kern w:val="2"/>
+              <w:sz w:val="24"/>
+              <w:szCs w:val="24"/>
+              <w14:ligatures w14:val="standardContextual"/>
+            </w:rPr>
+          </w:pPr>
+          <w:hyperlink w:anchor="_Toc243149906" w:history="1">
+            <w:r>
+              <w:rPr>
+                <w:rStyle w:val="Hyperlink"/>
+                <w:noProof/>
+              </w:rPr>
+              <w:t>10.7 Reglas en la base de datos</w:t>
+            </w:r>
+            <w:r>
+              <w:rPr>
+                <w:noProof/>
+              </w:rPr>
+              <w:tab/>
+            </w:r>
+            <w:r>
+              <w:rPr>
+                <w:noProof/>
+              </w:rPr>
+              <w:fldChar w:fldCharType="begin"/>
+            </w:r>
+            <w:r>
+              <w:rPr>
+                <w:noProof/>
+              </w:rPr>
+              <w:instrText xml:space="preserve"> PAGEREF _Toc243149906 \h </w:instrText>
             </w:r>
             <w:r>
               <w:rPr>
@@ -2785,7 +2851,7 @@
               <w14:ligatures w14:val="standardContextual"/>
             </w:rPr>
           </w:pPr>
-          <w:hyperlink w:anchor="_Toc243143867" w:history="1">
+          <w:hyperlink w:anchor="_Toc243149907" w:history="1">
             <w:r>
               <w:rPr>
                 <w:rStyle w:val="Hyperlink"/>
@@ -2809,7 +2875,7 @@
               <w:rPr>
                 <w:noProof/>
               </w:rPr>
-              <w:instrText xml:space="preserve"> PAGEREF _Toc243143867 \h </w:instrText>
+              <w:instrText xml:space="preserve"> PAGEREF _Toc243149907 \h </w:instrText>
             </w:r>
             <w:r>
               <w:rPr>
@@ -2826,7 +2892,7 @@
               <w:rPr>
                 <w:noProof/>
               </w:rPr>
-              <w:t>44</w:t>
+              <w:t>45</w:t>
             </w:r>
             <w:r>
               <w:rPr>
@@ -2851,7 +2917,7 @@
               <w14:ligatures w14:val="standardContextual"/>
             </w:rPr>
           </w:pPr>
-          <w:hyperlink w:anchor="_Toc243143868" w:history="1">
+          <w:hyperlink w:anchor="_Toc243149908" w:history="1">
             <w:r>
               <w:rPr>
                 <w:rStyle w:val="Hyperlink"/>
@@ -2875,7 +2941,7 @@
               <w:rPr>
                 <w:noProof/>
               </w:rPr>
-              <w:instrText xml:space="preserve"> PAGEREF _Toc243143868 \h </w:instrText>
+              <w:instrText xml:space="preserve"> PAGEREF _Toc243149908 \h </w:instrText>
             </w:r>
             <w:r>
               <w:rPr>
@@ -2892,7 +2958,7 @@
               <w:rPr>
                 <w:noProof/>
               </w:rPr>
-              <w:t>44</w:t>
+              <w:t>45</w:t>
             </w:r>
             <w:r>
               <w:rPr>
@@ -2917,7 +2983,7 @@
               <w14:ligatures w14:val="standardContextual"/>
             </w:rPr>
           </w:pPr>
-          <w:hyperlink w:anchor="_Toc243143869" w:history="1">
+          <w:hyperlink w:anchor="_Toc243149909" w:history="1">
             <w:r>
               <w:rPr>
                 <w:rStyle w:val="Hyperlink"/>
@@ -2941,7 +3007,7 @@
               <w:rPr>
                 <w:noProof/>
               </w:rPr>
-              <w:instrText xml:space="preserve"> PAGEREF _Toc243143869 \h </w:instrText>
+              <w:instrText xml:space="preserve"> PAGEREF _Toc243149909 \h </w:instrText>
             </w:r>
             <w:r>
               <w:rPr>
@@ -2958,7 +3024,7 @@
               <w:rPr>
                 <w:noProof/>
               </w:rPr>
-              <w:t>44</w:t>
+              <w:t>45</w:t>
             </w:r>
             <w:r>
               <w:rPr>
@@ -2979,7 +3045,7 @@
       <w:pPr>
         <w:pStyle w:val="Heading1"/>
       </w:pPr>
-      <w:bookmarkStart w:id="0" w:name="_Toc243143828"/>
+      <w:bookmarkStart w:id="0" w:name="_Toc243149867"/>
       <w:r>
         <w:t>1. Introducción</w:t>
       </w:r>
@@ -2989,7 +3055,7 @@
       <w:pPr>
         <w:pStyle w:val="Heading2"/>
       </w:pPr>
-      <w:bookmarkStart w:id="1" w:name="_Toc243143829"/>
+      <w:bookmarkStart w:id="1" w:name="_Toc243149868"/>
       <w:r>
         <w:t>1.1 Objetivo</w:t>
       </w:r>
@@ -3007,7 +3073,7 @@
       <w:pPr>
         <w:pStyle w:val="Heading2"/>
       </w:pPr>
-      <w:bookmarkStart w:id="2" w:name="_Toc243143830"/>
+      <w:bookmarkStart w:id="2" w:name="_Toc243149869"/>
       <w:r>
         <w:t>1.2 Historia de usuario</w:t>
       </w:r>
@@ -3050,7 +3116,7 @@
       <w:pPr>
         <w:pStyle w:val="Heading2"/>
       </w:pPr>
-      <w:bookmarkStart w:id="3" w:name="_Toc243143831"/>
+      <w:bookmarkStart w:id="3" w:name="_Toc243149870"/>
       <w:r>
         <w:t>1.3 Resumen de la solución</w:t>
       </w:r>
@@ -3234,16 +3300,19 @@
         <w:t>control de acceso por recurso</w:t>
       </w:r>
       <w:r>
-        <w:t>: un cliente solo puede ver y modificar su propio registro, y las operaciones sobre cualquier cliente son exclusivas del ejecutivo. Ninguna petición ni respuesta usa el ID interno del cliente; se le identifica por llaves que no cambian (CURP, RFC, número de cuenta).</w:t>
+        <w:t xml:space="preserve">: un cliente solo puede ver y modificar su propio registro, y las operaciones sobre cualquier cliente son exclusivas </w:t>
+      </w:r>
+      <w:r>
+        <w:lastRenderedPageBreak/>
+        <w:t>del ejecutivo. Ninguna petición ni respuesta usa el ID interno del cliente; se le identifica por llaves que no cambian (CURP, RFC, número de cuenta).</w:t>
       </w:r>
     </w:p>
     <w:p>
       <w:pPr>
         <w:pStyle w:val="Heading2"/>
       </w:pPr>
-      <w:bookmarkStart w:id="4" w:name="_Toc243143832"/>
-      <w:r>
-        <w:lastRenderedPageBreak/>
+      <w:bookmarkStart w:id="4" w:name="_Toc243149871"/>
+      <w:r>
         <w:t>1.4 Entregables</w:t>
       </w:r>
       <w:bookmarkEnd w:id="4"/>
@@ -3758,7 +3827,7 @@
         <w:pStyle w:val="Heading1"/>
         <w:pageBreakBefore/>
       </w:pPr>
-      <w:bookmarkStart w:id="5" w:name="_Toc243143833"/>
+      <w:bookmarkStart w:id="5" w:name="_Toc243149872"/>
       <w:r>
         <w:lastRenderedPageBreak/>
         <w:t>2. Requerimientos y cobertura</w:t>
@@ -4743,7 +4812,7 @@
         <w:pStyle w:val="Heading1"/>
         <w:pageBreakBefore/>
       </w:pPr>
-      <w:bookmarkStart w:id="6" w:name="_Toc243143834"/>
+      <w:bookmarkStart w:id="6" w:name="_Toc243149873"/>
       <w:r>
         <w:lastRenderedPageBreak/>
         <w:t>3. Arquitectura de la solución</w:t>
@@ -4754,7 +4823,7 @@
       <w:pPr>
         <w:pStyle w:val="Heading2"/>
       </w:pPr>
-      <w:bookmarkStart w:id="7" w:name="_Toc243143835"/>
+      <w:bookmarkStart w:id="7" w:name="_Toc243149874"/>
       <w:r>
         <w:t>3.1 Capas</w:t>
       </w:r>
@@ -5803,7 +5872,7 @@
       <w:pPr>
         <w:pStyle w:val="Heading2"/>
       </w:pPr>
-      <w:bookmarkStart w:id="8" w:name="_Toc243143836"/>
+      <w:bookmarkStart w:id="8" w:name="_Toc243149875"/>
       <w:r>
         <w:t>3.2 Estructura del código fuente</w:t>
       </w:r>
@@ -5997,7 +6066,7 @@
       <w:pPr>
         <w:pStyle w:val="Heading2"/>
       </w:pPr>
-      <w:bookmarkStart w:id="9" w:name="_Toc243143837"/>
+      <w:bookmarkStart w:id="9" w:name="_Toc243149876"/>
       <w:r>
         <w:lastRenderedPageBreak/>
         <w:t>3.3 Flujo del registro de un cliente (bandera 1)</w:t>
@@ -6163,7 +6232,7 @@
       <w:pPr>
         <w:pStyle w:val="Heading1"/>
       </w:pPr>
-      <w:bookmarkStart w:id="10" w:name="_Toc243143838"/>
+      <w:bookmarkStart w:id="10" w:name="_Toc243149877"/>
       <w:r>
         <w:lastRenderedPageBreak/>
         <w:t>4. Diseño de la base de datos</w:t>
@@ -6174,7 +6243,7 @@
       <w:pPr>
         <w:pStyle w:val="Heading2"/>
       </w:pPr>
-      <w:bookmarkStart w:id="11" w:name="_Toc243143839"/>
+      <w:bookmarkStart w:id="11" w:name="_Toc243149878"/>
       <w:r>
         <w:t>4.1 Diagrama entidad-relación</w:t>
       </w:r>
@@ -6189,7 +6258,7 @@
           <w:noProof/>
         </w:rPr>
         <w:drawing>
-          <wp:inline distT="0" distB="0" distL="0" distR="0" wp14:anchorId="0B4D9697" wp14:editId="3A96CBE3">
+          <wp:inline distT="0" distB="0" distL="0" distR="0" wp14:anchorId="3504CE33" wp14:editId="14673DAB">
             <wp:extent cx="6191250" cy="4495800"/>
             <wp:effectExtent l="0" t="0" r="0" b="0"/>
             <wp:docPr id="1" name="diagrama_er" descr="Diagrama entidad-relación del onboarding de clientes" title="Diagrama ER"/>
@@ -6272,7 +6341,7 @@
       <w:pPr>
         <w:pStyle w:val="Heading2"/>
       </w:pPr>
-      <w:bookmarkStart w:id="12" w:name="_Toc243143840"/>
+      <w:bookmarkStart w:id="12" w:name="_Toc243149879"/>
       <w:r>
         <w:t>4.2 Diccionario de datos</w:t>
       </w:r>
@@ -12268,7 +12337,7 @@
       <w:pPr>
         <w:pStyle w:val="Heading2"/>
       </w:pPr>
-      <w:bookmarkStart w:id="13" w:name="_Toc243143841"/>
+      <w:bookmarkStart w:id="13" w:name="_Toc243149880"/>
       <w:r>
         <w:t>4.3 Tipos de datos y uso de memoria</w:t>
       </w:r>
@@ -13142,7 +13211,7 @@
       <w:pPr>
         <w:pStyle w:val="Heading2"/>
       </w:pPr>
-      <w:bookmarkStart w:id="14" w:name="_Toc243143842"/>
+      <w:bookmarkStart w:id="14" w:name="_Toc243149881"/>
       <w:r>
         <w:t>4.4 Reglas implementadas con triggers</w:t>
       </w:r>
@@ -13573,7 +13642,7 @@
       <w:pPr>
         <w:pStyle w:val="Heading2"/>
       </w:pPr>
-      <w:bookmarkStart w:id="15" w:name="_Toc243143843"/>
+      <w:bookmarkStart w:id="15" w:name="_Toc243149882"/>
       <w:r>
         <w:t>4.5 Migraciones</w:t>
       </w:r>
@@ -13798,7 +13867,7 @@
         <w:pStyle w:val="Heading1"/>
         <w:pageBreakBefore/>
       </w:pPr>
-      <w:bookmarkStart w:id="16" w:name="_Toc243143844"/>
+      <w:bookmarkStart w:id="16" w:name="_Toc243149883"/>
       <w:r>
         <w:lastRenderedPageBreak/>
         <w:t>5. Validaciones</w:t>
@@ -15558,7 +15627,7 @@
         <w:pStyle w:val="Heading1"/>
         <w:pageBreakBefore/>
       </w:pPr>
-      <w:bookmarkStart w:id="17" w:name="_Toc243143845"/>
+      <w:bookmarkStart w:id="17" w:name="_Toc243149884"/>
       <w:r>
         <w:lastRenderedPageBreak/>
         <w:t>6. Reglas de negocio</w:t>
@@ -16838,7 +16907,7 @@
         <w:pStyle w:val="Heading1"/>
         <w:pageBreakBefore/>
       </w:pPr>
-      <w:bookmarkStart w:id="18" w:name="_Toc243143846"/>
+      <w:bookmarkStart w:id="18" w:name="_Toc243149885"/>
       <w:r>
         <w:lastRenderedPageBreak/>
         <w:t>7. API REST</w:t>
@@ -16849,7 +16918,7 @@
       <w:pPr>
         <w:pStyle w:val="Heading2"/>
       </w:pPr>
-      <w:bookmarkStart w:id="19" w:name="_Toc243143847"/>
+      <w:bookmarkStart w:id="19" w:name="_Toc243149886"/>
       <w:r>
         <w:t>7.1 Endpoints</w:t>
       </w:r>
@@ -17291,7 +17360,7 @@
       <w:pPr>
         <w:pStyle w:val="Heading2"/>
       </w:pPr>
-      <w:bookmarkStart w:id="20" w:name="_Toc243143848"/>
+      <w:bookmarkStart w:id="20" w:name="_Toc243149887"/>
       <w:r>
         <w:t>7.2 Códigos de respuesta</w:t>
       </w:r>
@@ -18127,7 +18196,7 @@
       <w:pPr>
         <w:pStyle w:val="Heading2"/>
       </w:pPr>
-      <w:bookmarkStart w:id="21" w:name="_Toc243143849"/>
+      <w:bookmarkStart w:id="21" w:name="_Toc243149888"/>
       <w:r>
         <w:lastRenderedPageBreak/>
         <w:t>7.3 Ejemplo: registro de un cliente</w:t>
@@ -18668,7 +18737,7 @@
       <w:pPr>
         <w:pStyle w:val="Heading2"/>
       </w:pPr>
-      <w:bookmarkStart w:id="22" w:name="_Toc243143850"/>
+      <w:bookmarkStart w:id="22" w:name="_Toc243149889"/>
       <w:r>
         <w:t>7.4 Actualización y baja lógica</w:t>
       </w:r>
@@ -19002,7 +19071,7 @@
       <w:pPr>
         <w:pStyle w:val="Heading2"/>
       </w:pPr>
-      <w:bookmarkStart w:id="23" w:name="_Toc243143851"/>
+      <w:bookmarkStart w:id="23" w:name="_Toc243149890"/>
       <w:r>
         <w:t>7.5 Consulta de clientes (bandera 4)</w:t>
       </w:r>
@@ -20031,7 +20100,7 @@
       <w:pPr>
         <w:pStyle w:val="Heading2"/>
       </w:pPr>
-      <w:bookmarkStart w:id="24" w:name="_Toc243143852"/>
+      <w:bookmarkStart w:id="24" w:name="_Toc243149891"/>
       <w:r>
         <w:t>7.6 Autenticación y autorización (control de acceso por recurso)</w:t>
       </w:r>
@@ -21097,7 +21166,7 @@
       <w:pPr>
         <w:pStyle w:val="Heading2"/>
       </w:pPr>
-      <w:bookmarkStart w:id="25" w:name="_Toc243143853"/>
+      <w:bookmarkStart w:id="25" w:name="_Toc243149892"/>
       <w:r>
         <w:t>7.7 Escenarios de error por endpoint</w:t>
       </w:r>
@@ -22446,7 +22515,7 @@
         <w:pStyle w:val="Heading1"/>
         <w:pageBreakBefore/>
       </w:pPr>
-      <w:bookmarkStart w:id="26" w:name="_Toc243143854"/>
+      <w:bookmarkStart w:id="26" w:name="_Toc243149893"/>
       <w:r>
         <w:lastRenderedPageBreak/>
         <w:t>8. Manejo de excepciones y validación</w:t>
@@ -22547,7 +22616,7 @@
       <w:pPr>
         <w:pStyle w:val="Heading2"/>
       </w:pPr>
-      <w:bookmarkStart w:id="27" w:name="_Toc243143855"/>
+      <w:bookmarkStart w:id="27" w:name="_Toc243149894"/>
       <w:r>
         <w:t>8.1 Validación de entrada</w:t>
       </w:r>
@@ -22855,7 +22924,7 @@
       <w:pPr>
         <w:pStyle w:val="Heading2"/>
       </w:pPr>
-      <w:bookmarkStart w:id="28" w:name="_Toc243143856"/>
+      <w:bookmarkStart w:id="28" w:name="_Toc243149895"/>
       <w:r>
         <w:t>8.2 Excepciones de negocio</w:t>
       </w:r>
@@ -23838,7 +23907,7 @@
       <w:pPr>
         <w:pStyle w:val="Heading2"/>
       </w:pPr>
-      <w:bookmarkStart w:id="29" w:name="_Toc243143857"/>
+      <w:bookmarkStart w:id="29" w:name="_Toc243149896"/>
       <w:r>
         <w:lastRenderedPageBreak/>
         <w:t>8.3 Errores técnicos</w:t>
@@ -24650,7 +24719,7 @@
       <w:pPr>
         <w:pStyle w:val="Heading2"/>
       </w:pPr>
-      <w:bookmarkStart w:id="30" w:name="_Toc243143858"/>
+      <w:bookmarkStart w:id="30" w:name="_Toc243149897"/>
       <w:r>
         <w:t>8.4 Cumplimiento de los lineamientos de la API</w:t>
       </w:r>
@@ -25807,7 +25876,7 @@
         <w:pStyle w:val="Heading1"/>
         <w:pageBreakBefore/>
       </w:pPr>
-      <w:bookmarkStart w:id="31" w:name="_Toc243143859"/>
+      <w:bookmarkStart w:id="31" w:name="_Toc243149898"/>
       <w:r>
         <w:lastRenderedPageBreak/>
         <w:t>9. Seguridad y rendimiento</w:t>
@@ -26956,7 +27025,7 @@
         <w:pStyle w:val="Heading1"/>
         <w:pageBreakBefore/>
       </w:pPr>
-      <w:bookmarkStart w:id="32" w:name="_Toc243143860"/>
+      <w:bookmarkStart w:id="32" w:name="_Toc243149899"/>
       <w:r>
         <w:lastRenderedPageBreak/>
         <w:t>10. Pruebas y evidencias</w:t>
@@ -26967,7 +27036,7 @@
       <w:pPr>
         <w:pStyle w:val="Heading2"/>
       </w:pPr>
-      <w:bookmarkStart w:id="33" w:name="_Toc243143861"/>
+      <w:bookmarkStart w:id="33" w:name="_Toc243149900"/>
       <w:r>
         <w:t>10.1 Evidencias en Swagger UI</w:t>
       </w:r>
@@ -28403,10 +28472,10 @@
           <w:noProof/>
         </w:rPr>
         <w:drawing>
-          <wp:inline distT="0" distB="0" distL="0" distR="0" wp14:anchorId="4618A3AC" wp14:editId="3A4BE004">
+          <wp:inline distT="0" distB="0" distL="0" distR="0" wp14:anchorId="57B57301" wp14:editId="6709DBCE">
             <wp:extent cx="4857750" cy="7334250"/>
             <wp:effectExtent l="0" t="0" r="0" b="0"/>
-            <wp:docPr id="220776342" name="01_1.png" descr="Registro exitoso de un cliente" title="Swagger · POST /api/v1/layaway/cliente · ÉXITO (201 Created)"/>
+            <wp:docPr id="807073929" name="01_1.png" descr="Registro exitoso de un cliente" title="Swagger · POST /api/v1/layaway/cliente · ÉXITO (201 Created)"/>
             <wp:cNvGraphicFramePr>
               <a:graphicFrameLocks xmlns:a="http://schemas.openxmlformats.org/drawingml/2006/main" noChangeAspect="1"/>
             </wp:cNvGraphicFramePr>
@@ -28467,10 +28536,10 @@
           <w:noProof/>
         </w:rPr>
         <w:drawing>
-          <wp:inline distT="0" distB="0" distL="0" distR="0" wp14:anchorId="0BDDCDD3" wp14:editId="572DDF5C">
+          <wp:inline distT="0" distB="0" distL="0" distR="0" wp14:anchorId="00426401" wp14:editId="0E0318A3">
             <wp:extent cx="4972050" cy="7334250"/>
             <wp:effectExtent l="0" t="0" r="0" b="0"/>
-            <wp:docPr id="507844606" name="01_2.png" descr="Registro exitoso de un cliente" title="Swagger · POST /api/v1/layaway/cliente · ÉXITO (201 Created)"/>
+            <wp:docPr id="1901129742" name="01_2.png" descr="Registro exitoso de un cliente" title="Swagger · POST /api/v1/layaway/cliente · ÉXITO (201 Created)"/>
             <wp:cNvGraphicFramePr>
               <a:graphicFrameLocks xmlns:a="http://schemas.openxmlformats.org/drawingml/2006/main" noChangeAspect="1"/>
             </wp:cNvGraphicFramePr>
@@ -28531,10 +28600,10 @@
           <w:noProof/>
         </w:rPr>
         <w:drawing>
-          <wp:inline distT="0" distB="0" distL="0" distR="0" wp14:anchorId="15DE9FBF" wp14:editId="18A31544">
+          <wp:inline distT="0" distB="0" distL="0" distR="0" wp14:anchorId="27D4E761" wp14:editId="2DBD44FE">
             <wp:extent cx="4857750" cy="7334250"/>
             <wp:effectExtent l="0" t="0" r="0" b="0"/>
-            <wp:docPr id="1341227513" name="02_1.png" descr="Registro con datos inválidos" title="Swagger · POST /api/v1/layaway/cliente · ERROR (400 Bad Request)"/>
+            <wp:docPr id="1765723985" name="02_1.png" descr="Registro con datos inválidos" title="Swagger · POST /api/v1/layaway/cliente · ERROR (400 Bad Request)"/>
             <wp:cNvGraphicFramePr>
               <a:graphicFrameLocks xmlns:a="http://schemas.openxmlformats.org/drawingml/2006/main" noChangeAspect="1"/>
             </wp:cNvGraphicFramePr>
@@ -28595,10 +28664,10 @@
           <w:noProof/>
         </w:rPr>
         <w:drawing>
-          <wp:inline distT="0" distB="0" distL="0" distR="0" wp14:anchorId="437391FE" wp14:editId="43B49145">
+          <wp:inline distT="0" distB="0" distL="0" distR="0" wp14:anchorId="510C9EA3" wp14:editId="6C2EAF4D">
             <wp:extent cx="4352925" cy="7334250"/>
             <wp:effectExtent l="0" t="0" r="0" b="0"/>
-            <wp:docPr id="1081714215" name="02_2.png" descr="Registro con datos inválidos" title="Swagger · POST /api/v1/layaway/cliente · ERROR (400 Bad Request)"/>
+            <wp:docPr id="941985461" name="02_2.png" descr="Registro con datos inválidos" title="Swagger · POST /api/v1/layaway/cliente · ERROR (400 Bad Request)"/>
             <wp:cNvGraphicFramePr>
               <a:graphicFrameLocks xmlns:a="http://schemas.openxmlformats.org/drawingml/2006/main" noChangeAspect="1"/>
             </wp:cNvGraphicFramePr>
@@ -28659,10 +28728,10 @@
           <w:noProof/>
         </w:rPr>
         <w:drawing>
-          <wp:inline distT="0" distB="0" distL="0" distR="0" wp14:anchorId="0135CF4C" wp14:editId="085E582D">
+          <wp:inline distT="0" distB="0" distL="0" distR="0" wp14:anchorId="5607FFE1" wp14:editId="0BF02B97">
             <wp:extent cx="5943600" cy="5657850"/>
             <wp:effectExtent l="0" t="0" r="0" b="0"/>
-            <wp:docPr id="305535714" name="03_1.png" descr="Inicio de sesión exitoso" title="Swagger · POST /api/v1/auth/login · ÉXITO (200 OK)"/>
+            <wp:docPr id="1100984310" name="03_1.png" descr="Inicio de sesión exitoso" title="Swagger · POST /api/v1/auth/login · ÉXITO (200 OK)"/>
             <wp:cNvGraphicFramePr>
               <a:graphicFrameLocks xmlns:a="http://schemas.openxmlformats.org/drawingml/2006/main" noChangeAspect="1"/>
             </wp:cNvGraphicFramePr>
@@ -28723,10 +28792,10 @@
           <w:noProof/>
         </w:rPr>
         <w:drawing>
-          <wp:inline distT="0" distB="0" distL="0" distR="0" wp14:anchorId="2669675B" wp14:editId="34AEC518">
+          <wp:inline distT="0" distB="0" distL="0" distR="0" wp14:anchorId="17C4F2F6" wp14:editId="79A97632">
             <wp:extent cx="5943600" cy="5105400"/>
             <wp:effectExtent l="0" t="0" r="0" b="0"/>
-            <wp:docPr id="525970856" name="03_2.png" descr="Inicio de sesión exitoso" title="Swagger · POST /api/v1/auth/login · ÉXITO (200 OK)"/>
+            <wp:docPr id="576438672" name="03_2.png" descr="Inicio de sesión exitoso" title="Swagger · POST /api/v1/auth/login · ÉXITO (200 OK)"/>
             <wp:cNvGraphicFramePr>
               <a:graphicFrameLocks xmlns:a="http://schemas.openxmlformats.org/drawingml/2006/main" noChangeAspect="1"/>
             </wp:cNvGraphicFramePr>
@@ -28787,10 +28856,10 @@
           <w:noProof/>
         </w:rPr>
         <w:drawing>
-          <wp:inline distT="0" distB="0" distL="0" distR="0" wp14:anchorId="2FCC004D" wp14:editId="40344C3F">
+          <wp:inline distT="0" distB="0" distL="0" distR="0" wp14:anchorId="75284A28" wp14:editId="25B1D340">
             <wp:extent cx="5943600" cy="5657850"/>
             <wp:effectExtent l="0" t="0" r="0" b="0"/>
-            <wp:docPr id="553198151" name="04_1.png" descr="Inicio de sesión con contraseña incorrecta" title="Swagger · POST /api/v1/auth/login · ERROR (401 Unauthorized)"/>
+            <wp:docPr id="1118654497" name="04_1.png" descr="Inicio de sesión con contraseña incorrecta" title="Swagger · POST /api/v1/auth/login · ERROR (401 Unauthorized)"/>
             <wp:cNvGraphicFramePr>
               <a:graphicFrameLocks xmlns:a="http://schemas.openxmlformats.org/drawingml/2006/main" noChangeAspect="1"/>
             </wp:cNvGraphicFramePr>
@@ -28851,10 +28920,10 @@
           <w:noProof/>
         </w:rPr>
         <w:drawing>
-          <wp:inline distT="0" distB="0" distL="0" distR="0" wp14:anchorId="315DECE9" wp14:editId="7B566488">
+          <wp:inline distT="0" distB="0" distL="0" distR="0" wp14:anchorId="3201F553" wp14:editId="102D380A">
             <wp:extent cx="5943600" cy="4495800"/>
             <wp:effectExtent l="0" t="0" r="0" b="0"/>
-            <wp:docPr id="2019294013" name="04_2.png" descr="Inicio de sesión con contraseña incorrecta" title="Swagger · POST /api/v1/auth/login · ERROR (401 Unauthorized)"/>
+            <wp:docPr id="1924257237" name="04_2.png" descr="Inicio de sesión con contraseña incorrecta" title="Swagger · POST /api/v1/auth/login · ERROR (401 Unauthorized)"/>
             <wp:cNvGraphicFramePr>
               <a:graphicFrameLocks xmlns:a="http://schemas.openxmlformats.org/drawingml/2006/main" noChangeAspect="1"/>
             </wp:cNvGraphicFramePr>
@@ -28915,10 +28984,10 @@
           <w:noProof/>
         </w:rPr>
         <w:drawing>
-          <wp:inline distT="0" distB="0" distL="0" distR="0" wp14:anchorId="3C5BB6F5" wp14:editId="2586B118">
+          <wp:inline distT="0" distB="0" distL="0" distR="0" wp14:anchorId="31CB84AA" wp14:editId="67AD4DF7">
             <wp:extent cx="5286375" cy="7334250"/>
             <wp:effectExtent l="0" t="0" r="0" b="0"/>
-            <wp:docPr id="216712080" name="05_1.png" descr="Consulta del catálogo de nacionalidades" title="Swagger · GET /api/v1/cat/nacionalidades · ÉXITO (200 OK)"/>
+            <wp:docPr id="911689614" name="05_1.png" descr="Consulta del catálogo de nacionalidades" title="Swagger · GET /api/v1/cat/nacionalidades · ÉXITO (200 OK)"/>
             <wp:cNvGraphicFramePr>
               <a:graphicFrameLocks xmlns:a="http://schemas.openxmlformats.org/drawingml/2006/main" noChangeAspect="1"/>
             </wp:cNvGraphicFramePr>
@@ -28979,10 +29048,10 @@
           <w:noProof/>
         </w:rPr>
         <w:drawing>
-          <wp:inline distT="0" distB="0" distL="0" distR="0" wp14:anchorId="3B44A243" wp14:editId="5311B530">
+          <wp:inline distT="0" distB="0" distL="0" distR="0" wp14:anchorId="7E94DF42" wp14:editId="3045E1B6">
             <wp:extent cx="5943600" cy="6877050"/>
             <wp:effectExtent l="0" t="0" r="0" b="0"/>
-            <wp:docPr id="1773272245" name="06_1.png" descr="Consulta autorizada por el ejecutivo" title="Swagger · POST /api/v1/layaway/cliente (bandera 4) · ÉXITO con token de ejecutivo (200 OK)"/>
+            <wp:docPr id="1870285410" name="06_1.png" descr="Consulta autorizada por el ejecutivo" title="Swagger · POST /api/v1/layaway/cliente (bandera 4) · ÉXITO con token de ejecutivo (200 OK)"/>
             <wp:cNvGraphicFramePr>
               <a:graphicFrameLocks xmlns:a="http://schemas.openxmlformats.org/drawingml/2006/main" noChangeAspect="1"/>
             </wp:cNvGraphicFramePr>
@@ -29043,10 +29112,10 @@
           <w:noProof/>
         </w:rPr>
         <w:drawing>
-          <wp:inline distT="0" distB="0" distL="0" distR="0" wp14:anchorId="6960CBE6" wp14:editId="417B321D">
+          <wp:inline distT="0" distB="0" distL="0" distR="0" wp14:anchorId="03F0CAFA" wp14:editId="47A793B7">
             <wp:extent cx="5943600" cy="6562725"/>
             <wp:effectExtent l="0" t="0" r="0" b="0"/>
-            <wp:docPr id="2127397142" name="06_2.png" descr="Consulta autorizada por el ejecutivo" title="Swagger · POST /api/v1/layaway/cliente (bandera 4) · ÉXITO con token de ejecutivo (200 OK)"/>
+            <wp:docPr id="944974188" name="06_2.png" descr="Consulta autorizada por el ejecutivo" title="Swagger · POST /api/v1/layaway/cliente (bandera 4) · ÉXITO con token de ejecutivo (200 OK)"/>
             <wp:cNvGraphicFramePr>
               <a:graphicFrameLocks xmlns:a="http://schemas.openxmlformats.org/drawingml/2006/main" noChangeAspect="1"/>
             </wp:cNvGraphicFramePr>
@@ -29107,10 +29176,10 @@
           <w:noProof/>
         </w:rPr>
         <w:drawing>
-          <wp:inline distT="0" distB="0" distL="0" distR="0" wp14:anchorId="2E3E4A2B" wp14:editId="26B01FFA">
+          <wp:inline distT="0" distB="0" distL="0" distR="0" wp14:anchorId="02DAA47B" wp14:editId="18E4C3B9">
             <wp:extent cx="5943600" cy="6877050"/>
             <wp:effectExtent l="0" t="0" r="0" b="0"/>
-            <wp:docPr id="37111316" name="07_1.png" descr="Consulta sin token" title="Swagger · POST /api/v1/layaway/cliente (bandera 4) · ERROR sin token (401 Unauthorized)"/>
+            <wp:docPr id="666013073" name="07_1.png" descr="Consulta sin token" title="Swagger · POST /api/v1/layaway/cliente (bandera 4) · ERROR sin token (401 Unauthorized)"/>
             <wp:cNvGraphicFramePr>
               <a:graphicFrameLocks xmlns:a="http://schemas.openxmlformats.org/drawingml/2006/main" noChangeAspect="1"/>
             </wp:cNvGraphicFramePr>
@@ -29171,10 +29240,10 @@
           <w:noProof/>
         </w:rPr>
         <w:drawing>
-          <wp:inline distT="0" distB="0" distL="0" distR="0" wp14:anchorId="4DC770D1" wp14:editId="773FE833">
+          <wp:inline distT="0" distB="0" distL="0" distR="0" wp14:anchorId="1B355D2A" wp14:editId="6943CD47">
             <wp:extent cx="5943600" cy="4695825"/>
             <wp:effectExtent l="0" t="0" r="0" b="0"/>
-            <wp:docPr id="613763780" name="07_2.png" descr="Consulta sin token" title="Swagger · POST /api/v1/layaway/cliente (bandera 4) · ERROR sin token (401 Unauthorized)"/>
+            <wp:docPr id="310661981" name="07_2.png" descr="Consulta sin token" title="Swagger · POST /api/v1/layaway/cliente (bandera 4) · ERROR sin token (401 Unauthorized)"/>
             <wp:cNvGraphicFramePr>
               <a:graphicFrameLocks xmlns:a="http://schemas.openxmlformats.org/drawingml/2006/main" noChangeAspect="1"/>
             </wp:cNvGraphicFramePr>
@@ -29235,10 +29304,10 @@
           <w:noProof/>
         </w:rPr>
         <w:drawing>
-          <wp:inline distT="0" distB="0" distL="0" distR="0" wp14:anchorId="69BBEA68" wp14:editId="691C779D">
+          <wp:inline distT="0" distB="0" distL="0" distR="0" wp14:anchorId="6926FF65" wp14:editId="1820C765">
             <wp:extent cx="5943600" cy="6877050"/>
             <wp:effectExtent l="0" t="0" r="0" b="0"/>
-            <wp:docPr id="154402442" name="08_1.png" descr="Un cliente consulta el registro de otro" title="Swagger · POST /api/v1/layaway/cliente (bandera 4) · ERROR registro ajeno (404 Not Found)"/>
+            <wp:docPr id="1350616078" name="08_1.png" descr="Un cliente consulta el registro de otro" title="Swagger · POST /api/v1/layaway/cliente (bandera 4) · ERROR registro ajeno (404 Not Found)"/>
             <wp:cNvGraphicFramePr>
               <a:graphicFrameLocks xmlns:a="http://schemas.openxmlformats.org/drawingml/2006/main" noChangeAspect="1"/>
             </wp:cNvGraphicFramePr>
@@ -29299,10 +29368,10 @@
           <w:noProof/>
         </w:rPr>
         <w:drawing>
-          <wp:inline distT="0" distB="0" distL="0" distR="0" wp14:anchorId="0425A817" wp14:editId="33AE3CF8">
+          <wp:inline distT="0" distB="0" distL="0" distR="0" wp14:anchorId="3C8E3147" wp14:editId="3605447D">
             <wp:extent cx="5943600" cy="4695825"/>
             <wp:effectExtent l="0" t="0" r="0" b="0"/>
-            <wp:docPr id="424811862" name="08_2.png" descr="Un cliente consulta el registro de otro" title="Swagger · POST /api/v1/layaway/cliente (bandera 4) · ERROR registro ajeno (404 Not Found)"/>
+            <wp:docPr id="1938362362" name="08_2.png" descr="Un cliente consulta el registro de otro" title="Swagger · POST /api/v1/layaway/cliente (bandera 4) · ERROR registro ajeno (404 Not Found)"/>
             <wp:cNvGraphicFramePr>
               <a:graphicFrameLocks xmlns:a="http://schemas.openxmlformats.org/drawingml/2006/main" noChangeAspect="1"/>
             </wp:cNvGraphicFramePr>
@@ -29343,7 +29412,7 @@
         <w:pStyle w:val="Heading2"/>
         <w:pageBreakBefore/>
       </w:pPr>
-      <w:bookmarkStart w:id="34" w:name="_Toc243143862"/>
+      <w:bookmarkStart w:id="34" w:name="_Toc243149901"/>
       <w:r>
         <w:lastRenderedPageBreak/>
         <w:t>10.2 Pruebas unitarias</w:t>
@@ -29374,7 +29443,7 @@
           <w:b/>
           <w:bCs/>
         </w:rPr>
-        <w:t>249 de 249 pruebas exitosas</w:t>
+        <w:t>258 de 258 pruebas exitosas</w:t>
       </w:r>
       <w:r>
         <w:t>.</w:t>
@@ -30184,7 +30253,7 @@
                 <w:sz w:val="19"/>
                 <w:szCs w:val="19"/>
               </w:rPr>
-              <w:t>17</w:t>
+              <w:t>18</w:t>
             </w:r>
           </w:p>
         </w:tc>
@@ -30226,7 +30295,7 @@
                 <w:sz w:val="19"/>
                 <w:szCs w:val="19"/>
               </w:rPr>
-              <w:t xml:space="preserve"> antes de llegar al servicio, un caso por cada excepción de negocio (401, 403, 404, 409, 400, 423), 415, JSON roto y 500 sin exponer SQL ni clases</w:t>
+              <w:t xml:space="preserve"> antes de llegar al servicio, un caso por cada excepción de negocio (401, 403, 404, 409, 400, 423), XML y Content-Type incorrecto (415), JSON roto y 500 sin exponer SQL ni clases</w:t>
             </w:r>
           </w:p>
         </w:tc>
@@ -30447,7 +30516,7 @@
                 <w:sz w:val="19"/>
                 <w:szCs w:val="19"/>
               </w:rPr>
-              <w:t>PasswordEncoderUtilTest</w:t>
+              <w:t>TextoEstrictoOnboardingConfigTest</w:t>
             </w:r>
           </w:p>
         </w:tc>
@@ -30473,7 +30542,7 @@
                 <w:sz w:val="19"/>
                 <w:szCs w:val="19"/>
               </w:rPr>
-              <w:t>3</w:t>
+              <w:t>8</w:t>
             </w:r>
           </w:p>
         </w:tc>
@@ -30499,7 +30568,7 @@
                 <w:sz w:val="19"/>
                 <w:szCs w:val="19"/>
               </w:rPr>
-              <w:t>Sal aleatoria, compatibilidad con hashes antiguos, hashes malformados</w:t>
+              <w:t>Los campos de texto de los DTO de onboarding rechazan números y booleanos; las clases de otros módulos no cambian</w:t>
             </w:r>
           </w:p>
         </w:tc>
@@ -30535,6 +30604,94 @@
                 <w:sz w:val="19"/>
                 <w:szCs w:val="19"/>
               </w:rPr>
+              <w:t>PasswordEncoderUtilTest</w:t>
+            </w:r>
+          </w:p>
+        </w:tc>
+        <w:tc>
+          <w:tcPr>
+            <w:tcW w:w="1000" w:type="dxa"/>
+            <w:tcBorders>
+              <w:top w:val="single" w:sz="4" w:space="0" w:color="BFC7D5"/>
+              <w:left w:val="single" w:sz="4" w:space="0" w:color="BFC7D5"/>
+              <w:bottom w:val="single" w:sz="4" w:space="0" w:color="BFC7D5"/>
+              <w:right w:val="single" w:sz="4" w:space="0" w:color="BFC7D5"/>
+            </w:tcBorders>
+            <w:tcMar>
+              <w:top w:w="60" w:type="dxa"/>
+              <w:left w:w="100" w:type="dxa"/>
+              <w:bottom w:w="60" w:type="dxa"/>
+              <w:right w:w="100" w:type="dxa"/>
+            </w:tcMar>
+          </w:tcPr>
+          <w:p>
+            <w:r>
+              <w:rPr>
+                <w:sz w:val="19"/>
+                <w:szCs w:val="19"/>
+              </w:rPr>
+              <w:t>3</w:t>
+            </w:r>
+          </w:p>
+        </w:tc>
+        <w:tc>
+          <w:tcPr>
+            <w:tcW w:w="5360" w:type="dxa"/>
+            <w:tcBorders>
+              <w:top w:val="single" w:sz="4" w:space="0" w:color="BFC7D5"/>
+              <w:left w:val="single" w:sz="4" w:space="0" w:color="BFC7D5"/>
+              <w:bottom w:val="single" w:sz="4" w:space="0" w:color="BFC7D5"/>
+              <w:right w:val="single" w:sz="4" w:space="0" w:color="BFC7D5"/>
+            </w:tcBorders>
+            <w:tcMar>
+              <w:top w:w="60" w:type="dxa"/>
+              <w:left w:w="100" w:type="dxa"/>
+              <w:bottom w:w="60" w:type="dxa"/>
+              <w:right w:w="100" w:type="dxa"/>
+            </w:tcMar>
+          </w:tcPr>
+          <w:p>
+            <w:r>
+              <w:rPr>
+                <w:sz w:val="19"/>
+                <w:szCs w:val="19"/>
+              </w:rPr>
+              <w:t>Sal aleatoria, compatibilidad con hashes antiguos, hashes malformados</w:t>
+            </w:r>
+          </w:p>
+        </w:tc>
+      </w:tr>
+      <w:tr>
+        <w:tblPrEx>
+          <w:tblCellMar>
+            <w:top w:w="0" w:type="dxa"/>
+            <w:bottom w:w="0" w:type="dxa"/>
+          </w:tblCellMar>
+        </w:tblPrEx>
+        <w:tc>
+          <w:tcPr>
+            <w:tcW w:w="3000" w:type="dxa"/>
+            <w:tcBorders>
+              <w:top w:val="single" w:sz="4" w:space="0" w:color="BFC7D5"/>
+              <w:left w:val="single" w:sz="4" w:space="0" w:color="BFC7D5"/>
+              <w:bottom w:val="single" w:sz="4" w:space="0" w:color="BFC7D5"/>
+              <w:right w:val="single" w:sz="4" w:space="0" w:color="BFC7D5"/>
+            </w:tcBorders>
+            <w:tcMar>
+              <w:top w:w="60" w:type="dxa"/>
+              <w:left w:w="100" w:type="dxa"/>
+              <w:bottom w:w="60" w:type="dxa"/>
+              <w:right w:w="100" w:type="dxa"/>
+            </w:tcMar>
+          </w:tcPr>
+          <w:p>
+            <w:r>
+              <w:rPr>
+                <w:rFonts w:ascii="Consolas" w:eastAsia="Consolas" w:hAnsi="Consolas" w:cs="Consolas"/>
+                <w:color w:val="7C2D12"/>
+                <w:sz w:val="19"/>
+                <w:szCs w:val="19"/>
+              </w:rPr>
               <w:t>ProductosServiceImplTest</w:t>
             </w:r>
           </w:p>
@@ -30597,7 +30754,7 @@
       <w:pPr>
         <w:pStyle w:val="Heading2"/>
       </w:pPr>
-      <w:bookmarkStart w:id="35" w:name="_Toc243143863"/>
+      <w:bookmarkStart w:id="35" w:name="_Toc243149902"/>
       <w:r>
         <w:t>10.3 Pruebas de seguridad, validación, concurrencia y carga</w:t>
       </w:r>
@@ -31497,7 +31654,7 @@
       <w:pPr>
         <w:pStyle w:val="Heading2"/>
       </w:pPr>
-      <w:bookmarkStart w:id="36" w:name="_Toc243143864"/>
+      <w:bookmarkStart w:id="36" w:name="_Toc243149903"/>
       <w:r>
         <w:t>10.4 Resultados de carga</w:t>
       </w:r>
@@ -31840,7 +31997,7 @@
       <w:pPr>
         <w:pStyle w:val="Heading2"/>
       </w:pPr>
-      <w:bookmarkStart w:id="37" w:name="_Toc243143865"/>
+      <w:bookmarkStart w:id="37" w:name="_Toc243149904"/>
       <w:r>
         <w:t>10.5 Autenticación y autorización a nivel de recurso</w:t>
       </w:r>
@@ -32922,11 +33079,270 @@
       <w:pPr>
         <w:pStyle w:val="Heading2"/>
       </w:pPr>
-      <w:bookmarkStart w:id="38" w:name="_Toc243143866"/>
-      <w:r>
-        <w:t>10.6 Reglas en la base de datos</w:t>
+      <w:bookmarkStart w:id="38" w:name="_Toc243149905"/>
+      <w:r>
+        <w:t>10.6 Validación extrema contra la API publicada</w:t>
       </w:r>
       <w:bookmarkEnd w:id="38"/>
+    </w:p>
+    <w:p>
+      <w:pPr>
+        <w:spacing w:after="120" w:line="276" w:lineRule="auto"/>
+      </w:pPr>
+      <w:r>
+        <w:t xml:space="preserve">El script </w:t>
+      </w:r>
+      <w:r>
+        <w:rPr>
+          <w:rFonts w:ascii="Consolas" w:eastAsia="Consolas" w:hAnsi="Consolas" w:cs="Consolas"/>
+          <w:color w:val="7C2D12"/>
+          <w:sz w:val="19"/>
+          <w:szCs w:val="19"/>
+        </w:rPr>
+        <w:t>docs/evidencias/pruebas_validacion_extrema.py</w:t>
+      </w:r>
+      <w:r>
+        <w:t xml:space="preserve"> ejecuta </w:t>
+      </w:r>
+      <w:r>
+        <w:rPr>
+          <w:b/>
+          <w:bCs/>
+        </w:rPr>
+        <w:t>239 casos</w:t>
+      </w:r>
+      <w:r>
+        <w:t xml:space="preserve"> de forma secuencial y con pausa entre peticiones (busca romper las validaciones, no saturar Render). Ninguna respuesta puede ser 500 ni incluir trazas, clases o SQL. Cubre JSON crudo y bandera, cabeceras y métodos (incluido XML con XXE), cada campo del registro con valores inválidos, campos del servidor inyectados (</w:t>
+      </w:r>
+      <w:r>
+        <w:rPr>
+          <w:rFonts w:ascii="Consolas" w:eastAsia="Consolas" w:hAnsi="Consolas" w:cs="Consolas"/>
+          <w:color w:val="7C2D12"/>
+          <w:sz w:val="19"/>
+          <w:szCs w:val="19"/>
+        </w:rPr>
+        <w:t>rol</w:t>
+      </w:r>
+      <w:r>
+        <w:t xml:space="preserve">, </w:t>
+      </w:r>
+      <w:r>
+        <w:rPr>
+          <w:rFonts w:ascii="Consolas" w:eastAsia="Consolas" w:hAnsi="Consolas" w:cs="Consolas"/>
+          <w:color w:val="7C2D12"/>
+          <w:sz w:val="19"/>
+          <w:szCs w:val="19"/>
+        </w:rPr>
+        <w:t>saldoInicial</w:t>
+      </w:r>
+      <w:r>
+        <w:t xml:space="preserve">, </w:t>
+      </w:r>
+      <w:r>
+        <w:rPr>
+          <w:rFonts w:ascii="Consolas" w:eastAsia="Consolas" w:hAnsi="Consolas" w:cs="Consolas"/>
+          <w:color w:val="7C2D12"/>
+          <w:sz w:val="19"/>
+          <w:szCs w:val="19"/>
+        </w:rPr>
+        <w:t>activo</w:t>
+      </w:r>
+      <w:r>
+        <w:t xml:space="preserve">, </w:t>
+      </w:r>
+      <w:r>
+        <w:rPr>
+          <w:rFonts w:ascii="Consolas" w:eastAsia="Consolas" w:hAnsi="Consolas" w:cs="Consolas"/>
+          <w:color w:val="7C2D12"/>
+          <w:sz w:val="19"/>
+          <w:szCs w:val="19"/>
+        </w:rPr>
+        <w:t>numeroCuenta</w:t>
+      </w:r>
+      <w:r>
+        <w:t>), unicidad, login, manipulación del token y, como cliente autenticado, filtros, actualización y baja.</w:t>
+      </w:r>
+    </w:p>
+    <w:p>
+      <w:pPr>
+        <w:spacing w:after="120" w:line="276" w:lineRule="auto"/>
+      </w:pPr>
+      <w:r>
+        <w:t>La primera ejecución contra Render encontró dos fallos, ya corregidos:</w:t>
+      </w:r>
+    </w:p>
+    <w:p>
+      <w:pPr>
+        <w:pStyle w:val="ListParagraph"/>
+        <w:numPr>
+          <w:ilvl w:val="0"/>
+          <w:numId w:val="3"/>
+        </w:numPr>
+        <w:spacing w:after="60"/>
+      </w:pPr>
+      <w:r>
+        <w:rPr>
+          <w:b/>
+          <w:bCs/>
+        </w:rPr>
+        <w:t>Números y booleanos aceptados en campos de texto:</w:t>
+      </w:r>
+      <w:r>
+        <w:t xml:space="preserve"> </w:t>
+      </w:r>
+      <w:r>
+        <w:rPr>
+          <w:rFonts w:ascii="Consolas" w:eastAsia="Consolas" w:hAnsi="Consolas" w:cs="Consolas"/>
+          <w:color w:val="7C2D12"/>
+          <w:sz w:val="19"/>
+          <w:szCs w:val="19"/>
+        </w:rPr>
+        <w:t>"nombre": true</w:t>
+      </w:r>
+      <w:r>
+        <w:t xml:space="preserve"> registraba un cliente llamado «true». Ahora todo campo de texto de los DTO de onboarding exige un valor entre comillas (</w:t>
+      </w:r>
+      <w:r>
+        <w:rPr>
+          <w:rFonts w:ascii="Consolas" w:eastAsia="Consolas" w:hAnsi="Consolas" w:cs="Consolas"/>
+          <w:color w:val="7C2D12"/>
+          <w:sz w:val="19"/>
+          <w:szCs w:val="19"/>
+        </w:rPr>
+        <w:t>TextoEstrictoOnboardingConfig</w:t>
+      </w:r>
+      <w:r>
+        <w:t>).</w:t>
+      </w:r>
+    </w:p>
+    <w:p>
+      <w:pPr>
+        <w:pStyle w:val="ListParagraph"/>
+        <w:numPr>
+          <w:ilvl w:val="0"/>
+          <w:numId w:val="3"/>
+        </w:numPr>
+        <w:spacing w:after="60"/>
+      </w:pPr>
+      <w:r>
+        <w:rPr>
+          <w:b/>
+          <w:bCs/>
+        </w:rPr>
+        <w:t>La API aceptaba y respondía XML:</w:t>
+      </w:r>
+      <w:r>
+        <w:t xml:space="preserve"> los endpoints de onboarding declaran </w:t>
+      </w:r>
+      <w:r>
+        <w:rPr>
+          <w:rFonts w:ascii="Consolas" w:eastAsia="Consolas" w:hAnsi="Consolas" w:cs="Consolas"/>
+          <w:color w:val="7C2D12"/>
+          <w:sz w:val="19"/>
+          <w:szCs w:val="19"/>
+        </w:rPr>
+        <w:t>consumes</w:t>
+      </w:r>
+      <w:r>
+        <w:t>/</w:t>
+      </w:r>
+      <w:r>
+        <w:rPr>
+          <w:rFonts w:ascii="Consolas" w:eastAsia="Consolas" w:hAnsi="Consolas" w:cs="Consolas"/>
+          <w:color w:val="7C2D12"/>
+          <w:sz w:val="19"/>
+          <w:szCs w:val="19"/>
+        </w:rPr>
+        <w:t>produces</w:t>
+      </w:r>
+      <w:r>
+        <w:t xml:space="preserve"> </w:t>
+      </w:r>
+      <w:r>
+        <w:rPr>
+          <w:rFonts w:ascii="Consolas" w:eastAsia="Consolas" w:hAnsi="Consolas" w:cs="Consolas"/>
+          <w:color w:val="7C2D12"/>
+          <w:sz w:val="19"/>
+          <w:szCs w:val="19"/>
+        </w:rPr>
+        <w:t>application/json</w:t>
+      </w:r>
+      <w:r>
+        <w:t>; un cuerpo XML responde 415.</w:t>
+      </w:r>
+    </w:p>
+    <w:p>
+      <w:pPr>
+        <w:spacing w:after="120" w:line="276" w:lineRule="auto"/>
+      </w:pPr>
+      <w:r>
+        <w:t xml:space="preserve">Resultado tras la corrección (API local con PostgreSQL): </w:t>
+      </w:r>
+      <w:r>
+        <w:rPr>
+          <w:b/>
+          <w:bCs/>
+        </w:rPr>
+        <w:t>239 de 239 exitosos</w:t>
+      </w:r>
+      <w:r>
+        <w:t xml:space="preserve"> (</w:t>
+      </w:r>
+      <w:r>
+        <w:rPr>
+          <w:rFonts w:ascii="Consolas" w:eastAsia="Consolas" w:hAnsi="Consolas" w:cs="Consolas"/>
+          <w:color w:val="7C2D12"/>
+          <w:sz w:val="19"/>
+          <w:szCs w:val="19"/>
+        </w:rPr>
+        <w:t>docs/evidencias/resultado_pruebas_validacion_extrema_local.txt</w:t>
+      </w:r>
+      <w:r>
+        <w:t>).</w:t>
+      </w:r>
+    </w:p>
+    <w:p>
+      <w:pPr>
+        <w:pBdr>
+          <w:left w:val="single" w:sz="18" w:space="8" w:color="1E3A5F"/>
+        </w:pBdr>
+        <w:shd w:val="clear" w:color="auto" w:fill="EEF2F7"/>
+        <w:spacing w:before="60" w:after="160"/>
+        <w:ind w:left="160" w:right="160"/>
+      </w:pPr>
+      <w:r>
+        <w:rPr>
+          <w:sz w:val="19"/>
+          <w:szCs w:val="19"/>
+        </w:rPr>
+        <w:t xml:space="preserve">Algunos valores con apariencia de ataque (p. ej. </w:t>
+      </w:r>
+      <w:r>
+        <w:rPr>
+          <w:rFonts w:ascii="Consolas" w:eastAsia="Consolas" w:hAnsi="Consolas" w:cs="Consolas"/>
+          <w:color w:val="7C2D12"/>
+          <w:sz w:val="19"/>
+          <w:szCs w:val="19"/>
+        </w:rPr>
+        <w:t>'; DROP TABLE</w:t>
+      </w:r>
+      <w:r>
+        <w:rPr>
+          <w:sz w:val="19"/>
+          <w:szCs w:val="19"/>
+        </w:rPr>
+        <w:t xml:space="preserve"> o una entidad XML externa) los bloquea el firewall de Render antes de llegar a la API y devuelve una página HTML 403; no es una respuesta de la aplicación.</w:t>
+      </w:r>
+    </w:p>
+    <w:p>
+      <w:pPr>
+        <w:pStyle w:val="Heading2"/>
+      </w:pPr>
+      <w:bookmarkStart w:id="39" w:name="_Toc243149906"/>
+      <w:r>
+        <w:t>10.7 Reglas en la base de datos</w:t>
+      </w:r>
+      <w:bookmarkEnd w:id="39"/>
     </w:p>
     <w:p>
       <w:pPr>
@@ -33169,6 +33585,7 @@
                 <w:sz w:val="19"/>
                 <w:szCs w:val="19"/>
               </w:rPr>
+              <w:lastRenderedPageBreak/>
               <w:t xml:space="preserve">Nacionalidad </w:t>
             </w:r>
             <w:r>
@@ -33629,12 +34046,12 @@
         <w:pStyle w:val="Heading1"/>
         <w:pageBreakBefore/>
       </w:pPr>
-      <w:bookmarkStart w:id="39" w:name="_Toc243143867"/>
+      <w:bookmarkStart w:id="40" w:name="_Toc243149907"/>
       <w:r>
         <w:lastRenderedPageBreak/>
         <w:t>11. Instalación y ejecución</w:t>
       </w:r>
-      <w:bookmarkEnd w:id="39"/>
+      <w:bookmarkEnd w:id="40"/>
     </w:p>
     <w:p>
       <w:pPr>
@@ -33900,11 +34317,11 @@
       <w:pPr>
         <w:pStyle w:val="Heading1"/>
       </w:pPr>
-      <w:bookmarkStart w:id="40" w:name="_Toc243143868"/>
+      <w:bookmarkStart w:id="41" w:name="_Toc243149908"/>
       <w:r>
         <w:t>12. Conclusiones</w:t>
       </w:r>
-      <w:bookmarkEnd w:id="40"/>
+      <w:bookmarkEnd w:id="41"/>
     </w:p>
     <w:p>
       <w:pPr>
@@ -33926,11 +34343,11 @@
       <w:pPr>
         <w:pStyle w:val="Heading2"/>
       </w:pPr>
-      <w:bookmarkStart w:id="41" w:name="_Toc243143869"/>
+      <w:bookmarkStart w:id="42" w:name="_Toc243149909"/>
       <w:r>
         <w:t>Mejoras futuras</w:t>
       </w:r>
-      <w:bookmarkEnd w:id="41"/>
+      <w:bookmarkEnd w:id="42"/>
     </w:p>
     <w:p>
       <w:pPr>
@@ -34426,68 +34843,10 @@
 <file path=word/numbering.xml><?xml version="1.0" encoding="utf-8"?>
 <w:numbering xmlns:wpc="http://schemas.microsoft.com/office/word/2010/wordprocessingCanvas" xmlns:cx="http://schemas.microsoft.com/office/drawing/2014/chartex" xmlns:cx1="http://schemas.microsoft.com/office/drawing/2015/9/8/chartex" xmlns:cx2="http://schemas.microsoft.com/office/drawing/2015/10/21/chartex" xmlns:cx3="http://schemas.microsoft.com/office/drawing/2016/5/9/chartex" xmlns:cx4="http://schemas.microsoft.com/office/drawing/2016/5/10/chartex" xmlns:cx5="http://schemas.microsoft.com/office/drawing/2016/5/11/chartex" xmlns:cx6="http://schemas.microsoft.com/office/drawing/2016/5/12/chartex" xmlns:cx7="http://schemas.microsoft.com/office/drawing/2016/5/13/chartex" xmlns:cx8="http://schemas.microsoft.com/office/drawing/2016/5/14/chartex" xmlns:mc="http://schemas.openxmlformats.org/markup-compatibility/2006" xmlns:aink="http://schemas.microsoft.com/office/drawing/2016/ink" xmlns:am3d="http://schemas.microsoft.com/office/drawing/2017/model3d" xmlns:o="urn:schemas-microsoft-com:office:office" xmlns:oel="http://schemas.microsoft.com/office/2019/extlst" xmlns:r="http://schemas.openxmlformats.org/officeDocument/2006/relationships" xmlns:m="http://schemas.openxmlformats.org/officeDocument/2006/math" xmlns:v="urn:schemas-microsoft-com:vml" xmlns:wp14="http://schemas.microsoft.com/office/word/2010/wordprocessingDrawing" xmlns:wp="http://schemas.openxmlformats.org/drawingml/2006/wordprocessingDrawing" xmlns:w10="urn:schemas-microsoft-com:office:word" xmlns:w="http://schemas.openxmlformats.org/wordprocessingml/2006/main" xmlns:w14="http://schemas.microsoft.com/office/word/2010/wordml" xmlns:w15="http://schemas.microsoft.com/office/word/2012/wordml" xmlns:w16cex="http://schemas.microsoft.com/office/word/2018/wordml/cex" xmlns:w16cid="http://schemas.microsoft.com/office/word/2016/wordml/cid" xmlns:w16="http://schemas.microsoft.com/office/word/2018/wordml" xmlns:w16du="http://schemas.microsoft.com/office/word/2023/wordml/word16du" xmlns:w16sdtdh="http://schemas.microsoft.com/office/word/2020/wordml/sdtdatahash" xmlns:w16sdtfl="http://schemas.microsoft.com/office/word/2024/wordml/sdtformatlock" xmlns:w16se="http://schemas.microsoft.com/office/word/2015/wordml/symex" xmlns:wpg="http://schemas.microsoft.com/office/word/2010/wordprocessingGroup" xmlns:wpi="http://schemas.microsoft.com/office/word/2010/wordprocessingInk" xmlns:wne="http://schemas.microsoft.com/office/word/2006/wordml" xmlns:wps="http://schemas.microsoft.com/office/word/2010/wordprocessingShape" mc:Ignorable="w14 w15 w16se w16cid w16 w16cex w16sdtdh w16sdtfl w16du wp14">
   <w:abstractNum w:abstractNumId="0" w15:restartNumberingAfterBreak="0">
-    <w:nsid w:val="0B4F793B"/>
+    <w:nsid w:val="40C86E4D"/>
     <w:multiLevelType w:val="hybridMultilevel"/>
-    <w:tmpl w:val="4E0ED49A"/>
-    <w:lvl w:ilvl="0" w:tplc="B9E65F04">
-      <w:start w:val="1"/>
-      <w:numFmt w:val="bullet"/>
-      <w:lvlText w:val="•"/>
-      <w:lvlJc w:val="left"/>
-      <w:pPr>
-        <w:ind w:left="720" w:hanging="360"/>
-      </w:pPr>
-    </w:lvl>
-    <w:lvl w:ilvl="1" w:tplc="7EA89A76">
-      <w:start w:val="1"/>
-      <w:numFmt w:val="bullet"/>
-      <w:lvlText w:val="◦"/>
-      <w:lvlJc w:val="left"/>
-      <w:pPr>
-        <w:ind w:left="1440" w:hanging="360"/>
-      </w:pPr>
-    </w:lvl>
-    <w:lvl w:ilvl="2" w:tplc="0C4865E2">
-      <w:numFmt w:val="decimal"/>
-      <w:lvlText w:val=""/>
-      <w:lvlJc w:val="left"/>
-    </w:lvl>
-    <w:lvl w:ilvl="3" w:tplc="04D2492C">
-      <w:numFmt w:val="decimal"/>
-      <w:lvlText w:val=""/>
-      <w:lvlJc w:val="left"/>
-    </w:lvl>
-    <w:lvl w:ilvl="4" w:tplc="6CD46C48">
-      <w:numFmt w:val="decimal"/>
-      <w:lvlText w:val=""/>
-      <w:lvlJc w:val="left"/>
-    </w:lvl>
-    <w:lvl w:ilvl="5" w:tplc="60DC6F2A">
-      <w:numFmt w:val="decimal"/>
-      <w:lvlText w:val=""/>
-      <w:lvlJc w:val="left"/>
-    </w:lvl>
-    <w:lvl w:ilvl="6" w:tplc="2BC8E096">
-      <w:numFmt w:val="decimal"/>
-      <w:lvlText w:val=""/>
-      <w:lvlJc w:val="left"/>
-    </w:lvl>
-    <w:lvl w:ilvl="7" w:tplc="614618BE">
-      <w:numFmt w:val="decimal"/>
-      <w:lvlText w:val=""/>
-      <w:lvlJc w:val="left"/>
-    </w:lvl>
-    <w:lvl w:ilvl="8" w:tplc="A8B4A5F0">
-      <w:numFmt w:val="decimal"/>
-      <w:lvlText w:val=""/>
-      <w:lvlJc w:val="left"/>
-    </w:lvl>
-  </w:abstractNum>
-  <w:abstractNum w:abstractNumId="1" w15:restartNumberingAfterBreak="0">
-    <w:nsid w:val="1B985B75"/>
-    <w:multiLevelType w:val="hybridMultilevel"/>
-    <w:tmpl w:val="D1AE7CF8"/>
-    <w:lvl w:ilvl="0" w:tplc="B8400544">
+    <w:tmpl w:val="9C4C9164"/>
+    <w:lvl w:ilvl="0" w:tplc="28FA4778">
       <w:start w:val="1"/>
       <w:numFmt w:val="decimal"/>
       <w:lvlText w:val="%1."/>
@@ -34496,52 +34855,52 @@
         <w:ind w:left="720" w:hanging="360"/>
       </w:pPr>
     </w:lvl>
-    <w:lvl w:ilvl="1" w:tplc="728CFA9C">
+    <w:lvl w:ilvl="1" w:tplc="13C495B0">
       <w:numFmt w:val="decimal"/>
       <w:lvlText w:val=""/>
       <w:lvlJc w:val="left"/>
     </w:lvl>
-    <w:lvl w:ilvl="2" w:tplc="CE985D86">
+    <w:lvl w:ilvl="2" w:tplc="2E26D1A8">
       <w:numFmt w:val="decimal"/>
       <w:lvlText w:val=""/>
       <w:lvlJc w:val="left"/>
     </w:lvl>
-    <w:lvl w:ilvl="3" w:tplc="425C562E">
+    <w:lvl w:ilvl="3" w:tplc="A09C080E">
       <w:numFmt w:val="decimal"/>
       <w:lvlText w:val=""/>
       <w:lvlJc w:val="left"/>
     </w:lvl>
-    <w:lvl w:ilvl="4" w:tplc="BA306278">
+    <w:lvl w:ilvl="4" w:tplc="451E161A">
       <w:numFmt w:val="decimal"/>
       <w:lvlText w:val=""/>
       <w:lvlJc w:val="left"/>
     </w:lvl>
-    <w:lvl w:ilvl="5" w:tplc="3118C14E">
+    <w:lvl w:ilvl="5" w:tplc="65340114">
       <w:numFmt w:val="decimal"/>
       <w:lvlText w:val=""/>
       <w:lvlJc w:val="left"/>
     </w:lvl>
-    <w:lvl w:ilvl="6" w:tplc="85F46C3A">
+    <w:lvl w:ilvl="6" w:tplc="C5C4A92C">
       <w:numFmt w:val="decimal"/>
       <w:lvlText w:val=""/>
       <w:lvlJc w:val="left"/>
     </w:lvl>
-    <w:lvl w:ilvl="7" w:tplc="51EEA59A">
+    <w:lvl w:ilvl="7" w:tplc="A3E88F22">
       <w:numFmt w:val="decimal"/>
       <w:lvlText w:val=""/>
       <w:lvlJc w:val="left"/>
     </w:lvl>
-    <w:lvl w:ilvl="8" w:tplc="6EDC4702">
+    <w:lvl w:ilvl="8" w:tplc="9A181160">
       <w:numFmt w:val="decimal"/>
       <w:lvlText w:val=""/>
       <w:lvlJc w:val="left"/>
     </w:lvl>
   </w:abstractNum>
-  <w:abstractNum w:abstractNumId="2" w15:restartNumberingAfterBreak="0">
-    <w:nsid w:val="2C4A3CDC"/>
+  <w:abstractNum w:abstractNumId="1" w15:restartNumberingAfterBreak="0">
+    <w:nsid w:val="41924E82"/>
     <w:multiLevelType w:val="hybridMultilevel"/>
-    <w:tmpl w:val="123832F0"/>
-    <w:lvl w:ilvl="0" w:tplc="ABB2611A">
+    <w:tmpl w:val="1368F07A"/>
+    <w:lvl w:ilvl="0" w:tplc="1C16DFDC">
       <w:start w:val="1"/>
       <w:numFmt w:val="decimal"/>
       <w:lvlText w:val="%1."/>
@@ -34550,52 +34909,52 @@
         <w:ind w:left="720" w:hanging="360"/>
       </w:pPr>
     </w:lvl>
-    <w:lvl w:ilvl="1" w:tplc="8D76727A">
+    <w:lvl w:ilvl="1" w:tplc="A99EACFA">
       <w:numFmt w:val="decimal"/>
       <w:lvlText w:val=""/>
       <w:lvlJc w:val="left"/>
     </w:lvl>
-    <w:lvl w:ilvl="2" w:tplc="4236A7BC">
+    <w:lvl w:ilvl="2" w:tplc="9D1848E0">
       <w:numFmt w:val="decimal"/>
       <w:lvlText w:val=""/>
       <w:lvlJc w:val="left"/>
     </w:lvl>
-    <w:lvl w:ilvl="3" w:tplc="5754B1D2">
+    <w:lvl w:ilvl="3" w:tplc="20E6909C">
       <w:numFmt w:val="decimal"/>
       <w:lvlText w:val=""/>
       <w:lvlJc w:val="left"/>
     </w:lvl>
-    <w:lvl w:ilvl="4" w:tplc="462EBCBC">
+    <w:lvl w:ilvl="4" w:tplc="4D366F44">
       <w:numFmt w:val="decimal"/>
       <w:lvlText w:val=""/>
       <w:lvlJc w:val="left"/>
     </w:lvl>
-    <w:lvl w:ilvl="5" w:tplc="173EF1D2">
+    <w:lvl w:ilvl="5" w:tplc="0C4889A8">
       <w:numFmt w:val="decimal"/>
       <w:lvlText w:val=""/>
       <w:lvlJc w:val="left"/>
     </w:lvl>
-    <w:lvl w:ilvl="6" w:tplc="CBB6B32A">
+    <w:lvl w:ilvl="6" w:tplc="58C4EDF6">
       <w:numFmt w:val="decimal"/>
       <w:lvlText w:val=""/>
       <w:lvlJc w:val="left"/>
     </w:lvl>
-    <w:lvl w:ilvl="7" w:tplc="D36436EE">
+    <w:lvl w:ilvl="7" w:tplc="8BCC7D3E">
       <w:numFmt w:val="decimal"/>
       <w:lvlText w:val=""/>
       <w:lvlJc w:val="left"/>
     </w:lvl>
-    <w:lvl w:ilvl="8" w:tplc="D8BC3080">
+    <w:lvl w:ilvl="8" w:tplc="1D9AF654">
       <w:numFmt w:val="decimal"/>
       <w:lvlText w:val=""/>
       <w:lvlJc w:val="left"/>
     </w:lvl>
   </w:abstractNum>
-  <w:abstractNum w:abstractNumId="3" w15:restartNumberingAfterBreak="0">
-    <w:nsid w:val="385008F3"/>
+  <w:abstractNum w:abstractNumId="2" w15:restartNumberingAfterBreak="0">
+    <w:nsid w:val="45C97EB7"/>
     <w:multiLevelType w:val="hybridMultilevel"/>
-    <w:tmpl w:val="552CDFA2"/>
-    <w:lvl w:ilvl="0" w:tplc="0478D93C">
+    <w:tmpl w:val="32F2E338"/>
+    <w:lvl w:ilvl="0" w:tplc="6C2408B2">
       <w:start w:val="1"/>
       <w:numFmt w:val="bullet"/>
       <w:lvlText w:val="●"/>
@@ -34604,7 +34963,7 @@
         <w:ind w:left="720" w:hanging="360"/>
       </w:pPr>
     </w:lvl>
-    <w:lvl w:ilvl="1" w:tplc="8542D854">
+    <w:lvl w:ilvl="1" w:tplc="1150935E">
       <w:start w:val="1"/>
       <w:numFmt w:val="bullet"/>
       <w:lvlText w:val="○"/>
@@ -34613,7 +34972,7 @@
         <w:ind w:left="1440" w:hanging="360"/>
       </w:pPr>
     </w:lvl>
-    <w:lvl w:ilvl="2" w:tplc="B5EA547E">
+    <w:lvl w:ilvl="2" w:tplc="1AAEFD80">
       <w:start w:val="1"/>
       <w:numFmt w:val="bullet"/>
       <w:lvlText w:val="■"/>
@@ -34622,7 +34981,7 @@
         <w:ind w:left="2160" w:hanging="360"/>
       </w:pPr>
     </w:lvl>
-    <w:lvl w:ilvl="3" w:tplc="B972C4E6">
+    <w:lvl w:ilvl="3" w:tplc="9DEA83CC">
       <w:start w:val="1"/>
       <w:numFmt w:val="bullet"/>
       <w:lvlText w:val="●"/>
@@ -34631,7 +34990,7 @@
         <w:ind w:left="2880" w:hanging="360"/>
       </w:pPr>
     </w:lvl>
-    <w:lvl w:ilvl="4" w:tplc="1F960D1E">
+    <w:lvl w:ilvl="4" w:tplc="C64CDCC4">
       <w:start w:val="1"/>
       <w:numFmt w:val="bullet"/>
       <w:lvlText w:val="○"/>
@@ -34640,7 +34999,7 @@
         <w:ind w:left="3600" w:hanging="360"/>
       </w:pPr>
     </w:lvl>
-    <w:lvl w:ilvl="5" w:tplc="906C2950">
+    <w:lvl w:ilvl="5" w:tplc="0CA43E08">
       <w:start w:val="1"/>
       <w:numFmt w:val="bullet"/>
       <w:lvlText w:val="■"/>
@@ -34649,7 +35008,7 @@
         <w:ind w:left="4320" w:hanging="360"/>
       </w:pPr>
     </w:lvl>
-    <w:lvl w:ilvl="6" w:tplc="365A8CE2">
+    <w:lvl w:ilvl="6" w:tplc="07105856">
       <w:start w:val="1"/>
       <w:numFmt w:val="bullet"/>
       <w:lvlText w:val="●"/>
@@ -34658,7 +35017,7 @@
         <w:ind w:left="5040" w:hanging="360"/>
       </w:pPr>
     </w:lvl>
-    <w:lvl w:ilvl="7" w:tplc="34806ADA">
+    <w:lvl w:ilvl="7" w:tplc="7408D972">
       <w:start w:val="1"/>
       <w:numFmt w:val="bullet"/>
       <w:lvlText w:val="●"/>
@@ -34667,7 +35026,7 @@
         <w:ind w:left="5760" w:hanging="360"/>
       </w:pPr>
     </w:lvl>
-    <w:lvl w:ilvl="8" w:tplc="A1EA1F74">
+    <w:lvl w:ilvl="8" w:tplc="6CE28A40">
       <w:start w:val="1"/>
       <w:numFmt w:val="bullet"/>
       <w:lvlText w:val="●"/>
@@ -34677,11 +35036,69 @@
       </w:pPr>
     </w:lvl>
   </w:abstractNum>
+  <w:abstractNum w:abstractNumId="3" w15:restartNumberingAfterBreak="0">
+    <w:nsid w:val="59317A9F"/>
+    <w:multiLevelType w:val="hybridMultilevel"/>
+    <w:tmpl w:val="08E6D3B0"/>
+    <w:lvl w:ilvl="0" w:tplc="9BB4F7BC">
+      <w:start w:val="1"/>
+      <w:numFmt w:val="bullet"/>
+      <w:lvlText w:val="•"/>
+      <w:lvlJc w:val="left"/>
+      <w:pPr>
+        <w:ind w:left="720" w:hanging="360"/>
+      </w:pPr>
+    </w:lvl>
+    <w:lvl w:ilvl="1" w:tplc="73B69F42">
+      <w:start w:val="1"/>
+      <w:numFmt w:val="bullet"/>
+      <w:lvlText w:val="◦"/>
+      <w:lvlJc w:val="left"/>
+      <w:pPr>
+        <w:ind w:left="1440" w:hanging="360"/>
+      </w:pPr>
+    </w:lvl>
+    <w:lvl w:ilvl="2" w:tplc="5970961A">
+      <w:numFmt w:val="decimal"/>
+      <w:lvlText w:val=""/>
+      <w:lvlJc w:val="left"/>
+    </w:lvl>
+    <w:lvl w:ilvl="3" w:tplc="0150CC06">
+      <w:numFmt w:val="decimal"/>
+      <w:lvlText w:val=""/>
+      <w:lvlJc w:val="left"/>
+    </w:lvl>
+    <w:lvl w:ilvl="4" w:tplc="82CE90EE">
+      <w:numFmt w:val="decimal"/>
+      <w:lvlText w:val=""/>
+      <w:lvlJc w:val="left"/>
+    </w:lvl>
+    <w:lvl w:ilvl="5" w:tplc="7F7A12F8">
+      <w:numFmt w:val="decimal"/>
+      <w:lvlText w:val=""/>
+      <w:lvlJc w:val="left"/>
+    </w:lvl>
+    <w:lvl w:ilvl="6" w:tplc="3932BD3E">
+      <w:numFmt w:val="decimal"/>
+      <w:lvlText w:val=""/>
+      <w:lvlJc w:val="left"/>
+    </w:lvl>
+    <w:lvl w:ilvl="7" w:tplc="998E5F1C">
+      <w:numFmt w:val="decimal"/>
+      <w:lvlText w:val=""/>
+      <w:lvlJc w:val="left"/>
+    </w:lvl>
+    <w:lvl w:ilvl="8" w:tplc="4FACFF9A">
+      <w:numFmt w:val="decimal"/>
+      <w:lvlText w:val=""/>
+      <w:lvlJc w:val="left"/>
+    </w:lvl>
+  </w:abstractNum>
   <w:abstractNum w:abstractNumId="4" w15:restartNumberingAfterBreak="0">
-    <w:nsid w:val="464161E8"/>
+    <w:nsid w:val="6178795A"/>
     <w:multiLevelType w:val="hybridMultilevel"/>
-    <w:tmpl w:val="8BCA3FA6"/>
-    <w:lvl w:ilvl="0" w:tplc="13A05390">
+    <w:tmpl w:val="77243156"/>
+    <w:lvl w:ilvl="0" w:tplc="0770ACB0">
       <w:start w:val="1"/>
       <w:numFmt w:val="decimal"/>
       <w:lvlText w:val="%1."/>
@@ -34690,73 +35107,73 @@
         <w:ind w:left="720" w:hanging="360"/>
       </w:pPr>
     </w:lvl>
-    <w:lvl w:ilvl="1" w:tplc="13308766">
+    <w:lvl w:ilvl="1" w:tplc="8F96F1A6">
       <w:numFmt w:val="decimal"/>
       <w:lvlText w:val=""/>
       <w:lvlJc w:val="left"/>
     </w:lvl>
-    <w:lvl w:ilvl="2" w:tplc="E896543E">
+    <w:lvl w:ilvl="2" w:tplc="EF2293C4">
       <w:numFmt w:val="decimal"/>
       <w:lvlText w:val=""/>
       <w:lvlJc w:val="left"/>
     </w:lvl>
-    <w:lvl w:ilvl="3" w:tplc="306A9A06">
+    <w:lvl w:ilvl="3" w:tplc="29E6AB82">
       <w:numFmt w:val="decimal"/>
       <w:lvlText w:val=""/>
       <w:lvlJc w:val="left"/>
     </w:lvl>
-    <w:lvl w:ilvl="4" w:tplc="49268D20">
+    <w:lvl w:ilvl="4" w:tplc="282C98E0">
       <w:numFmt w:val="decimal"/>
       <w:lvlText w:val=""/>
       <w:lvlJc w:val="left"/>
     </w:lvl>
-    <w:lvl w:ilvl="5" w:tplc="8876987C">
+    <w:lvl w:ilvl="5" w:tplc="3A789A22">
       <w:numFmt w:val="decimal"/>
       <w:lvlText w:val=""/>
       <w:lvlJc w:val="left"/>
     </w:lvl>
-    <w:lvl w:ilvl="6" w:tplc="77081032">
+    <w:lvl w:ilvl="6" w:tplc="9ACC1D6E">
       <w:numFmt w:val="decimal"/>
       <w:lvlText w:val=""/>
       <w:lvlJc w:val="left"/>
     </w:lvl>
-    <w:lvl w:ilvl="7" w:tplc="A9E650A6">
+    <w:lvl w:ilvl="7" w:tplc="4C04B5A6">
       <w:numFmt w:val="decimal"/>
       <w:lvlText w:val=""/>
       <w:lvlJc w:val="left"/>
     </w:lvl>
-    <w:lvl w:ilvl="8" w:tplc="6786EF52">
+    <w:lvl w:ilvl="8" w:tplc="4D40260A">
       <w:numFmt w:val="decimal"/>
       <w:lvlText w:val=""/>
       <w:lvlJc w:val="left"/>
     </w:lvl>
   </w:abstractNum>
-  <w:num w:numId="1" w16cid:durableId="1262879668">
+  <w:num w:numId="1" w16cid:durableId="458377233">
+    <w:abstractNumId w:val="2"/>
+    <w:lvlOverride w:ilvl="0">
+      <w:startOverride w:val="1"/>
+    </w:lvlOverride>
+  </w:num>
+  <w:num w:numId="2" w16cid:durableId="861632641">
+    <w:abstractNumId w:val="1"/>
+    <w:lvlOverride w:ilvl="0">
+      <w:startOverride w:val="1"/>
+    </w:lvlOverride>
+  </w:num>
+  <w:num w:numId="3" w16cid:durableId="1519853833">
     <w:abstractNumId w:val="3"/>
     <w:lvlOverride w:ilvl="0">
       <w:startOverride w:val="1"/>
     </w:lvlOverride>
   </w:num>
-  <w:num w:numId="2" w16cid:durableId="1421681981">
-    <w:abstractNumId w:val="4"/>
-    <w:lvlOverride w:ilvl="0">
-      <w:startOverride w:val="1"/>
-    </w:lvlOverride>
-  </w:num>
-  <w:num w:numId="3" w16cid:durableId="344137213">
+  <w:num w:numId="4" w16cid:durableId="1416514650">
     <w:abstractNumId w:val="0"/>
     <w:lvlOverride w:ilvl="0">
       <w:startOverride w:val="1"/>
     </w:lvlOverride>
   </w:num>
-  <w:num w:numId="4" w16cid:durableId="1677422405">
-    <w:abstractNumId w:val="1"/>
-    <w:lvlOverride w:ilvl="0">
-      <w:startOverride w:val="1"/>
-    </w:lvlOverride>
-  </w:num>
-  <w:num w:numId="5" w16cid:durableId="1425568787">
-    <w:abstractNumId w:val="2"/>
+  <w:num w:numId="5" w16cid:durableId="274024344">
+    <w:abstractNumId w:val="4"/>
     <w:lvlOverride w:ilvl="0">
       <w:startOverride w:val="1"/>
     </w:lvlOverride>
@@ -35351,7 +35768,7 @@
     <w:autoRedefine/>
     <w:uiPriority w:val="39"/>
     <w:unhideWhenUsed/>
-    <w:rsid w:val="0025480D"/>
+    <w:rsid w:val="00B95D37"/>
     <w:pPr>
       <w:spacing w:after="100"/>
     </w:pPr>
@@ -35363,7 +35780,7 @@
     <w:autoRedefine/>
     <w:uiPriority w:val="39"/>
     <w:unhideWhenUsed/>
-    <w:rsid w:val="0025480D"/>
+    <w:rsid w:val="00B95D37"/>
     <w:pPr>
       <w:spacing w:after="100"/>
       <w:ind w:left="220"/>

</xml_diff>